<commit_message>
Fix docx parser bug that skipped tables; incorporate missed Becca comments: Level/Source/When-to-Use table with RFA footnotes, examples tables, RCMI definition, Office of Research Funds Accounting naming, R&D redefinition in 2.3, Appendix checklist
</commit_message>
<xml_diff>
--- a/assets/RD-Classification-Framework.docx
+++ b/assets/RD-Classification-Framework.docx
@@ -433,6 +433,19 @@
           <w:sz w:val="26"/>
         </w:rPr>
         <w:t>2.3 The Morgan State University Institutional Definition</w:t>
+      </w:r>
+    </w:p>
+    <w:p>
+      <w:pPr>
+        <w:spacing w:after="160"/>
+      </w:pPr>
+      <w:r>
+        <w:rPr>
+          <w:b w:val="0"/>
+          <w:i w:val="0"/>
+          <w:sz w:val="22"/>
+        </w:rPr>
+        <w:t>As a reminder, research and development (R&amp;D) is creative and systematic work undertaken to increase the stock of knowledge and to devise new applications of that knowledge (Frascati Manual, OECD, 2015). Morgan State's own institutional policy reinforces this definition.</w:t>
       </w:r>
     </w:p>
     <w:p>
@@ -718,13 +731,14 @@
         <w:tblLook w:firstColumn="1" w:firstRow="1" w:lastColumn="0" w:lastRow="0" w:noHBand="0" w:noVBand="1" w:val="04A0"/>
       </w:tblPr>
       <w:tblGrid>
-        <w:gridCol w:w="4320"/>
-        <w:gridCol w:w="4320"/>
+        <w:gridCol w:w="2880"/>
+        <w:gridCol w:w="2880"/>
+        <w:gridCol w:w="2880"/>
       </w:tblGrid>
       <w:tr>
         <w:tc>
           <w:tcPr>
-            <w:tcW w:type="dxa" w:w="4320"/>
+            <w:tcW w:type="dxa" w:w="2880"/>
           </w:tcPr>
           <w:p>
             <w:r>
@@ -738,7 +752,7 @@
         </w:tc>
         <w:tc>
           <w:tcPr>
-            <w:tcW w:type="dxa" w:w="4320"/>
+            <w:tcW w:type="dxa" w:w="2880"/>
           </w:tcPr>
           <w:p>
             <w:r>
@@ -746,7 +760,21 @@
                 <w:b/>
                 <w:sz w:val="20"/>
               </w:rPr>
-              <w:t>Evidence Source</w:t>
+              <w:t>Source</w:t>
+            </w:r>
+          </w:p>
+        </w:tc>
+        <w:tc>
+          <w:tcPr>
+            <w:tcW w:type="dxa" w:w="2880"/>
+          </w:tcPr>
+          <w:p>
+            <w:r>
+              <w:rPr>
+                <w:b/>
+                <w:sz w:val="20"/>
+              </w:rPr>
+              <w:t>When to Use</w:t>
             </w:r>
           </w:p>
         </w:tc>
@@ -754,7 +782,1146 @@
       <w:tr>
         <w:tc>
           <w:tcPr>
-            <w:tcW w:type="dxa" w:w="4320"/>
+            <w:tcW w:type="dxa" w:w="2880"/>
+          </w:tcPr>
+          <w:p>
+            <w:r>
+              <w:rPr>
+                <w:sz w:val="20"/>
+              </w:rPr>
+              <w:t>L1 — Notice of Award (NOA)</w:t>
+            </w:r>
+          </w:p>
+        </w:tc>
+        <w:tc>
+          <w:tcPr>
+            <w:tcW w:type="dxa" w:w="2880"/>
+          </w:tcPr>
+          <w:p>
+            <w:r>
+              <w:rPr>
+                <w:sz w:val="20"/>
+              </w:rPr>
+              <w:t>Award letter or electronic notice issued by the sponsor</w:t>
+            </w:r>
+          </w:p>
+        </w:tc>
+        <w:tc>
+          <w:tcPr>
+            <w:tcW w:type="dxa" w:w="2880"/>
+          </w:tcPr>
+          <w:p>
+            <w:r>
+              <w:rPr>
+                <w:sz w:val="20"/>
+              </w:rPr>
+              <w:t>First step for every grant. If the NOA states a research purpose, stop here.</w:t>
+            </w:r>
+          </w:p>
+        </w:tc>
+      </w:tr>
+      <w:tr>
+        <w:tc>
+          <w:tcPr>
+            <w:tcW w:type="dxa" w:w="2880"/>
+          </w:tcPr>
+          <w:p>
+            <w:r>
+              <w:rPr>
+                <w:sz w:val="20"/>
+              </w:rPr>
+              <w:t>L2 — Funding Opportunity Announcement (FOA/RFA*)</w:t>
+            </w:r>
+          </w:p>
+        </w:tc>
+        <w:tc>
+          <w:tcPr>
+            <w:tcW w:type="dxa" w:w="2880"/>
+          </w:tcPr>
+          <w:p>
+            <w:r>
+              <w:rPr>
+                <w:sz w:val="20"/>
+              </w:rPr>
+              <w:t>NSF solicitation, NIH RFA*, DOE FOA, or equivalent</w:t>
+            </w:r>
+          </w:p>
+        </w:tc>
+        <w:tc>
+          <w:tcPr>
+            <w:tcW w:type="dxa" w:w="2880"/>
+          </w:tcPr>
+          <w:p>
+            <w:r>
+              <w:rPr>
+                <w:sz w:val="20"/>
+              </w:rPr>
+              <w:t>When the NOA does not explicitly describe research activity, check the funding announcement.</w:t>
+            </w:r>
+          </w:p>
+        </w:tc>
+      </w:tr>
+      <w:tr>
+        <w:tc>
+          <w:tcPr>
+            <w:tcW w:type="dxa" w:w="2880"/>
+          </w:tcPr>
+          <w:p>
+            <w:r>
+              <w:rPr>
+                <w:sz w:val="20"/>
+              </w:rPr>
+              <w:t>L3 — ALN/CFDA Number</w:t>
+            </w:r>
+          </w:p>
+        </w:tc>
+        <w:tc>
+          <w:tcPr>
+            <w:tcW w:type="dxa" w:w="2880"/>
+          </w:tcPr>
+          <w:p>
+            <w:r>
+              <w:rPr>
+                <w:sz w:val="20"/>
+              </w:rPr>
+              <w:t>Assistance Listings Number via SAM.gov</w:t>
+            </w:r>
+          </w:p>
+        </w:tc>
+        <w:tc>
+          <w:tcPr>
+            <w:tcW w:type="dxa" w:w="2880"/>
+          </w:tcPr>
+          <w:p>
+            <w:r>
+              <w:rPr>
+                <w:sz w:val="20"/>
+              </w:rPr>
+              <w:t>When the FOA is unavailable or inconclusive, look up the federal program classification.</w:t>
+            </w:r>
+          </w:p>
+        </w:tc>
+      </w:tr>
+      <w:tr>
+        <w:tc>
+          <w:tcPr>
+            <w:tcW w:type="dxa" w:w="2880"/>
+          </w:tcPr>
+          <w:p>
+            <w:r>
+              <w:rPr>
+                <w:sz w:val="20"/>
+              </w:rPr>
+              <w:t>L4 — Supporting Documentation</w:t>
+            </w:r>
+          </w:p>
+        </w:tc>
+        <w:tc>
+          <w:tcPr>
+            <w:tcW w:type="dxa" w:w="2880"/>
+          </w:tcPr>
+          <w:p>
+            <w:r>
+              <w:rPr>
+                <w:sz w:val="20"/>
+              </w:rPr>
+              <w:t>Internal Routing Form (IRF), Letter of Intent, Statement of Work, Principal Investigator (PI) statement, proposal summary</w:t>
+            </w:r>
+          </w:p>
+        </w:tc>
+        <w:tc>
+          <w:tcPr>
+            <w:tcW w:type="dxa" w:w="2880"/>
+          </w:tcPr>
+          <w:p>
+            <w:r>
+              <w:rPr>
+                <w:sz w:val="20"/>
+              </w:rPr>
+              <w:t>When federal-level sources are insufficient, review internal project documentation.</w:t>
+            </w:r>
+          </w:p>
+        </w:tc>
+      </w:tr>
+      <w:tr>
+        <w:tc>
+          <w:tcPr>
+            <w:tcW w:type="dxa" w:w="2880"/>
+          </w:tcPr>
+          <w:p>
+            <w:r>
+              <w:rPr>
+                <w:sz w:val="20"/>
+              </w:rPr>
+              <w:t>L5 — Institutional Record</w:t>
+            </w:r>
+          </w:p>
+        </w:tc>
+        <w:tc>
+          <w:tcPr>
+            <w:tcW w:type="dxa" w:w="2880"/>
+          </w:tcPr>
+          <w:p>
+            <w:r>
+              <w:rPr>
+                <w:sz w:val="20"/>
+              </w:rPr>
+              <w:t>Office of Research Funds Accounting (RFA†) records, HERD listing, Restricted Fund Account designation</w:t>
+            </w:r>
+          </w:p>
+        </w:tc>
+        <w:tc>
+          <w:tcPr>
+            <w:tcW w:type="dxa" w:w="2880"/>
+          </w:tcPr>
+          <w:p>
+            <w:r>
+              <w:rPr>
+                <w:sz w:val="20"/>
+              </w:rPr>
+              <w:t>When no other documentation is accessible, use the existing institutional designation.</w:t>
+            </w:r>
+          </w:p>
+        </w:tc>
+      </w:tr>
+    </w:tbl>
+    <w:p/>
+    <w:p>
+      <w:pPr>
+        <w:spacing w:after="200"/>
+        <w:ind w:left="360"/>
+      </w:pPr>
+      <w:r>
+        <w:rPr>
+          <w:i/>
+          <w:color w:val="5A6169"/>
+          <w:sz w:val="20"/>
+        </w:rPr>
+        <w:t>* RFA in “FOA/RFA” = Request for Applications, the NIH term for a funding opportunity announcement.   † RFA in “Office of Research Funds Accounting” refers to the internal office, not the funding-announcement term above.</w:t>
+      </w:r>
+    </w:p>
+    <w:p>
+      <w:pPr>
+        <w:spacing w:after="160"/>
+      </w:pPr>
+      <w:r>
+        <w:rPr>
+          <w:b w:val="0"/>
+          <w:i w:val="0"/>
+          <w:sz w:val="22"/>
+        </w:rPr>
+        <w:t>A grant classified at Level 1 (NOA) has the strongest evidence base. A grant classified at Level 5 (Institutional Record) has the weakest — not because the classification is wrong, but because the documentation supporting it is more indirect. Over time, the goal is to move grants from Level 5 toward Level 1 and Level 2 as documentation is gathered and filed.</w:t>
+      </w:r>
+    </w:p>
+    <w:p>
+      <w:pPr>
+        <w:pStyle w:val="Heading2"/>
+      </w:pPr>
+      <w:r>
+        <w:rPr>
+          <w:color w:val="B5601E"/>
+          <w:sz w:val="26"/>
+        </w:rPr>
+        <w:t>4.2 Level 1 — Notice of Award (NOA)</w:t>
+      </w:r>
+    </w:p>
+    <w:p>
+      <w:pPr>
+        <w:pStyle w:val="Heading3"/>
+      </w:pPr>
+      <w:r>
+        <w:rPr>
+          <w:i/>
+          <w:sz w:val="23"/>
+        </w:rPr>
+        <w:t>What it is</w:t>
+      </w:r>
+    </w:p>
+    <w:p>
+      <w:pPr>
+        <w:spacing w:after="160"/>
+      </w:pPr>
+      <w:r>
+        <w:rPr>
+          <w:b w:val="0"/>
+          <w:i w:val="0"/>
+          <w:sz w:val="22"/>
+        </w:rPr>
+        <w:t>The Notice of Award is the official document issued by the funding agency that formally grants the award. It contains the project title, period of performance, award amount, applicable terms and conditions, and — critically — a statement of the project's purpose or scope. For federal awards, the NOA is typically issued electronically through systems like NIH eRA Commons, the NSF Award System, or grants.gov. Under Uniform Guidance (2 CFR Part 200), a federal NOA is also required to include the applicable ALN/CFDA number.</w:t>
+      </w:r>
+    </w:p>
+    <w:p>
+      <w:pPr>
+        <w:pStyle w:val="Heading3"/>
+      </w:pPr>
+      <w:r>
+        <w:rPr>
+          <w:i/>
+          <w:sz w:val="23"/>
+        </w:rPr>
+        <w:t>Why it is the strongest evidence</w:t>
+      </w:r>
+    </w:p>
+    <w:p>
+      <w:pPr>
+        <w:spacing w:after="160"/>
+      </w:pPr>
+      <w:r>
+        <w:rPr>
+          <w:b w:val="0"/>
+          <w:i w:val="0"/>
+          <w:sz w:val="22"/>
+        </w:rPr>
+        <w:t>The NOA is the contract between the institution and the sponsor. It reflects the sponsor's own understanding of what the award funds. Critically, federal agencies are required to directly answer the question “Is this award R&amp;D?” on the Notice of Award itself — NSF, NIH, and NASA notices all include this direct indication. That direct answer is the strongest and most compelling evidence available, and should be the first thing a reviewer looks for.</w:t>
+      </w:r>
+    </w:p>
+    <w:p>
+      <w:pPr>
+        <w:pStyle w:val="Heading3"/>
+      </w:pPr>
+      <w:r>
+        <w:rPr>
+          <w:i/>
+          <w:sz w:val="23"/>
+        </w:rPr>
+        <w:t>How to apply it</w:t>
+      </w:r>
+    </w:p>
+    <w:p>
+      <w:pPr>
+        <w:spacing w:after="160"/>
+      </w:pPr>
+      <w:r>
+        <w:rPr>
+          <w:b w:val="0"/>
+          <w:i w:val="0"/>
+          <w:sz w:val="22"/>
+        </w:rPr>
+        <w:t>First, look for a direct indication of R&amp;D status on the NOA — an explicit “Is this R&amp;D?” field or activity-type designation. If present, that answer governs the classification. Only when no direct indicator is present should a reviewer fall back to reading the NOA's purpose language for words and phrases like: research, study, investigate, analyze, develop new knowledge, hypothesis, experimental, data collection, findings, outcomes measurement. If such language is present and the primary activity is the generation of new knowledge, classify as R&amp;D and record Level 1 as the basis. If the NOA describes the primary activity as service delivery, training, outreach, technical assistance, or infrastructure, classify as Not R&amp;D — also at Level 1. The level does not automatically mean R&amp;D; it means the determination is based on the NOA.</w:t>
+      </w:r>
+    </w:p>
+    <w:p>
+      <w:pPr>
+        <w:spacing w:after="160"/>
+      </w:pPr>
+      <w:r>
+        <w:rPr>
+          <w:b w:val="0"/>
+          <w:i/>
+          <w:sz w:val="22"/>
+        </w:rPr>
+        <w:t>Example (L1 — R&amp;D): An NIH Career Transition Award. The NOA directly indicates the award is R&amp;D. The award funds structured research training with hypothesis-driven scientific inquiry. Classified R&amp;D — Basic Research.</w:t>
+      </w:r>
+    </w:p>
+    <w:p>
+      <w:pPr>
+        <w:spacing w:after="160"/>
+      </w:pPr>
+      <w:r>
+        <w:rPr>
+          <w:b w:val="0"/>
+          <w:i/>
+          <w:sz w:val="22"/>
+        </w:rPr>
+        <w:t>Example (L1 — Not R&amp;D): A state equipment grant. NOA reviewed; no direct R&amp;D indicator is present, and the award language describes the purchase of security infrastructure equipment for the institution, with no research objective identified. Classified Not R&amp;D.</w:t>
+      </w:r>
+    </w:p>
+    <w:p>
+      <w:pPr>
+        <w:pStyle w:val="Heading2"/>
+      </w:pPr>
+      <w:r>
+        <w:rPr>
+          <w:color w:val="B5601E"/>
+          <w:sz w:val="26"/>
+        </w:rPr>
+        <w:t>4.3 Level 2 — Funding Opportunity Announcement (FOA / RFA)</w:t>
+      </w:r>
+    </w:p>
+    <w:p>
+      <w:pPr>
+        <w:pStyle w:val="Heading3"/>
+      </w:pPr>
+      <w:r>
+        <w:rPr>
+          <w:i/>
+          <w:sz w:val="23"/>
+        </w:rPr>
+        <w:t>What it is</w:t>
+      </w:r>
+    </w:p>
+    <w:p>
+      <w:pPr>
+        <w:spacing w:after="160"/>
+      </w:pPr>
+      <w:r>
+        <w:rPr>
+          <w:b w:val="0"/>
+          <w:i w:val="0"/>
+          <w:sz w:val="22"/>
+        </w:rPr>
+        <w:t>The Funding Opportunity Announcement (FOA) — NSF and DOE (Department of Energy) call these Program Solicitations or Funding Opportunity Announcements; NIH uses Requests for Applications (RFA) or Requests for Proposals (RFP) — is the public document through which a federal agency, state agency, or foundation invites applications for a specific type of activity. The FOA describes what the sponsor is trying to accomplish, the types of projects it will fund, and any eligibility requirements.</w:t>
+      </w:r>
+    </w:p>
+    <w:p>
+      <w:pPr>
+        <w:pStyle w:val="Heading3"/>
+      </w:pPr>
+      <w:r>
+        <w:rPr>
+          <w:i/>
+          <w:sz w:val="23"/>
+        </w:rPr>
+        <w:t>Why it matters</w:t>
+      </w:r>
+    </w:p>
+    <w:p>
+      <w:pPr>
+        <w:spacing w:after="160"/>
+      </w:pPr>
+      <w:r>
+        <w:rPr>
+          <w:b w:val="0"/>
+          <w:i w:val="0"/>
+          <w:sz w:val="22"/>
+        </w:rPr>
+        <w:t>The FOA defines the research intent of the program before any individual award is made. If an agency specifically solicited research projects under a given program, that purpose carries forward to all awards made under that solicitation.</w:t>
+      </w:r>
+    </w:p>
+    <w:p>
+      <w:pPr>
+        <w:pStyle w:val="Heading3"/>
+      </w:pPr>
+      <w:r>
+        <w:rPr>
+          <w:i/>
+          <w:sz w:val="23"/>
+        </w:rPr>
+        <w:t>How to find and use it</w:t>
+      </w:r>
+    </w:p>
+    <w:p>
+      <w:pPr>
+        <w:spacing w:after="160"/>
+      </w:pPr>
+      <w:r>
+        <w:rPr>
+          <w:b w:val="0"/>
+          <w:i w:val="0"/>
+          <w:sz w:val="22"/>
+        </w:rPr>
+        <w:t>The FOA number is typically included in the NOA or the award file. Federal FOAs can be retrieved from NSF.gov (under “Funding”), grants.gov (searchable by CFDA/ALN number or agency), the NIH Guide to Grants and Contracts (grants.nih.gov/grants/guide), and agency-specific sites. Once retrieved, review the program description for language defining the activity type as research, applied research, or experimental development — or, as with NSF, note that the sponsoring program may legislatively define the entire portfolio as R&amp;D.</w:t>
+      </w:r>
+    </w:p>
+    <w:p>
+      <w:pPr>
+        <w:spacing w:after="160"/>
+      </w:pPr>
+      <w:r>
+        <w:rPr>
+          <w:b w:val="0"/>
+          <w:i/>
+          <w:sz w:val="22"/>
+        </w:rPr>
+        <w:t>Example (L2 — R&amp;D): An NIH training-and-research program. The NOA does not explicitly state R&amp;D. The FOA is reviewed: the funding opportunity's stated goals include generating new scientific knowledge and require a research design. Classified R&amp;D — Applied Research.</w:t>
+      </w:r>
+    </w:p>
+    <w:p>
+      <w:pPr>
+        <w:pStyle w:val="Heading2"/>
+      </w:pPr>
+      <w:r>
+        <w:rPr>
+          <w:color w:val="B5601E"/>
+          <w:sz w:val="26"/>
+        </w:rPr>
+        <w:t>4.4 Level 3 — ALN / CFDA Number</w:t>
+      </w:r>
+    </w:p>
+    <w:p>
+      <w:pPr>
+        <w:pStyle w:val="Heading3"/>
+      </w:pPr>
+      <w:r>
+        <w:rPr>
+          <w:i/>
+          <w:sz w:val="23"/>
+        </w:rPr>
+        <w:t>What it is</w:t>
+      </w:r>
+    </w:p>
+    <w:p>
+      <w:pPr>
+        <w:spacing w:after="160"/>
+      </w:pPr>
+      <w:r>
+        <w:rPr>
+          <w:b w:val="0"/>
+          <w:i w:val="0"/>
+          <w:sz w:val="22"/>
+        </w:rPr>
+        <w:t>The Assistance Listings Number (ALN), formerly known as the Catalog of Federal Domestic Assistance (CFDA) number, is a five-digit identifier assigned to every federal assistance program. Each program has a formal listing on SAM.gov (System for Award Management) that includes a program description, objectives, eligibility information, and — importantly — the program's primary activity type.</w:t>
+      </w:r>
+    </w:p>
+    <w:p>
+      <w:pPr>
+        <w:pStyle w:val="Heading3"/>
+      </w:pPr>
+      <w:r>
+        <w:rPr>
+          <w:i/>
+          <w:sz w:val="23"/>
+        </w:rPr>
+        <w:t>How to use it</w:t>
+      </w:r>
+    </w:p>
+    <w:p>
+      <w:pPr>
+        <w:spacing w:after="160"/>
+      </w:pPr>
+      <w:r>
+        <w:rPr>
+          <w:b w:val="0"/>
+          <w:i w:val="0"/>
+          <w:sz w:val="22"/>
+        </w:rPr>
+        <w:t>Every federal grant will have an ALN/CFDA number in the award documentation or the institutional grant management system. Look up the number at sam.gov/fal and review the program objectives. If the program is described as a research program, or if the program objective includes generating new knowledge, classifying awards under that program as R&amp;D is appropriate. This is especially useful for programs where individual award documentation is sparse.</w:t>
+      </w:r>
+    </w:p>
+    <w:p>
+      <w:pPr>
+        <w:spacing w:after="160"/>
+      </w:pPr>
+      <w:r>
+        <w:rPr>
+          <w:b w:val="0"/>
+          <w:i w:val="0"/>
+          <w:sz w:val="22"/>
+        </w:rPr>
+        <w:t>Useful patterns (always verify against the individual award): NSF's 47.xxx programs are legislatively defined as R&amp;D. NIH's 93.xxx programs require case-by-case review, since some (e.g., 93.859, Biomedical Research) are research programs while others are service or training programs. The Department of Defense's (DOD) 12.xxx programs are largely research-oriented. The Department of Health and Human Services' (DHHS) 93.5xx–93.6xx programs tend to be service-oriented.</w:t>
+      </w:r>
+    </w:p>
+    <w:p>
+      <w:pPr>
+        <w:spacing w:after="160"/>
+      </w:pPr>
+      <w:r>
+        <w:rPr>
+          <w:b w:val="0"/>
+          <w:i/>
+          <w:sz w:val="22"/>
+        </w:rPr>
+        <w:t>Example (L3): A social services grant with thin award documentation. The ALN/CFDA lookup at SAM.gov confirms the federal program has an evaluation and research component. Classified R&amp;D at Level 3, based on the program-level designation.</w:t>
+      </w:r>
+    </w:p>
+    <w:p>
+      <w:pPr>
+        <w:pStyle w:val="Heading3"/>
+      </w:pPr>
+      <w:r>
+        <w:rPr>
+          <w:i/>
+          <w:sz w:val="23"/>
+        </w:rPr>
+        <w:t>Limitations</w:t>
+      </w:r>
+    </w:p>
+    <w:p>
+      <w:pPr>
+        <w:spacing w:after="160"/>
+      </w:pPr>
+      <w:r>
+        <w:rPr>
+          <w:b w:val="0"/>
+          <w:i w:val="0"/>
+          <w:sz w:val="22"/>
+        </w:rPr>
+        <w:t>Program descriptions are written at the program level and may not reflect the full range of activities funded under it — a program described broadly as a research program may fund individual grants that are training-only, and vice versa. For this reason, ALN/CFDA is Level 3 in the framework: legitimate evidence, but subordinate to award-level documentation (Levels 1 and 2).</w:t>
+      </w:r>
+    </w:p>
+    <w:p>
+      <w:pPr>
+        <w:pStyle w:val="Heading2"/>
+      </w:pPr>
+      <w:r>
+        <w:rPr>
+          <w:color w:val="B5601E"/>
+          <w:sz w:val="26"/>
+        </w:rPr>
+        <w:t>4.5 Level 4 — Supporting Documentation</w:t>
+      </w:r>
+    </w:p>
+    <w:p>
+      <w:pPr>
+        <w:pStyle w:val="Heading3"/>
+      </w:pPr>
+      <w:r>
+        <w:rPr>
+          <w:i/>
+          <w:sz w:val="23"/>
+        </w:rPr>
+        <w:t>What it is</w:t>
+      </w:r>
+    </w:p>
+    <w:p>
+      <w:pPr>
+        <w:spacing w:after="160"/>
+      </w:pPr>
+      <w:r>
+        <w:rPr>
+          <w:b w:val="0"/>
+          <w:i w:val="0"/>
+          <w:sz w:val="22"/>
+        </w:rPr>
+        <w:t>When federal-level sources are inconclusive, internal project documents can provide the basis for classification. This includes: the Internal Routing Form (IRF) completed by the PI at submission; the Letter of Intent (LOI) sent to the sponsor; the full proposal or application narrative; the Statement of Work (SOW) in the award file; and any written statement from the PI describing the project's research objectives.</w:t>
+      </w:r>
+    </w:p>
+    <w:p>
+      <w:pPr>
+        <w:pStyle w:val="Heading3"/>
+      </w:pPr>
+      <w:r>
+        <w:rPr>
+          <w:i/>
+          <w:sz w:val="23"/>
+        </w:rPr>
+        <w:t>When and how to use it</w:t>
+      </w:r>
+    </w:p>
+    <w:p>
+      <w:pPr>
+        <w:spacing w:after="160"/>
+      </w:pPr>
+      <w:r>
+        <w:rPr>
+          <w:b w:val="0"/>
+          <w:i w:val="0"/>
+          <w:sz w:val="22"/>
+        </w:rPr>
+        <w:t>Level 4 is appropriate when the NOA is a standard form without program-specific language, or the FOA is not available or does not clearly address R&amp;D activity, or the program's SAM.gov listing is ambiguous. In these cases, pull the IRF from Office of Research Administration files, or the PI's proposal from the grant file, and review for research design language: does the project involve data collection? Is there a hypothesis? Are findings expected to contribute to a body of knowledge?</w:t>
+      </w:r>
+    </w:p>
+    <w:p>
+      <w:pPr>
+        <w:spacing w:after="160"/>
+      </w:pPr>
+      <w:r>
+        <w:rPr>
+          <w:b w:val="0"/>
+          <w:i w:val="0"/>
+          <w:sz w:val="22"/>
+        </w:rPr>
+        <w:t>On the IRF specifically, the PI declares the type of activity directly — look first at whether “Research &amp; Development” (as opposed to Instruction/Training) is checked. If R&amp;D is checked, along with a stated research character (Basic, Applied, or Experimental Development) and narrative support, classify as R&amp;D. If only outreach or instruction is indicated, classify as Not R&amp;D.</w:t>
+      </w:r>
+    </w:p>
+    <w:p>
+      <w:pPr>
+        <w:spacing w:after="160"/>
+      </w:pPr>
+      <w:r>
+        <w:rPr>
+          <w:b w:val="0"/>
+          <w:i w:val="0"/>
+          <w:sz w:val="22"/>
+        </w:rPr>
+        <w:t>Level 4 requires the reviewer to exercise more judgment than Levels 1–3, and the documentation should be filed clearly in the award record so the basis for the determination can be reviewed later. PI statements obtained verbally should be documented in writing.</w:t>
+      </w:r>
+    </w:p>
+    <w:p>
+      <w:pPr>
+        <w:spacing w:after="160"/>
+      </w:pPr>
+      <w:r>
+        <w:rPr>
+          <w:b w:val="0"/>
+          <w:i/>
+          <w:sz w:val="22"/>
+        </w:rPr>
+        <w:t>Example (L4 — R&amp;D): A community health research award. The NOA and FOA are not conclusive on research intent. The proposal summary is reviewed: the project design includes community-based research with systematic data collection, mixed-methods analysis, and an intent to contribute to published literature. Classified Applied Research.</w:t>
+      </w:r>
+    </w:p>
+    <w:p>
+      <w:pPr>
+        <w:pStyle w:val="Heading2"/>
+      </w:pPr>
+      <w:r>
+        <w:rPr>
+          <w:color w:val="B5601E"/>
+          <w:sz w:val="26"/>
+        </w:rPr>
+        <w:t>4.6 Level 5 — Institutional Record</w:t>
+      </w:r>
+    </w:p>
+    <w:p>
+      <w:pPr>
+        <w:pStyle w:val="Heading3"/>
+      </w:pPr>
+      <w:r>
+        <w:rPr>
+          <w:i/>
+          <w:sz w:val="23"/>
+        </w:rPr>
+        <w:t>What it is</w:t>
+      </w:r>
+    </w:p>
+    <w:p>
+      <w:pPr>
+        <w:spacing w:after="160"/>
+      </w:pPr>
+      <w:r>
+        <w:rPr>
+          <w:b w:val="0"/>
+          <w:i w:val="0"/>
+          <w:sz w:val="22"/>
+        </w:rPr>
+        <w:t>The Institutional Record level encompasses existing classifications and designations within the institution's own systems: records from the Office of Research Funds Accounting, the annual HERD listing, and Restricted Fund Account designations. This level is used only when no stronger documentation — NOA, FOA, ALN/CFDA, or supporting documentation — is accessible.</w:t>
+      </w:r>
+    </w:p>
+    <w:p>
+      <w:pPr>
+        <w:spacing w:after="160"/>
+      </w:pPr>
+      <w:r>
+        <w:rPr>
+          <w:b w:val="0"/>
+          <w:i w:val="0"/>
+          <w:sz w:val="22"/>
+        </w:rPr>
+        <w:t>If starting a classification review from scratch, Level 5 will likely account for a large share of the first-pass list. That is honest and expected — label it accurately, and treat it as a prioritized list for gathering stronger documentation before the next reporting cycle.</w:t>
+      </w:r>
+    </w:p>
+    <w:p>
+      <w:pPr>
+        <w:pStyle w:val="Heading1"/>
+      </w:pPr>
+      <w:r>
+        <w:rPr>
+          <w:color w:val="0B2545"/>
+          <w:sz w:val="32"/>
+        </w:rPr>
+        <w:t>5. The Determination Process — Step by Step</w:t>
+      </w:r>
+    </w:p>
+    <w:p>
+      <w:pPr>
+        <w:pStyle w:val="Heading2"/>
+      </w:pPr>
+      <w:r>
+        <w:rPr>
+          <w:color w:val="B5601E"/>
+          <w:sz w:val="26"/>
+        </w:rPr>
+        <w:t>5.1 Process Overview</w:t>
+      </w:r>
+    </w:p>
+    <w:p>
+      <w:pPr>
+        <w:spacing w:after="160"/>
+      </w:pPr>
+      <w:r>
+        <w:rPr>
+          <w:b w:val="0"/>
+          <w:i w:val="0"/>
+          <w:sz w:val="22"/>
+        </w:rPr>
+        <w:t>The following process should be followed for each sponsored award under review. Review the Notice of Award first. If it is conclusive, document the classification and the evidence level. If it is not, proceed to the Funding Opportunity Announcement, then the ALN/CFDA listing, then supporting documentation, and finally the institutional record — stopping at the first level that gives a clear, defensible answer.</w:t>
+      </w:r>
+    </w:p>
+    <w:p>
+      <w:pPr>
+        <w:pStyle w:val="Heading2"/>
+      </w:pPr>
+      <w:r>
+        <w:rPr>
+          <w:color w:val="B5601E"/>
+          <w:sz w:val="26"/>
+        </w:rPr>
+        <w:t>5.2 Handling Disagreements Between Classifications</w:t>
+      </w:r>
+    </w:p>
+    <w:p>
+      <w:pPr>
+        <w:spacing w:after="160"/>
+      </w:pPr>
+      <w:r>
+        <w:rPr>
+          <w:b w:val="0"/>
+          <w:i w:val="0"/>
+          <w:sz w:val="22"/>
+        </w:rPr>
+        <w:t>When the Office of Research Administration's classification differs from the previously chosen HERD listing, the process should proceed as follows: document the disagreement in the tracking file with both classifications and the basis for the ORA determination; review the original listing source to identify who made the classification and on what basis; where the ORA review has stronger evidence (for example, a direct NOA review versus informal judgment), the ORA classification should stand; and where the disagreement is material and the award involves significant expenditure, escalate to the Director of the Office of Research Administration, or other appropriate leadership, for a final, updated determination. In all cases, the classification that is better supported by documentary evidence should be recorded for HERD submission.</w:t>
+      </w:r>
+    </w:p>
+    <w:p>
+      <w:pPr>
+        <w:pStyle w:val="Heading1"/>
+      </w:pPr>
+      <w:r>
+        <w:rPr>
+          <w:color w:val="0B2545"/>
+          <w:sz w:val="32"/>
+        </w:rPr>
+        <w:t>6. NSF HERD Survey Guidelines — Key Requirements</w:t>
+      </w:r>
+    </w:p>
+    <w:p>
+      <w:pPr>
+        <w:pStyle w:val="Heading2"/>
+      </w:pPr>
+      <w:r>
+        <w:rPr>
+          <w:color w:val="B5601E"/>
+          <w:sz w:val="26"/>
+        </w:rPr>
+        <w:t>6.1 Survey Structure and Requirements</w:t>
+      </w:r>
+    </w:p>
+    <w:p>
+      <w:pPr>
+        <w:spacing w:after="160"/>
+      </w:pPr>
+      <w:r>
+        <w:rPr>
+          <w:b w:val="0"/>
+          <w:i w:val="0"/>
+          <w:sz w:val="22"/>
+        </w:rPr>
+        <w:t>The NSF HERD Survey is conducted annually through NSF's National Center for Science and Engineering Statistics (NCSES). Participation is mandatory for U.S. universities and colleges that expended at least $150,000 in separately budgeted R&amp;D in the prior fiscal year, which for Morgan State makes participation effectively mandatory.</w:t>
+      </w:r>
+    </w:p>
+    <w:p>
+      <w:pPr>
+        <w:spacing w:after="160"/>
+      </w:pPr>
+      <w:r>
+        <w:rPr>
+          <w:b w:val="0"/>
+          <w:i w:val="0"/>
+          <w:sz w:val="22"/>
+        </w:rPr>
+        <w:t>The survey collects data on R&amp;D expenditures by field of research (science and engineering versus non-science and engineering); source of funding (federal, state, industry, institutional, other); type of R&amp;D activity (Basic Research, Applied Research, Experimental Development); and department or discipline.</w:t>
+      </w:r>
+    </w:p>
+    <w:p>
+      <w:pPr>
+        <w:pStyle w:val="Heading2"/>
+      </w:pPr>
+      <w:r>
+        <w:rPr>
+          <w:color w:val="B5601E"/>
+          <w:sz w:val="26"/>
+        </w:rPr>
+        <w:t>6.2 The “Separately Budgeted” Standard</w:t>
+      </w:r>
+    </w:p>
+    <w:p>
+      <w:pPr>
+        <w:spacing w:after="160"/>
+      </w:pPr>
+      <w:r>
+        <w:rPr>
+          <w:b w:val="0"/>
+          <w:i w:val="0"/>
+          <w:sz w:val="22"/>
+        </w:rPr>
+        <w:t>One of the most important HERD requirements is the “separately budgeted” criterion: NSF HERD counts only R&amp;D that is separately budgeted, meaning that research and non-research activities within a single award should, in principle, be distinguished if the award funds both. In practice, most sponsored awards are either primarily R&amp;D or primarily non-R&amp;D. For large grants that explicitly fund both research and service delivery components, the institution may need to estimate the research portion.</w:t>
+      </w:r>
+    </w:p>
+    <w:p>
+      <w:pPr>
+        <w:pStyle w:val="Heading1"/>
+      </w:pPr>
+      <w:r>
+        <w:rPr>
+          <w:color w:val="0B2545"/>
+          <w:sz w:val="32"/>
+        </w:rPr>
+        <w:t>7. What Other Institutions Are Doing</w:t>
+      </w:r>
+    </w:p>
+    <w:p>
+      <w:pPr>
+        <w:spacing w:after="160"/>
+      </w:pPr>
+      <w:r>
+        <w:rPr>
+          <w:b w:val="0"/>
+          <w:i w:val="0"/>
+          <w:sz w:val="22"/>
+        </w:rPr>
+        <w:t>Most research-intensive institutions — not only HBCUs and MSIs — do not have procedural documentation like this for HERD classification; the practice is informal almost everywhere. Common shortcuts include:</w:t>
+      </w:r>
+    </w:p>
+    <w:p>
+      <w:pPr>
+        <w:pStyle w:val="ListBullet"/>
+      </w:pPr>
+      <w:r>
+        <w:t>Sponsor-based classification — automatically classifying all grants from NSF, NIH, NASA, or DOE as R&amp;D and everything else as non-R&amp;D. Fast, but prone to error in both directions.</w:t>
+      </w:r>
+    </w:p>
+    <w:p>
+      <w:pPr>
+        <w:pStyle w:val="ListBullet"/>
+      </w:pPr>
+      <w:r>
+        <w:t>PI self-classification — relying on PIs to self-report whether their project is research, which introduces inconsistency based on individual judgment and familiarity with HERD definitions.</w:t>
+      </w:r>
+    </w:p>
+    <w:p>
+      <w:pPr>
+        <w:pStyle w:val="ListBullet"/>
+      </w:pPr>
+      <w:r>
+        <w:t>Historical carry-forward — maintaining prior years' classifications unless a PI actively requests a change, which fails to capture new grants or respond to changes in award purpose.</w:t>
+      </w:r>
+    </w:p>
+    <w:p>
+      <w:pPr>
+        <w:spacing w:after="160"/>
+      </w:pPr>
+      <w:r>
+        <w:rPr>
+          <w:b w:val="0"/>
+          <w:i w:val="0"/>
+          <w:sz w:val="22"/>
+        </w:rPr>
+        <w:t>Professional organizations including NCURA (National Council of University Research Administrators), AURA (Association of University Research Administrators), and SRAI (Society of Research Administrators International) have published guidance emphasizing award-level documentation over sponsor-based shortcuts. What Morgan State is building through this framework goes beyond what most peer institutions have formally documented: by creating a five-level hierarchy of evidence and linking each classification to a specific, retrievable document, the Office of Research Administration is establishing a model that is both more rigorous and more transparent than typical HERD classification practice — and one that Morgan State is well-positioned to share through NCURA, AURA, or SRAI channels.</w:t>
+      </w:r>
+    </w:p>
+    <w:p>
+      <w:pPr>
+        <w:pStyle w:val="Heading1"/>
+      </w:pPr>
+      <w:r>
+        <w:rPr>
+          <w:color w:val="0B2545"/>
+          <w:sz w:val="32"/>
+        </w:rPr>
+        <w:t>8. Examples</w:t>
+      </w:r>
+    </w:p>
+    <w:p>
+      <w:pPr>
+        <w:spacing w:after="200"/>
+        <w:ind w:left="360"/>
+      </w:pPr>
+      <w:r>
+        <w:rPr>
+          <w:i/>
+          <w:color w:val="5A6169"/>
+          <w:sz w:val="20"/>
+        </w:rPr>
+        <w:t>Examples in this section are anonymized and marked “(Example)” — real award documents contain PI names, financial account identifiers, and other information that should not be reproduced in a publicly-shared document. Where a real, named award would strengthen a specific case, ORA can substitute one internally with the PI's permission; the public version of this framework keeps illustrative examples throughout.</w:t>
+      </w:r>
+    </w:p>
+    <w:p>
+      <w:pPr>
+        <w:pStyle w:val="Heading2"/>
+      </w:pPr>
+      <w:r>
+        <w:rPr>
+          <w:color w:val="B5601E"/>
+          <w:sz w:val="26"/>
+        </w:rPr>
+        <w:t>8.1 Confirmed R&amp;D — Strong Evidence</w:t>
+      </w:r>
+    </w:p>
+    <w:p>
+      <w:pPr>
+        <w:spacing w:after="160"/>
+      </w:pPr>
+      <w:r>
+        <w:rPr>
+          <w:b w:val="0"/>
+          <w:i w:val="0"/>
+          <w:sz w:val="22"/>
+        </w:rPr>
+        <w:t>Research Centers in Minority Institutions (RCMI) is an NIH program that, by its own program definition, funds research infrastructure — so an award's RCMI designation is itself strong Level 3 evidence, even before reviewing the NOA or FOA.</w:t>
+      </w:r>
+    </w:p>
+    <w:tbl>
+      <w:tblPr>
+        <w:tblStyle w:val="LightGrid-Accent1"/>
+        <w:tblW w:type="auto" w:w="0"/>
+        <w:tblLook w:firstColumn="1" w:firstRow="1" w:lastColumn="0" w:lastRow="0" w:noHBand="0" w:noVBand="1" w:val="04A0"/>
+      </w:tblPr>
+      <w:tblGrid>
+        <w:gridCol w:w="1728"/>
+        <w:gridCol w:w="1728"/>
+        <w:gridCol w:w="1728"/>
+        <w:gridCol w:w="1728"/>
+        <w:gridCol w:w="1728"/>
+      </w:tblGrid>
+      <w:tr>
+        <w:tc>
+          <w:tcPr>
+            <w:tcW w:type="dxa" w:w="1728"/>
+          </w:tcPr>
+          <w:p>
+            <w:r>
+              <w:rPr>
+                <w:b/>
+                <w:sz w:val="20"/>
+              </w:rPr>
+              <w:t>Grant</w:t>
+            </w:r>
+          </w:p>
+        </w:tc>
+        <w:tc>
+          <w:tcPr>
+            <w:tcW w:type="dxa" w:w="1728"/>
+          </w:tcPr>
+          <w:p>
+            <w:r>
+              <w:rPr>
+                <w:b/>
+                <w:sz w:val="20"/>
+              </w:rPr>
+              <w:t>Agency</w:t>
+            </w:r>
+          </w:p>
+        </w:tc>
+        <w:tc>
+          <w:tcPr>
+            <w:tcW w:type="dxa" w:w="1728"/>
+          </w:tcPr>
+          <w:p>
+            <w:r>
+              <w:rPr>
+                <w:b/>
+                <w:sz w:val="20"/>
+              </w:rPr>
+              <w:t>Level</w:t>
+            </w:r>
+          </w:p>
+        </w:tc>
+        <w:tc>
+          <w:tcPr>
+            <w:tcW w:type="dxa" w:w="1728"/>
+          </w:tcPr>
+          <w:p>
+            <w:r>
+              <w:rPr>
+                <w:b/>
+                <w:sz w:val="20"/>
+              </w:rPr>
+              <w:t>Determination</w:t>
+            </w:r>
+          </w:p>
+        </w:tc>
+        <w:tc>
+          <w:tcPr>
+            <w:tcW w:type="dxa" w:w="1728"/>
+          </w:tcPr>
+          <w:p>
+            <w:r>
+              <w:rPr>
+                <w:b/>
+                <w:sz w:val="20"/>
+              </w:rPr>
+              <w:t>Evidence</w:t>
+            </w:r>
+          </w:p>
+        </w:tc>
+      </w:tr>
+      <w:tr>
+        <w:tc>
+          <w:tcPr>
+            <w:tcW w:type="dxa" w:w="1728"/>
+          </w:tcPr>
+          <w:p>
+            <w:r>
+              <w:rPr>
+                <w:sz w:val="20"/>
+              </w:rPr>
+              <w:t>NIH Research Center — Urban Health (Example)</w:t>
+            </w:r>
+          </w:p>
+        </w:tc>
+        <w:tc>
+          <w:tcPr>
+            <w:tcW w:type="dxa" w:w="1728"/>
+          </w:tcPr>
+          <w:p>
+            <w:r>
+              <w:rPr>
+                <w:sz w:val="20"/>
+              </w:rPr>
+              <w:t>NIH</w:t>
+            </w:r>
+          </w:p>
+        </w:tc>
+        <w:tc>
+          <w:tcPr>
+            <w:tcW w:type="dxa" w:w="1728"/>
+          </w:tcPr>
+          <w:p>
+            <w:r>
+              <w:rPr>
+                <w:sz w:val="20"/>
+              </w:rPr>
+              <w:t>L1–L3</w:t>
+            </w:r>
+          </w:p>
+        </w:tc>
+        <w:tc>
+          <w:tcPr>
+            <w:tcW w:type="dxa" w:w="1728"/>
+          </w:tcPr>
+          <w:p>
+            <w:r>
+              <w:rPr>
+                <w:sz w:val="20"/>
+              </w:rPr>
+              <w:t>R&amp;D — Applied Research</w:t>
+            </w:r>
+          </w:p>
+        </w:tc>
+        <w:tc>
+          <w:tcPr>
+            <w:tcW w:type="dxa" w:w="1728"/>
+          </w:tcPr>
+          <w:p>
+            <w:r>
+              <w:rPr>
+                <w:sz w:val="20"/>
+              </w:rPr>
+              <w:t>NOA, FOA, and ALN/CFDA all confirm research center infrastructure; RCMI designation is by definition research.</w:t>
+            </w:r>
+          </w:p>
+        </w:tc>
+      </w:tr>
+      <w:tr>
+        <w:tc>
+          <w:tcPr>
+            <w:tcW w:type="dxa" w:w="1728"/>
+          </w:tcPr>
+          <w:p>
+            <w:r>
+              <w:rPr>
+                <w:sz w:val="20"/>
+              </w:rPr>
+              <w:t>NASA Cooperative Research Agreement (Example)</w:t>
+            </w:r>
+          </w:p>
+        </w:tc>
+        <w:tc>
+          <w:tcPr>
+            <w:tcW w:type="dxa" w:w="1728"/>
+          </w:tcPr>
+          <w:p>
+            <w:r>
+              <w:rPr>
+                <w:sz w:val="20"/>
+              </w:rPr>
+              <w:t>NASA (prime award)</w:t>
+            </w:r>
+          </w:p>
+        </w:tc>
+        <w:tc>
+          <w:tcPr>
+            <w:tcW w:type="dxa" w:w="1728"/>
           </w:tcPr>
           <w:p>
             <w:r>
@@ -767,14 +1934,27 @@
         </w:tc>
         <w:tc>
           <w:tcPr>
-            <w:tcW w:type="dxa" w:w="4320"/>
+            <w:tcW w:type="dxa" w:w="1728"/>
           </w:tcPr>
           <w:p>
             <w:r>
               <w:rPr>
                 <w:sz w:val="20"/>
               </w:rPr>
-              <w:t>Notice of Award (NOA)*</w:t>
+              <w:t>R&amp;D — Applied Research</w:t>
+            </w:r>
+          </w:p>
+        </w:tc>
+        <w:tc>
+          <w:tcPr>
+            <w:tcW w:type="dxa" w:w="1728"/>
+          </w:tcPr>
+          <w:p>
+            <w:r>
+              <w:rPr>
+                <w:sz w:val="20"/>
+              </w:rPr>
+              <w:t>NOA confirms a prime cooperative agreement for NASA earth science research, with clear research objectives stated directly on the award.</w:t>
             </w:r>
           </w:p>
         </w:tc>
@@ -782,7 +1962,266 @@
       <w:tr>
         <w:tc>
           <w:tcPr>
-            <w:tcW w:type="dxa" w:w="4320"/>
+            <w:tcW w:type="dxa" w:w="1728"/>
+          </w:tcPr>
+          <w:p>
+            <w:r>
+              <w:rPr>
+                <w:sz w:val="20"/>
+              </w:rPr>
+              <w:t>NSF Advanced Science Research (Example)</w:t>
+            </w:r>
+          </w:p>
+        </w:tc>
+        <w:tc>
+          <w:tcPr>
+            <w:tcW w:type="dxa" w:w="1728"/>
+          </w:tcPr>
+          <w:p>
+            <w:r>
+              <w:rPr>
+                <w:sz w:val="20"/>
+              </w:rPr>
+              <w:t>NSF</w:t>
+            </w:r>
+          </w:p>
+        </w:tc>
+        <w:tc>
+          <w:tcPr>
+            <w:tcW w:type="dxa" w:w="1728"/>
+          </w:tcPr>
+          <w:p>
+            <w:r>
+              <w:rPr>
+                <w:sz w:val="20"/>
+              </w:rPr>
+              <w:t>L1</w:t>
+            </w:r>
+          </w:p>
+        </w:tc>
+        <w:tc>
+          <w:tcPr>
+            <w:tcW w:type="dxa" w:w="1728"/>
+          </w:tcPr>
+          <w:p>
+            <w:r>
+              <w:rPr>
+                <w:sz w:val="20"/>
+              </w:rPr>
+              <w:t>R&amp;D — Basic Research</w:t>
+            </w:r>
+          </w:p>
+        </w:tc>
+        <w:tc>
+          <w:tcPr>
+            <w:tcW w:type="dxa" w:w="1728"/>
+          </w:tcPr>
+          <w:p>
+            <w:r>
+              <w:rPr>
+                <w:sz w:val="20"/>
+              </w:rPr>
+              <w:t>The NOA's activity-type field is checked “Research” — the direct indicator alone is sufficient. (If a prior-year listing had this recorded as Not R&amp;D, the direct NOA indicator should take precedence and trigger reclassification.)</w:t>
+            </w:r>
+          </w:p>
+        </w:tc>
+      </w:tr>
+    </w:tbl>
+    <w:p/>
+    <w:p>
+      <w:pPr>
+        <w:pStyle w:val="Heading2"/>
+      </w:pPr>
+      <w:r>
+        <w:rPr>
+          <w:color w:val="B5601E"/>
+          <w:sz w:val="26"/>
+        </w:rPr>
+        <w:t>8.2 Not R&amp;D — Well-Documented</w:t>
+      </w:r>
+    </w:p>
+    <w:tbl>
+      <w:tblPr>
+        <w:tblStyle w:val="LightGrid-Accent1"/>
+        <w:tblW w:type="auto" w:w="0"/>
+        <w:tblLook w:firstColumn="1" w:firstRow="1" w:lastColumn="0" w:lastRow="0" w:noHBand="0" w:noVBand="1" w:val="04A0"/>
+      </w:tblPr>
+      <w:tblGrid>
+        <w:gridCol w:w="1728"/>
+        <w:gridCol w:w="1728"/>
+        <w:gridCol w:w="1728"/>
+        <w:gridCol w:w="1728"/>
+        <w:gridCol w:w="1728"/>
+      </w:tblGrid>
+      <w:tr>
+        <w:tc>
+          <w:tcPr>
+            <w:tcW w:type="dxa" w:w="1728"/>
+          </w:tcPr>
+          <w:p>
+            <w:r>
+              <w:rPr>
+                <w:b/>
+                <w:sz w:val="20"/>
+              </w:rPr>
+              <w:t>Grant</w:t>
+            </w:r>
+          </w:p>
+        </w:tc>
+        <w:tc>
+          <w:tcPr>
+            <w:tcW w:type="dxa" w:w="1728"/>
+          </w:tcPr>
+          <w:p>
+            <w:r>
+              <w:rPr>
+                <w:b/>
+                <w:sz w:val="20"/>
+              </w:rPr>
+              <w:t>Agency</w:t>
+            </w:r>
+          </w:p>
+        </w:tc>
+        <w:tc>
+          <w:tcPr>
+            <w:tcW w:type="dxa" w:w="1728"/>
+          </w:tcPr>
+          <w:p>
+            <w:r>
+              <w:rPr>
+                <w:b/>
+                <w:sz w:val="20"/>
+              </w:rPr>
+              <w:t>Level</w:t>
+            </w:r>
+          </w:p>
+        </w:tc>
+        <w:tc>
+          <w:tcPr>
+            <w:tcW w:type="dxa" w:w="1728"/>
+          </w:tcPr>
+          <w:p>
+            <w:r>
+              <w:rPr>
+                <w:b/>
+                <w:sz w:val="20"/>
+              </w:rPr>
+              <w:t>Determination</w:t>
+            </w:r>
+          </w:p>
+        </w:tc>
+        <w:tc>
+          <w:tcPr>
+            <w:tcW w:type="dxa" w:w="1728"/>
+          </w:tcPr>
+          <w:p>
+            <w:r>
+              <w:rPr>
+                <w:b/>
+                <w:sz w:val="20"/>
+              </w:rPr>
+              <w:t>Evidence</w:t>
+            </w:r>
+          </w:p>
+        </w:tc>
+      </w:tr>
+      <w:tr>
+        <w:tc>
+          <w:tcPr>
+            <w:tcW w:type="dxa" w:w="1728"/>
+          </w:tcPr>
+          <w:p>
+            <w:r>
+              <w:rPr>
+                <w:sz w:val="20"/>
+              </w:rPr>
+              <w:t>State Equipment Grant (Example)</w:t>
+            </w:r>
+          </w:p>
+        </w:tc>
+        <w:tc>
+          <w:tcPr>
+            <w:tcW w:type="dxa" w:w="1728"/>
+          </w:tcPr>
+          <w:p>
+            <w:r>
+              <w:rPr>
+                <w:sz w:val="20"/>
+              </w:rPr>
+              <w:t>State agency</w:t>
+            </w:r>
+          </w:p>
+        </w:tc>
+        <w:tc>
+          <w:tcPr>
+            <w:tcW w:type="dxa" w:w="1728"/>
+          </w:tcPr>
+          <w:p>
+            <w:r>
+              <w:rPr>
+                <w:sz w:val="20"/>
+              </w:rPr>
+              <w:t>L1</w:t>
+            </w:r>
+          </w:p>
+        </w:tc>
+        <w:tc>
+          <w:tcPr>
+            <w:tcW w:type="dxa" w:w="1728"/>
+          </w:tcPr>
+          <w:p>
+            <w:r>
+              <w:rPr>
+                <w:sz w:val="20"/>
+              </w:rPr>
+              <w:t>Not R&amp;D</w:t>
+            </w:r>
+          </w:p>
+        </w:tc>
+        <w:tc>
+          <w:tcPr>
+            <w:tcW w:type="dxa" w:w="1728"/>
+          </w:tcPr>
+          <w:p>
+            <w:r>
+              <w:rPr>
+                <w:sz w:val="20"/>
+              </w:rPr>
+              <w:t>NOA reviewed — award funds a security-infrastructure equipment purchase; no research objective.</w:t>
+            </w:r>
+          </w:p>
+        </w:tc>
+      </w:tr>
+      <w:tr>
+        <w:tc>
+          <w:tcPr>
+            <w:tcW w:type="dxa" w:w="1728"/>
+          </w:tcPr>
+          <w:p>
+            <w:r>
+              <w:rPr>
+                <w:sz w:val="20"/>
+              </w:rPr>
+              <w:t>NSF STEM Education Program (Example)</w:t>
+            </w:r>
+          </w:p>
+        </w:tc>
+        <w:tc>
+          <w:tcPr>
+            <w:tcW w:type="dxa" w:w="1728"/>
+          </w:tcPr>
+          <w:p>
+            <w:r>
+              <w:rPr>
+                <w:sz w:val="20"/>
+              </w:rPr>
+              <w:t>NSF</w:t>
+            </w:r>
+          </w:p>
+        </w:tc>
+        <w:tc>
+          <w:tcPr>
+            <w:tcW w:type="dxa" w:w="1728"/>
           </w:tcPr>
           <w:p>
             <w:r>
@@ -795,14 +2234,27 @@
         </w:tc>
         <w:tc>
           <w:tcPr>
-            <w:tcW w:type="dxa" w:w="4320"/>
+            <w:tcW w:type="dxa" w:w="1728"/>
           </w:tcPr>
           <w:p>
             <w:r>
               <w:rPr>
                 <w:sz w:val="20"/>
               </w:rPr>
-              <w:t>Funding Opportunity Announcement (FOA/RFA)</w:t>
+              <w:t>Not R&amp;D</w:t>
+            </w:r>
+          </w:p>
+        </w:tc>
+        <w:tc>
+          <w:tcPr>
+            <w:tcW w:type="dxa" w:w="1728"/>
+          </w:tcPr>
+          <w:p>
+            <w:r>
+              <w:rPr>
+                <w:sz w:val="20"/>
+              </w:rPr>
+              <w:t>FOA reviewed — an NSF STEM education program; the primary activity is pedagogical improvement, not research generation.</w:t>
             </w:r>
           </w:p>
         </w:tc>
@@ -810,27 +2262,66 @@
       <w:tr>
         <w:tc>
           <w:tcPr>
-            <w:tcW w:type="dxa" w:w="4320"/>
+            <w:tcW w:type="dxa" w:w="1728"/>
           </w:tcPr>
           <w:p>
             <w:r>
               <w:rPr>
                 <w:sz w:val="20"/>
               </w:rPr>
-              <w:t>L3</w:t>
+              <w:t>Federal Mentoring Program (Example)</w:t>
             </w:r>
           </w:p>
         </w:tc>
         <w:tc>
           <w:tcPr>
-            <w:tcW w:type="dxa" w:w="4320"/>
+            <w:tcW w:type="dxa" w:w="1728"/>
           </w:tcPr>
           <w:p>
             <w:r>
               <w:rPr>
                 <w:sz w:val="20"/>
               </w:rPr>
-              <w:t>ALN / CFDA Number</w:t>
+              <w:t>Federal agency</w:t>
+            </w:r>
+          </w:p>
+        </w:tc>
+        <w:tc>
+          <w:tcPr>
+            <w:tcW w:type="dxa" w:w="1728"/>
+          </w:tcPr>
+          <w:p>
+            <w:r>
+              <w:rPr>
+                <w:sz w:val="20"/>
+              </w:rPr>
+              <w:t>L2</w:t>
+            </w:r>
+          </w:p>
+        </w:tc>
+        <w:tc>
+          <w:tcPr>
+            <w:tcW w:type="dxa" w:w="1728"/>
+          </w:tcPr>
+          <w:p>
+            <w:r>
+              <w:rPr>
+                <w:sz w:val="20"/>
+              </w:rPr>
+              <w:t>Not R&amp;D</w:t>
+            </w:r>
+          </w:p>
+        </w:tc>
+        <w:tc>
+          <w:tcPr>
+            <w:tcW w:type="dxa" w:w="1728"/>
+          </w:tcPr>
+          <w:p>
+            <w:r>
+              <w:rPr>
+                <w:sz w:val="20"/>
+              </w:rPr>
+              <w:t>FOA reviewed — a mentoring and training program; the award scope is training delivery, not research.</w:t>
             </w:r>
           </w:p>
         </w:tc>
@@ -838,7 +2329,33 @@
       <w:tr>
         <w:tc>
           <w:tcPr>
-            <w:tcW w:type="dxa" w:w="4320"/>
+            <w:tcW w:type="dxa" w:w="1728"/>
+          </w:tcPr>
+          <w:p>
+            <w:r>
+              <w:rPr>
+                <w:sz w:val="20"/>
+              </w:rPr>
+              <w:t>State/Federal Services Program (Example)</w:t>
+            </w:r>
+          </w:p>
+        </w:tc>
+        <w:tc>
+          <w:tcPr>
+            <w:tcW w:type="dxa" w:w="1728"/>
+          </w:tcPr>
+          <w:p>
+            <w:r>
+              <w:rPr>
+                <w:sz w:val="20"/>
+              </w:rPr>
+              <w:t>State/Federal</w:t>
+            </w:r>
+          </w:p>
+        </w:tc>
+        <w:tc>
+          <w:tcPr>
+            <w:tcW w:type="dxa" w:w="1728"/>
           </w:tcPr>
           <w:p>
             <w:r>
@@ -851,827 +2368,33 @@
         </w:tc>
         <w:tc>
           <w:tcPr>
-            <w:tcW w:type="dxa" w:w="4320"/>
+            <w:tcW w:type="dxa" w:w="1728"/>
           </w:tcPr>
           <w:p>
             <w:r>
               <w:rPr>
                 <w:sz w:val="20"/>
               </w:rPr>
-              <w:t>Supporting Documentation (IRF†, SOW, LOI, PI statement)</w:t>
+              <w:t>Not R&amp;D</w:t>
             </w:r>
           </w:p>
         </w:tc>
-      </w:tr>
-      <w:tr>
         <w:tc>
           <w:tcPr>
-            <w:tcW w:type="dxa" w:w="4320"/>
+            <w:tcW w:type="dxa" w:w="1728"/>
           </w:tcPr>
           <w:p>
             <w:r>
               <w:rPr>
                 <w:sz w:val="20"/>
               </w:rPr>
-              <w:t>L5</w:t>
-            </w:r>
-          </w:p>
-        </w:tc>
-        <w:tc>
-          <w:tcPr>
-            <w:tcW w:type="dxa" w:w="4320"/>
-          </w:tcPr>
-          <w:p>
-            <w:r>
-              <w:rPr>
-                <w:sz w:val="20"/>
-              </w:rPr>
-              <w:t>Institutional Record</w:t>
+              <w:t>IRF reviewed — a service delivery program; no research design or data collection methodology identified.</w:t>
             </w:r>
           </w:p>
         </w:tc>
       </w:tr>
     </w:tbl>
     <w:p/>
-    <w:p>
-      <w:pPr>
-        <w:spacing w:after="200"/>
-        <w:ind w:left="360"/>
-      </w:pPr>
-      <w:r>
-        <w:rPr>
-          <w:i/>
-          <w:color w:val="5A6169"/>
-          <w:sz w:val="20"/>
-        </w:rPr>
-        <w:t>* NOA = Notice of Award.   † IRF = Internal Routing Form.</w:t>
-      </w:r>
-    </w:p>
-    <w:p>
-      <w:pPr>
-        <w:spacing w:after="160"/>
-      </w:pPr>
-      <w:r>
-        <w:rPr>
-          <w:b w:val="0"/>
-          <w:i w:val="0"/>
-          <w:sz w:val="22"/>
-        </w:rPr>
-        <w:t>A grant classified at Level 1 (NOA) has the strongest evidence base. A grant classified at Level 5 (Institutional Record) has the weakest — not because the classification is wrong, but because the documentation supporting it is more indirect. Over time, the goal is to move grants from Level 5 toward Level 1 and Level 2 as documentation is gathered and filed.</w:t>
-      </w:r>
-    </w:p>
-    <w:p>
-      <w:pPr>
-        <w:pStyle w:val="Heading2"/>
-      </w:pPr>
-      <w:r>
-        <w:rPr>
-          <w:color w:val="B5601E"/>
-          <w:sz w:val="26"/>
-        </w:rPr>
-        <w:t>4.2 Level 1 — Notice of Award (NOA)</w:t>
-      </w:r>
-    </w:p>
-    <w:p>
-      <w:pPr>
-        <w:pStyle w:val="Heading3"/>
-      </w:pPr>
-      <w:r>
-        <w:rPr>
-          <w:i/>
-          <w:sz w:val="23"/>
-        </w:rPr>
-        <w:t>What it is</w:t>
-      </w:r>
-    </w:p>
-    <w:p>
-      <w:pPr>
-        <w:spacing w:after="160"/>
-      </w:pPr>
-      <w:r>
-        <w:rPr>
-          <w:b w:val="0"/>
-          <w:i w:val="0"/>
-          <w:sz w:val="22"/>
-        </w:rPr>
-        <w:t>The Notice of Award is the official document issued by the funding agency that formally grants the award. It contains the project title, period of performance, award amount, applicable terms and conditions, and — critically — a statement of the project's purpose or scope. For federal awards, the NOA is typically issued electronically through systems like NIH eRA Commons, the NSF Award System, or grants.gov. Under Uniform Guidance (2 CFR Part 200), a federal NOA is also required to include the applicable ALN/CFDA number.</w:t>
-      </w:r>
-    </w:p>
-    <w:p>
-      <w:pPr>
-        <w:pStyle w:val="Heading3"/>
-      </w:pPr>
-      <w:r>
-        <w:rPr>
-          <w:i/>
-          <w:sz w:val="23"/>
-        </w:rPr>
-        <w:t>Why it is the strongest evidence</w:t>
-      </w:r>
-    </w:p>
-    <w:p>
-      <w:pPr>
-        <w:spacing w:after="160"/>
-      </w:pPr>
-      <w:r>
-        <w:rPr>
-          <w:b w:val="0"/>
-          <w:i w:val="0"/>
-          <w:sz w:val="22"/>
-        </w:rPr>
-        <w:t>The NOA is the contract between the institution and the sponsor. It reflects the sponsor's own understanding of what the award funds. Critically, federal agencies are required to directly answer the question “Is this award R&amp;D?” on the Notice of Award itself — NSF, NIH, and NASA notices all include this direct indication. That direct answer is the strongest and most compelling evidence available, and should be the first thing a reviewer looks for.</w:t>
-      </w:r>
-    </w:p>
-    <w:p>
-      <w:pPr>
-        <w:pStyle w:val="Heading3"/>
-      </w:pPr>
-      <w:r>
-        <w:rPr>
-          <w:i/>
-          <w:sz w:val="23"/>
-        </w:rPr>
-        <w:t>How to apply it</w:t>
-      </w:r>
-    </w:p>
-    <w:p>
-      <w:pPr>
-        <w:spacing w:after="160"/>
-      </w:pPr>
-      <w:r>
-        <w:rPr>
-          <w:b w:val="0"/>
-          <w:i w:val="0"/>
-          <w:sz w:val="22"/>
-        </w:rPr>
-        <w:t>First, look for a direct indication of R&amp;D status on the NOA — an explicit “Is this R&amp;D?” field or activity-type designation. If present, that answer governs the classification. Only when no direct indicator is present should a reviewer fall back to reading the NOA's purpose language for words and phrases like: research, study, investigate, analyze, develop new knowledge, hypothesis, experimental, data collection, findings, outcomes measurement. If such language is present and the primary activity is the generation of new knowledge, classify as R&amp;D and record Level 1 as the basis. If the NOA describes the primary activity as service delivery, training, outreach, technical assistance, or infrastructure, classify as Not R&amp;D — also at Level 1. The level does not automatically mean R&amp;D; it means the determination is based on the NOA.</w:t>
-      </w:r>
-    </w:p>
-    <w:p>
-      <w:pPr>
-        <w:spacing w:after="160"/>
-      </w:pPr>
-      <w:r>
-        <w:rPr>
-          <w:b w:val="0"/>
-          <w:i/>
-          <w:sz w:val="22"/>
-        </w:rPr>
-        <w:t>Example (L1 — R&amp;D): An NIH Career Transition Award. The NOA directly indicates the award is R&amp;D. The award funds structured research training with hypothesis-driven scientific inquiry. Classified R&amp;D — Basic Research.</w:t>
-      </w:r>
-    </w:p>
-    <w:p>
-      <w:pPr>
-        <w:spacing w:after="160"/>
-      </w:pPr>
-      <w:r>
-        <w:rPr>
-          <w:b w:val="0"/>
-          <w:i/>
-          <w:sz w:val="22"/>
-        </w:rPr>
-        <w:t>Example (L1 — Not R&amp;D): A state equipment grant. NOA reviewed; no direct R&amp;D indicator is present, and the award language describes the purchase of security infrastructure equipment for the institution, with no research objective identified. Classified Not R&amp;D.</w:t>
-      </w:r>
-    </w:p>
-    <w:p>
-      <w:pPr>
-        <w:pStyle w:val="Heading2"/>
-      </w:pPr>
-      <w:r>
-        <w:rPr>
-          <w:color w:val="B5601E"/>
-          <w:sz w:val="26"/>
-        </w:rPr>
-        <w:t>4.3 Level 2 — Funding Opportunity Announcement (FOA / RFA)</w:t>
-      </w:r>
-    </w:p>
-    <w:p>
-      <w:pPr>
-        <w:pStyle w:val="Heading3"/>
-      </w:pPr>
-      <w:r>
-        <w:rPr>
-          <w:i/>
-          <w:sz w:val="23"/>
-        </w:rPr>
-        <w:t>What it is</w:t>
-      </w:r>
-    </w:p>
-    <w:p>
-      <w:pPr>
-        <w:spacing w:after="160"/>
-      </w:pPr>
-      <w:r>
-        <w:rPr>
-          <w:b w:val="0"/>
-          <w:i w:val="0"/>
-          <w:sz w:val="22"/>
-        </w:rPr>
-        <w:t>The Funding Opportunity Announcement (FOA) — NSF and DOE (Department of Energy) call these Program Solicitations or Funding Opportunity Announcements; NIH uses Requests for Applications (RFA) or Requests for Proposals (RFP) — is the public document through which a federal agency, state agency, or foundation invites applications for a specific type of activity. The FOA describes what the sponsor is trying to accomplish, the types of projects it will fund, and any eligibility requirements.</w:t>
-      </w:r>
-    </w:p>
-    <w:p>
-      <w:pPr>
-        <w:pStyle w:val="Heading3"/>
-      </w:pPr>
-      <w:r>
-        <w:rPr>
-          <w:i/>
-          <w:sz w:val="23"/>
-        </w:rPr>
-        <w:t>Why it matters</w:t>
-      </w:r>
-    </w:p>
-    <w:p>
-      <w:pPr>
-        <w:spacing w:after="160"/>
-      </w:pPr>
-      <w:r>
-        <w:rPr>
-          <w:b w:val="0"/>
-          <w:i w:val="0"/>
-          <w:sz w:val="22"/>
-        </w:rPr>
-        <w:t>The FOA defines the research intent of the program before any individual award is made. If an agency specifically solicited research projects under a given program, that purpose carries forward to all awards made under that solicitation.</w:t>
-      </w:r>
-    </w:p>
-    <w:p>
-      <w:pPr>
-        <w:pStyle w:val="Heading3"/>
-      </w:pPr>
-      <w:r>
-        <w:rPr>
-          <w:i/>
-          <w:sz w:val="23"/>
-        </w:rPr>
-        <w:t>How to find and use it</w:t>
-      </w:r>
-    </w:p>
-    <w:p>
-      <w:pPr>
-        <w:spacing w:after="160"/>
-      </w:pPr>
-      <w:r>
-        <w:rPr>
-          <w:b w:val="0"/>
-          <w:i w:val="0"/>
-          <w:sz w:val="22"/>
-        </w:rPr>
-        <w:t>The FOA number is typically included in the NOA or the award file. Federal FOAs can be retrieved from NSF.gov (under “Funding”), grants.gov (searchable by CFDA/ALN number or agency), the NIH Guide to Grants and Contracts (grants.nih.gov/grants/guide), and agency-specific sites. Once retrieved, review the program description for language defining the activity type as research, applied research, or experimental development — or, as with NSF, note that the sponsoring program may legislatively define the entire portfolio as R&amp;D.</w:t>
-      </w:r>
-    </w:p>
-    <w:p>
-      <w:pPr>
-        <w:spacing w:after="160"/>
-      </w:pPr>
-      <w:r>
-        <w:rPr>
-          <w:b w:val="0"/>
-          <w:i/>
-          <w:sz w:val="22"/>
-        </w:rPr>
-        <w:t>Example (L2 — R&amp;D): An NIH training-and-research program. The NOA does not explicitly state R&amp;D. The FOA is reviewed: the funding opportunity's stated goals include generating new scientific knowledge and require a research design. Classified R&amp;D — Applied Research.</w:t>
-      </w:r>
-    </w:p>
-    <w:p>
-      <w:pPr>
-        <w:pStyle w:val="Heading2"/>
-      </w:pPr>
-      <w:r>
-        <w:rPr>
-          <w:color w:val="B5601E"/>
-          <w:sz w:val="26"/>
-        </w:rPr>
-        <w:t>4.4 Level 3 — ALN / CFDA Number</w:t>
-      </w:r>
-    </w:p>
-    <w:p>
-      <w:pPr>
-        <w:pStyle w:val="Heading3"/>
-      </w:pPr>
-      <w:r>
-        <w:rPr>
-          <w:i/>
-          <w:sz w:val="23"/>
-        </w:rPr>
-        <w:t>What it is</w:t>
-      </w:r>
-    </w:p>
-    <w:p>
-      <w:pPr>
-        <w:spacing w:after="160"/>
-      </w:pPr>
-      <w:r>
-        <w:rPr>
-          <w:b w:val="0"/>
-          <w:i w:val="0"/>
-          <w:sz w:val="22"/>
-        </w:rPr>
-        <w:t>The Assistance Listings Number (ALN), formerly known as the Catalog of Federal Domestic Assistance (CFDA) number, is a five-digit identifier assigned to every federal assistance program. Each program has a formal listing on SAM.gov (System for Award Management) that includes a program description, objectives, eligibility information, and — importantly — the program's primary activity type.</w:t>
-      </w:r>
-    </w:p>
-    <w:p>
-      <w:pPr>
-        <w:pStyle w:val="Heading3"/>
-      </w:pPr>
-      <w:r>
-        <w:rPr>
-          <w:i/>
-          <w:sz w:val="23"/>
-        </w:rPr>
-        <w:t>How to use it</w:t>
-      </w:r>
-    </w:p>
-    <w:p>
-      <w:pPr>
-        <w:spacing w:after="160"/>
-      </w:pPr>
-      <w:r>
-        <w:rPr>
-          <w:b w:val="0"/>
-          <w:i w:val="0"/>
-          <w:sz w:val="22"/>
-        </w:rPr>
-        <w:t>Every federal grant will have an ALN/CFDA number in the award documentation or the institutional grant management system. Look up the number at sam.gov/fal and review the program objectives. If the program is described as a research program, or if the program objective includes generating new knowledge, classifying awards under that program as R&amp;D is appropriate. This is especially useful for programs where individual award documentation is sparse.</w:t>
-      </w:r>
-    </w:p>
-    <w:p>
-      <w:pPr>
-        <w:spacing w:after="160"/>
-      </w:pPr>
-      <w:r>
-        <w:rPr>
-          <w:b w:val="0"/>
-          <w:i w:val="0"/>
-          <w:sz w:val="22"/>
-        </w:rPr>
-        <w:t>Useful patterns (always verify against the individual award): NSF's 47.xxx programs are legislatively defined as R&amp;D. NIH's 93.xxx programs require case-by-case review, since some (e.g., 93.859, Biomedical Research) are research programs while others are service or training programs. The Department of Defense's (DOD) 12.xxx programs are largely research-oriented. The Department of Health and Human Services' (DHHS) 93.5xx–93.6xx programs tend to be service-oriented.</w:t>
-      </w:r>
-    </w:p>
-    <w:p>
-      <w:pPr>
-        <w:spacing w:after="160"/>
-      </w:pPr>
-      <w:r>
-        <w:rPr>
-          <w:b w:val="0"/>
-          <w:i/>
-          <w:sz w:val="22"/>
-        </w:rPr>
-        <w:t>Example (L3): A social services grant with thin award documentation. The ALN/CFDA lookup at SAM.gov confirms the federal program has an evaluation and research component. Classified R&amp;D at Level 3, based on the program-level designation.</w:t>
-      </w:r>
-    </w:p>
-    <w:p>
-      <w:pPr>
-        <w:pStyle w:val="Heading3"/>
-      </w:pPr>
-      <w:r>
-        <w:rPr>
-          <w:i/>
-          <w:sz w:val="23"/>
-        </w:rPr>
-        <w:t>Limitations</w:t>
-      </w:r>
-    </w:p>
-    <w:p>
-      <w:pPr>
-        <w:spacing w:after="160"/>
-      </w:pPr>
-      <w:r>
-        <w:rPr>
-          <w:b w:val="0"/>
-          <w:i w:val="0"/>
-          <w:sz w:val="22"/>
-        </w:rPr>
-        <w:t>Program descriptions are written at the program level and may not reflect the full range of activities funded under it — a program described broadly as a research program may fund individual grants that are training-only, and vice versa. For this reason, ALN/CFDA is Level 3 in the framework: legitimate evidence, but subordinate to award-level documentation (Levels 1 and 2).</w:t>
-      </w:r>
-    </w:p>
-    <w:p>
-      <w:pPr>
-        <w:pStyle w:val="Heading2"/>
-      </w:pPr>
-      <w:r>
-        <w:rPr>
-          <w:color w:val="B5601E"/>
-          <w:sz w:val="26"/>
-        </w:rPr>
-        <w:t>4.5 Level 4 — Supporting Documentation</w:t>
-      </w:r>
-    </w:p>
-    <w:p>
-      <w:pPr>
-        <w:pStyle w:val="Heading3"/>
-      </w:pPr>
-      <w:r>
-        <w:rPr>
-          <w:i/>
-          <w:sz w:val="23"/>
-        </w:rPr>
-        <w:t>What it is</w:t>
-      </w:r>
-    </w:p>
-    <w:p>
-      <w:pPr>
-        <w:spacing w:after="160"/>
-      </w:pPr>
-      <w:r>
-        <w:rPr>
-          <w:b w:val="0"/>
-          <w:i w:val="0"/>
-          <w:sz w:val="22"/>
-        </w:rPr>
-        <w:t>When federal-level sources are inconclusive, internal project documents can provide the basis for classification. This includes: the Internal Routing Form (IRF) completed by the PI at submission; the Letter of Intent (LOI) sent to the sponsor; the full proposal or application narrative; the Statement of Work (SOW) in the award file; and any written statement from the PI describing the project's research objectives.</w:t>
-      </w:r>
-    </w:p>
-    <w:p>
-      <w:pPr>
-        <w:pStyle w:val="Heading3"/>
-      </w:pPr>
-      <w:r>
-        <w:rPr>
-          <w:i/>
-          <w:sz w:val="23"/>
-        </w:rPr>
-        <w:t>When and how to use it</w:t>
-      </w:r>
-    </w:p>
-    <w:p>
-      <w:pPr>
-        <w:spacing w:after="160"/>
-      </w:pPr>
-      <w:r>
-        <w:rPr>
-          <w:b w:val="0"/>
-          <w:i w:val="0"/>
-          <w:sz w:val="22"/>
-        </w:rPr>
-        <w:t>Level 4 is appropriate when the NOA is a standard form without program-specific language, or the FOA is not available or does not clearly address R&amp;D activity, or the program's SAM.gov listing is ambiguous. In these cases, pull the IRF from Office of Research Administration files, or the PI's proposal from the grant file, and review for research design language: does the project involve data collection? Is there a hypothesis? Are findings expected to contribute to a body of knowledge?</w:t>
-      </w:r>
-    </w:p>
-    <w:p>
-      <w:pPr>
-        <w:spacing w:after="160"/>
-      </w:pPr>
-      <w:r>
-        <w:rPr>
-          <w:b w:val="0"/>
-          <w:i w:val="0"/>
-          <w:sz w:val="22"/>
-        </w:rPr>
-        <w:t>On the IRF specifically, the PI declares the type of activity directly — look first at whether “Research &amp; Development” (as opposed to Instruction/Training) is checked. If R&amp;D is checked, along with a stated research character (Basic, Applied, or Experimental Development) and narrative support, classify as R&amp;D. If only outreach or instruction is indicated, classify as Not R&amp;D.</w:t>
-      </w:r>
-    </w:p>
-    <w:p>
-      <w:pPr>
-        <w:spacing w:after="160"/>
-      </w:pPr>
-      <w:r>
-        <w:rPr>
-          <w:b w:val="0"/>
-          <w:i w:val="0"/>
-          <w:sz w:val="22"/>
-        </w:rPr>
-        <w:t>Level 4 requires the reviewer to exercise more judgment than Levels 1–3, and the documentation should be filed clearly in the award record so the basis for the determination can be reviewed later. PI statements obtained verbally should be documented in writing.</w:t>
-      </w:r>
-    </w:p>
-    <w:p>
-      <w:pPr>
-        <w:spacing w:after="160"/>
-      </w:pPr>
-      <w:r>
-        <w:rPr>
-          <w:b w:val="0"/>
-          <w:i/>
-          <w:sz w:val="22"/>
-        </w:rPr>
-        <w:t>Example (L4 — R&amp;D): A community health research award. The NOA and FOA are not conclusive on research intent. The proposal summary is reviewed: the project design includes community-based research with systematic data collection, mixed-methods analysis, and an intent to contribute to published literature. Classified Applied Research.</w:t>
-      </w:r>
-    </w:p>
-    <w:p>
-      <w:pPr>
-        <w:pStyle w:val="Heading2"/>
-      </w:pPr>
-      <w:r>
-        <w:rPr>
-          <w:color w:val="B5601E"/>
-          <w:sz w:val="26"/>
-        </w:rPr>
-        <w:t>4.6 Level 5 — Institutional Record</w:t>
-      </w:r>
-    </w:p>
-    <w:p>
-      <w:pPr>
-        <w:pStyle w:val="Heading3"/>
-      </w:pPr>
-      <w:r>
-        <w:rPr>
-          <w:i/>
-          <w:sz w:val="23"/>
-        </w:rPr>
-        <w:t>What it is</w:t>
-      </w:r>
-    </w:p>
-    <w:p>
-      <w:pPr>
-        <w:spacing w:after="160"/>
-      </w:pPr>
-      <w:r>
-        <w:rPr>
-          <w:b w:val="0"/>
-          <w:i w:val="0"/>
-          <w:sz w:val="22"/>
-        </w:rPr>
-        <w:t>The Institutional Record level encompasses existing classifications and designations within the institution's own systems: grant management system records, the annual HERD listing, and Restricted Fund Account designations. This level is used only when no stronger documentation — NOA, FOA, ALN/CFDA, or supporting documentation — is accessible.</w:t>
-      </w:r>
-    </w:p>
-    <w:p>
-      <w:pPr>
-        <w:spacing w:after="160"/>
-      </w:pPr>
-      <w:r>
-        <w:rPr>
-          <w:b w:val="0"/>
-          <w:i w:val="0"/>
-          <w:sz w:val="22"/>
-        </w:rPr>
-        <w:t>If starting a classification review from scratch, Level 5 will likely account for a large share of the first-pass list. That is honest and expected — label it accurately, and treat it as a prioritized list for gathering stronger documentation before the next reporting cycle.</w:t>
-      </w:r>
-    </w:p>
-    <w:p>
-      <w:pPr>
-        <w:pStyle w:val="Heading1"/>
-      </w:pPr>
-      <w:r>
-        <w:rPr>
-          <w:color w:val="0B2545"/>
-          <w:sz w:val="32"/>
-        </w:rPr>
-        <w:t>5. The Determination Process — Step by Step</w:t>
-      </w:r>
-    </w:p>
-    <w:p>
-      <w:pPr>
-        <w:pStyle w:val="Heading2"/>
-      </w:pPr>
-      <w:r>
-        <w:rPr>
-          <w:color w:val="B5601E"/>
-          <w:sz w:val="26"/>
-        </w:rPr>
-        <w:t>5.1 Process Overview</w:t>
-      </w:r>
-    </w:p>
-    <w:p>
-      <w:pPr>
-        <w:spacing w:after="160"/>
-      </w:pPr>
-      <w:r>
-        <w:rPr>
-          <w:b w:val="0"/>
-          <w:i w:val="0"/>
-          <w:sz w:val="22"/>
-        </w:rPr>
-        <w:t>The following process should be followed for each sponsored award under review. Review the Notice of Award first. If it is conclusive, document the classification and the evidence level. If it is not, proceed to the Funding Opportunity Announcement, then the ALN/CFDA listing, then supporting documentation, and finally the institutional record — stopping at the first level that gives a clear, defensible answer.</w:t>
-      </w:r>
-    </w:p>
-    <w:p>
-      <w:pPr>
-        <w:pStyle w:val="Heading2"/>
-      </w:pPr>
-      <w:r>
-        <w:rPr>
-          <w:color w:val="B5601E"/>
-          <w:sz w:val="26"/>
-        </w:rPr>
-        <w:t>5.2 Handling Disagreements Between Classifications</w:t>
-      </w:r>
-    </w:p>
-    <w:p>
-      <w:pPr>
-        <w:spacing w:after="160"/>
-      </w:pPr>
-      <w:r>
-        <w:rPr>
-          <w:b w:val="0"/>
-          <w:i w:val="0"/>
-          <w:sz w:val="22"/>
-        </w:rPr>
-        <w:t>When the Office of Research Administration's classification differs from the previously chosen HERD listing, the process should proceed as follows: document the disagreement in the tracking file with both classifications and the basis for the ORA determination; review the original listing source to identify who made the classification and on what basis; where the ORA review has stronger evidence (for example, a direct NOA review versus informal judgment), the ORA classification should stand; and where the disagreement is material and the award involves significant expenditure, escalate to the Director of the Office of Research Administration, or other appropriate leadership, for a final, updated determination. In all cases, the classification that is better supported by documentary evidence should be recorded for HERD submission.</w:t>
-      </w:r>
-    </w:p>
-    <w:p>
-      <w:pPr>
-        <w:pStyle w:val="Heading1"/>
-      </w:pPr>
-      <w:r>
-        <w:rPr>
-          <w:color w:val="0B2545"/>
-          <w:sz w:val="32"/>
-        </w:rPr>
-        <w:t>6. NSF HERD Survey Guidelines — Key Requirements</w:t>
-      </w:r>
-    </w:p>
-    <w:p>
-      <w:pPr>
-        <w:pStyle w:val="Heading2"/>
-      </w:pPr>
-      <w:r>
-        <w:rPr>
-          <w:color w:val="B5601E"/>
-          <w:sz w:val="26"/>
-        </w:rPr>
-        <w:t>6.1 Survey Structure and Requirements</w:t>
-      </w:r>
-    </w:p>
-    <w:p>
-      <w:pPr>
-        <w:spacing w:after="160"/>
-      </w:pPr>
-      <w:r>
-        <w:rPr>
-          <w:b w:val="0"/>
-          <w:i w:val="0"/>
-          <w:sz w:val="22"/>
-        </w:rPr>
-        <w:t>The NSF HERD Survey is conducted annually through NSF's National Center for Science and Engineering Statistics (NCSES). Participation is mandatory for U.S. universities and colleges that expended at least $150,000 in separately budgeted R&amp;D in the prior fiscal year, which for Morgan State makes participation effectively mandatory.</w:t>
-      </w:r>
-    </w:p>
-    <w:p>
-      <w:pPr>
-        <w:spacing w:after="160"/>
-      </w:pPr>
-      <w:r>
-        <w:rPr>
-          <w:b w:val="0"/>
-          <w:i w:val="0"/>
-          <w:sz w:val="22"/>
-        </w:rPr>
-        <w:t>The survey collects data on R&amp;D expenditures by field of research (science and engineering versus non-science and engineering); source of funding (federal, state, industry, institutional, other); type of R&amp;D activity (Basic Research, Applied Research, Experimental Development); and department or discipline.</w:t>
-      </w:r>
-    </w:p>
-    <w:p>
-      <w:pPr>
-        <w:pStyle w:val="Heading2"/>
-      </w:pPr>
-      <w:r>
-        <w:rPr>
-          <w:color w:val="B5601E"/>
-          <w:sz w:val="26"/>
-        </w:rPr>
-        <w:t>6.2 The “Separately Budgeted” Standard</w:t>
-      </w:r>
-    </w:p>
-    <w:p>
-      <w:pPr>
-        <w:spacing w:after="160"/>
-      </w:pPr>
-      <w:r>
-        <w:rPr>
-          <w:b w:val="0"/>
-          <w:i w:val="0"/>
-          <w:sz w:val="22"/>
-        </w:rPr>
-        <w:t>One of the most important HERD requirements is the “separately budgeted” criterion: NSF HERD counts only R&amp;D that is separately budgeted, meaning that research and non-research activities within a single award should, in principle, be distinguished if the award funds both. In practice, most sponsored awards are either primarily R&amp;D or primarily non-R&amp;D. For large grants that explicitly fund both research and service delivery components, the institution may need to estimate the research portion.</w:t>
-      </w:r>
-    </w:p>
-    <w:p>
-      <w:pPr>
-        <w:pStyle w:val="Heading1"/>
-      </w:pPr>
-      <w:r>
-        <w:rPr>
-          <w:color w:val="0B2545"/>
-          <w:sz w:val="32"/>
-        </w:rPr>
-        <w:t>7. What Other Institutions Are Doing</w:t>
-      </w:r>
-    </w:p>
-    <w:p>
-      <w:pPr>
-        <w:spacing w:after="160"/>
-      </w:pPr>
-      <w:r>
-        <w:rPr>
-          <w:b w:val="0"/>
-          <w:i w:val="0"/>
-          <w:sz w:val="22"/>
-        </w:rPr>
-        <w:t>Most research-intensive institutions — not only HBCUs and MSIs — do not have procedural documentation like this for HERD classification; the practice is informal almost everywhere. Common shortcuts include:</w:t>
-      </w:r>
-    </w:p>
-    <w:p>
-      <w:pPr>
-        <w:pStyle w:val="ListBullet"/>
-      </w:pPr>
-      <w:r>
-        <w:t>Sponsor-based classification — automatically classifying all grants from NSF, NIH, NASA, or DOE as R&amp;D and everything else as non-R&amp;D. Fast, but prone to error in both directions.</w:t>
-      </w:r>
-    </w:p>
-    <w:p>
-      <w:pPr>
-        <w:pStyle w:val="ListBullet"/>
-      </w:pPr>
-      <w:r>
-        <w:t>PI self-classification — relying on PIs to self-report whether their project is research, which introduces inconsistency based on individual judgment and familiarity with HERD definitions.</w:t>
-      </w:r>
-    </w:p>
-    <w:p>
-      <w:pPr>
-        <w:pStyle w:val="ListBullet"/>
-      </w:pPr>
-      <w:r>
-        <w:t>Historical carry-forward — maintaining prior years' classifications unless a PI actively requests a change, which fails to capture new grants or respond to changes in award purpose.</w:t>
-      </w:r>
-    </w:p>
-    <w:p>
-      <w:pPr>
-        <w:spacing w:after="160"/>
-      </w:pPr>
-      <w:r>
-        <w:rPr>
-          <w:b w:val="0"/>
-          <w:i w:val="0"/>
-          <w:sz w:val="22"/>
-        </w:rPr>
-        <w:t>Professional organizations including NCURA (National Council of University Research Administrators), AURA (Association of University Research Administrators), and SRAI (Society of Research Administrators International) have published guidance emphasizing award-level documentation over sponsor-based shortcuts. What Morgan State is building through this framework goes beyond what most peer institutions have formally documented: by creating a five-level hierarchy of evidence and linking each classification to a specific, retrievable document, the Office of Research Administration is establishing a model that is both more rigorous and more transparent than typical HERD classification practice — and one that Morgan State is well-positioned to share through NCURA, AURA, or SRAI channels.</w:t>
-      </w:r>
-    </w:p>
-    <w:p>
-      <w:pPr>
-        <w:pStyle w:val="Heading1"/>
-      </w:pPr>
-      <w:r>
-        <w:rPr>
-          <w:color w:val="0B2545"/>
-          <w:sz w:val="32"/>
-        </w:rPr>
-        <w:t>8. Examples</w:t>
-      </w:r>
-    </w:p>
-    <w:p>
-      <w:pPr>
-        <w:spacing w:after="200"/>
-        <w:ind w:left="360"/>
-      </w:pPr>
-      <w:r>
-        <w:rPr>
-          <w:i/>
-          <w:color w:val="5A6169"/>
-          <w:sz w:val="20"/>
-        </w:rPr>
-        <w:t>Examples in this section use illustrative, non-identifying award details. Real award documents contain PI names, financial account identifiers, and other information that should not be reproduced outside internal ORA files.</w:t>
-      </w:r>
-    </w:p>
-    <w:p>
-      <w:pPr>
-        <w:pStyle w:val="Heading2"/>
-      </w:pPr>
-      <w:r>
-        <w:rPr>
-          <w:color w:val="B5601E"/>
-          <w:sz w:val="26"/>
-        </w:rPr>
-        <w:t>8.1 Confirmed R&amp;D — Direct Evidence</w:t>
-      </w:r>
-    </w:p>
-    <w:p>
-      <w:pPr>
-        <w:spacing w:after="160"/>
-      </w:pPr>
-      <w:r>
-        <w:rPr>
-          <w:b w:val="0"/>
-          <w:i w:val="0"/>
-          <w:sz w:val="22"/>
-        </w:rPr>
-        <w:t>A biomedical research award from NIH. The Notice of Award directly indicates “Is the Award R&amp;D? Yes.” The award funds hypothesis-driven investigation into a specific disease mechanism, with a defined research design and publication plan. Classified R&amp;D — Basic Research, Level 1.</w:t>
-      </w:r>
-    </w:p>
-    <w:p>
-      <w:pPr>
-        <w:pStyle w:val="Heading2"/>
-      </w:pPr>
-      <w:r>
-        <w:rPr>
-          <w:color w:val="B5601E"/>
-          <w:sz w:val="26"/>
-        </w:rPr>
-        <w:t>8.2 Confirmed Not R&amp;D — Direct Evidence</w:t>
-      </w:r>
-    </w:p>
-    <w:p>
-      <w:pPr>
-        <w:spacing w:after="160"/>
-      </w:pPr>
-      <w:r>
-        <w:rPr>
-          <w:b w:val="0"/>
-          <w:i w:val="0"/>
-          <w:sz w:val="22"/>
-        </w:rPr>
-        <w:t>A workforce technology-access award funded under a federal community-connectivity program. The Notice of Award directly indicates “R&amp;D Award? No.” The award funds infrastructure deployment with no research objective. Classified Not R&amp;D, Level 1.</w:t>
-      </w:r>
-    </w:p>
     <w:p>
       <w:pPr>
         <w:pStyle w:val="Heading2"/>
@@ -1707,7 +2430,7 @@
           <w:i w:val="0"/>
           <w:sz w:val="22"/>
         </w:rPr>
-        <w:t>Community-Based Research: may qualify as Applied Research where the award includes a systematic research design with intent to produce generalizable findings — including awards funded through programs such as the Research Centers in Minority Institutions (RCMI) program, where the research character is typically well-documented. These require careful review at Level 4 (IRF or proposal review) when the NOA is not conclusive.</w:t>
+        <w:t>Community-Based Research: may qualify as Applied Research where the award includes a systematic research design with intent to produce generalizable findings — including RCMI awards, where the research character is typically well-documented. These require careful review at Level 4 (IRF or proposal review) when the NOA is not conclusive.</w:t>
       </w:r>
     </w:p>
     <w:p>
@@ -1720,7 +2443,7 @@
           <w:i w:val="0"/>
           <w:sz w:val="22"/>
         </w:rPr>
-        <w:t>Conference Grants: NSF conference grants are generally classified as R&amp;D, consistent with NSF's own program-level classification of its awards. Conference grants from other agencies require review of the FOA and the specific conference's stated purpose, and may be classified as R&amp;D or Not R&amp;D depending on that review.</w:t>
+        <w:t>Conference Grants: NSF conference grants are generally classified as R&amp;D, consistent with NSF's own program-level classification of its awards, and not R&amp;D otherwise unless a specific FOA says so. Conference grants from other agencies require review of the FOA and the specific conference's stated purpose.</w:t>
       </w:r>
     </w:p>
     <w:p>
@@ -1920,6 +2643,315 @@
         <w:t>Use the institutional record only when no stronger evidence is available.</w:t>
       </w:r>
     </w:p>
+    <w:p>
+      <w:pPr>
+        <w:pStyle w:val="Heading1"/>
+      </w:pPr>
+      <w:r>
+        <w:rPr>
+          <w:color w:val="0B2545"/>
+          <w:sz w:val="32"/>
+        </w:rPr>
+        <w:t>Appendix B. HERD Classification Checklist</w:t>
+      </w:r>
+    </w:p>
+    <w:tbl>
+      <w:tblPr>
+        <w:tblStyle w:val="LightGrid-Accent1"/>
+        <w:tblW w:type="auto" w:w="0"/>
+        <w:tblLook w:firstColumn="1" w:firstRow="1" w:lastColumn="0" w:lastRow="0" w:noHBand="0" w:noVBand="1" w:val="04A0"/>
+      </w:tblPr>
+      <w:tblGrid>
+        <w:gridCol w:w="2880"/>
+        <w:gridCol w:w="2880"/>
+        <w:gridCol w:w="2880"/>
+      </w:tblGrid>
+      <w:tr>
+        <w:tc>
+          <w:tcPr>
+            <w:tcW w:type="dxa" w:w="2880"/>
+          </w:tcPr>
+          <w:p>
+            <w:r>
+              <w:rPr>
+                <w:b/>
+                <w:sz w:val="20"/>
+              </w:rPr>
+              <w:t>☐</w:t>
+            </w:r>
+          </w:p>
+        </w:tc>
+        <w:tc>
+          <w:tcPr>
+            <w:tcW w:type="dxa" w:w="2880"/>
+          </w:tcPr>
+          <w:p>
+            <w:r>
+              <w:rPr>
+                <w:b/>
+                <w:sz w:val="20"/>
+              </w:rPr>
+              <w:t>Classification Step</w:t>
+            </w:r>
+          </w:p>
+        </w:tc>
+        <w:tc>
+          <w:tcPr>
+            <w:tcW w:type="dxa" w:w="2880"/>
+          </w:tcPr>
+          <w:p>
+            <w:r>
+              <w:rPr>
+                <w:b/>
+                <w:sz w:val="20"/>
+              </w:rPr>
+              <w:t>Notes / Evidence Filed</w:t>
+            </w:r>
+          </w:p>
+        </w:tc>
+      </w:tr>
+      <w:tr>
+        <w:tc>
+          <w:tcPr>
+            <w:tcW w:type="dxa" w:w="2880"/>
+          </w:tcPr>
+          <w:p>
+            <w:r>
+              <w:rPr>
+                <w:sz w:val="20"/>
+              </w:rPr>
+              <w:t>☐</w:t>
+            </w:r>
+          </w:p>
+        </w:tc>
+        <w:tc>
+          <w:tcPr>
+            <w:tcW w:type="dxa" w:w="2880"/>
+          </w:tcPr>
+          <w:p>
+            <w:r>
+              <w:rPr>
+                <w:sz w:val="20"/>
+              </w:rPr>
+              <w:t>NOA reviewed</w:t>
+            </w:r>
+          </w:p>
+        </w:tc>
+        <w:tc>
+          <w:tcPr>
+            <w:tcW w:type="dxa" w:w="2880"/>
+          </w:tcPr>
+          <w:p>
+            <w:r>
+              <w:rPr>
+                <w:sz w:val="20"/>
+              </w:rPr>
+            </w:r>
+          </w:p>
+        </w:tc>
+      </w:tr>
+      <w:tr>
+        <w:tc>
+          <w:tcPr>
+            <w:tcW w:type="dxa" w:w="2880"/>
+          </w:tcPr>
+          <w:p>
+            <w:r>
+              <w:rPr>
+                <w:sz w:val="20"/>
+              </w:rPr>
+              <w:t>☐</w:t>
+            </w:r>
+          </w:p>
+        </w:tc>
+        <w:tc>
+          <w:tcPr>
+            <w:tcW w:type="dxa" w:w="2880"/>
+          </w:tcPr>
+          <w:p>
+            <w:r>
+              <w:rPr>
+                <w:sz w:val="20"/>
+              </w:rPr>
+              <w:t>FOA/RFA reviewed (if applicable)</w:t>
+            </w:r>
+          </w:p>
+        </w:tc>
+        <w:tc>
+          <w:tcPr>
+            <w:tcW w:type="dxa" w:w="2880"/>
+          </w:tcPr>
+          <w:p>
+            <w:r>
+              <w:rPr>
+                <w:sz w:val="20"/>
+              </w:rPr>
+            </w:r>
+          </w:p>
+        </w:tc>
+      </w:tr>
+      <w:tr>
+        <w:tc>
+          <w:tcPr>
+            <w:tcW w:type="dxa" w:w="2880"/>
+          </w:tcPr>
+          <w:p>
+            <w:r>
+              <w:rPr>
+                <w:sz w:val="20"/>
+              </w:rPr>
+              <w:t>☐</w:t>
+            </w:r>
+          </w:p>
+        </w:tc>
+        <w:tc>
+          <w:tcPr>
+            <w:tcW w:type="dxa" w:w="2880"/>
+          </w:tcPr>
+          <w:p>
+            <w:r>
+              <w:rPr>
+                <w:sz w:val="20"/>
+              </w:rPr>
+              <w:t>ALN/CFDA verified</w:t>
+            </w:r>
+          </w:p>
+        </w:tc>
+        <w:tc>
+          <w:tcPr>
+            <w:tcW w:type="dxa" w:w="2880"/>
+          </w:tcPr>
+          <w:p>
+            <w:r>
+              <w:rPr>
+                <w:sz w:val="20"/>
+              </w:rPr>
+            </w:r>
+          </w:p>
+        </w:tc>
+      </w:tr>
+      <w:tr>
+        <w:tc>
+          <w:tcPr>
+            <w:tcW w:type="dxa" w:w="2880"/>
+          </w:tcPr>
+          <w:p>
+            <w:r>
+              <w:rPr>
+                <w:sz w:val="20"/>
+              </w:rPr>
+              <w:t>☐</w:t>
+            </w:r>
+          </w:p>
+        </w:tc>
+        <w:tc>
+          <w:tcPr>
+            <w:tcW w:type="dxa" w:w="2880"/>
+          </w:tcPr>
+          <w:p>
+            <w:r>
+              <w:rPr>
+                <w:sz w:val="20"/>
+              </w:rPr>
+              <w:t>Supporting documentation reviewed</w:t>
+            </w:r>
+          </w:p>
+        </w:tc>
+        <w:tc>
+          <w:tcPr>
+            <w:tcW w:type="dxa" w:w="2880"/>
+          </w:tcPr>
+          <w:p>
+            <w:r>
+              <w:rPr>
+                <w:sz w:val="20"/>
+              </w:rPr>
+            </w:r>
+          </w:p>
+        </w:tc>
+      </w:tr>
+      <w:tr>
+        <w:tc>
+          <w:tcPr>
+            <w:tcW w:type="dxa" w:w="2880"/>
+          </w:tcPr>
+          <w:p>
+            <w:r>
+              <w:rPr>
+                <w:sz w:val="20"/>
+              </w:rPr>
+              <w:t>☐</w:t>
+            </w:r>
+          </w:p>
+        </w:tc>
+        <w:tc>
+          <w:tcPr>
+            <w:tcW w:type="dxa" w:w="2880"/>
+          </w:tcPr>
+          <w:p>
+            <w:r>
+              <w:rPr>
+                <w:sz w:val="20"/>
+              </w:rPr>
+              <w:t>Evidence level recorded</w:t>
+            </w:r>
+          </w:p>
+        </w:tc>
+        <w:tc>
+          <w:tcPr>
+            <w:tcW w:type="dxa" w:w="2880"/>
+          </w:tcPr>
+          <w:p>
+            <w:r>
+              <w:rPr>
+                <w:sz w:val="20"/>
+              </w:rPr>
+            </w:r>
+          </w:p>
+        </w:tc>
+      </w:tr>
+      <w:tr>
+        <w:tc>
+          <w:tcPr>
+            <w:tcW w:type="dxa" w:w="2880"/>
+          </w:tcPr>
+          <w:p>
+            <w:r>
+              <w:rPr>
+                <w:sz w:val="20"/>
+              </w:rPr>
+              <w:t>☐</w:t>
+            </w:r>
+          </w:p>
+        </w:tc>
+        <w:tc>
+          <w:tcPr>
+            <w:tcW w:type="dxa" w:w="2880"/>
+          </w:tcPr>
+          <w:p>
+            <w:r>
+              <w:rPr>
+                <w:sz w:val="20"/>
+              </w:rPr>
+              <w:t>Reviewer initials/date</w:t>
+            </w:r>
+          </w:p>
+        </w:tc>
+        <w:tc>
+          <w:tcPr>
+            <w:tcW w:type="dxa" w:w="2880"/>
+          </w:tcPr>
+          <w:p>
+            <w:r>
+              <w:rPr>
+                <w:sz w:val="20"/>
+              </w:rPr>
+            </w:r>
+          </w:p>
+        </w:tc>
+      </w:tr>
+    </w:tbl>
+    <w:p/>
     <w:sectPr>
       <w:pgSz w:w="12240" w:h="15840"/>
       <w:pgMar w:top="1440" w:right="1800" w:bottom="1440" w:left="1800" w:header="720" w:footer="720" w:gutter="0"/>

</xml_diff>

<commit_message>
Make the docx actually look like an institutional policy document: page numbers, running header/footer, auto-updating table of contents, brand-colored tables instead of Word's default blue style
</commit_message>
<xml_diff>
--- a/assets/RD-Classification-Framework.docx
+++ b/assets/RD-Classification-Framework.docx
@@ -108,6 +108,34 @@
       </w:r>
     </w:p>
     <w:p>
+      <w:r>
+        <w:rPr>
+          <w:b/>
+          <w:color w:val="0B2545"/>
+          <w:sz w:val="32"/>
+        </w:rPr>
+        <w:t>Table of Contents</w:t>
+      </w:r>
+    </w:p>
+    <w:p>
+      <w:r>
+        <w:rPr>
+          <w:i/>
+          <w:color w:val="5A6169"/>
+        </w:rPr>
+        <w:fldChar w:fldCharType="begin"/>
+        <w:instrText xml:space="preserve">TOC \o "1-3" \h \z \u</w:instrText>
+        <w:fldChar w:fldCharType="separate"/>
+        <w:t>Right-click here and choose “Update Field” to generate the table of contents.</w:t>
+        <w:fldChar w:fldCharType="end"/>
+      </w:r>
+    </w:p>
+    <w:p>
+      <w:r>
+        <w:br w:type="page"/>
+      </w:r>
+    </w:p>
+    <w:p>
       <w:pPr>
         <w:pStyle w:val="Heading1"/>
       </w:pPr>
@@ -726,24 +754,26 @@
     </w:p>
     <w:tbl>
       <w:tblPr>
-        <w:tblStyle w:val="LightGrid-Accent1"/>
+        <w:tblStyle w:val="TableGrid"/>
         <w:tblW w:type="auto" w:w="0"/>
         <w:tblLook w:firstColumn="1" w:firstRow="1" w:lastColumn="0" w:lastRow="0" w:noHBand="0" w:noVBand="1" w:val="04A0"/>
       </w:tblPr>
       <w:tblGrid>
-        <w:gridCol w:w="2880"/>
-        <w:gridCol w:w="2880"/>
-        <w:gridCol w:w="2880"/>
+        <w:gridCol w:w="3120"/>
+        <w:gridCol w:w="3120"/>
+        <w:gridCol w:w="3120"/>
       </w:tblGrid>
       <w:tr>
         <w:tc>
           <w:tcPr>
-            <w:tcW w:type="dxa" w:w="2880"/>
+            <w:tcW w:type="dxa" w:w="3120"/>
+            <w:shd w:val="clear" w:color="auto" w:fill="0B2545"/>
           </w:tcPr>
           <w:p>
             <w:r>
               <w:rPr>
                 <w:b/>
+                <w:color w:val="FFFFFF"/>
                 <w:sz w:val="20"/>
               </w:rPr>
               <w:t>Level</w:t>
@@ -752,12 +782,14 @@
         </w:tc>
         <w:tc>
           <w:tcPr>
-            <w:tcW w:type="dxa" w:w="2880"/>
+            <w:tcW w:type="dxa" w:w="3120"/>
+            <w:shd w:val="clear" w:color="auto" w:fill="0B2545"/>
           </w:tcPr>
           <w:p>
             <w:r>
               <w:rPr>
                 <w:b/>
+                <w:color w:val="FFFFFF"/>
                 <w:sz w:val="20"/>
               </w:rPr>
               <w:t>Source</w:t>
@@ -766,12 +798,14 @@
         </w:tc>
         <w:tc>
           <w:tcPr>
-            <w:tcW w:type="dxa" w:w="2880"/>
+            <w:tcW w:type="dxa" w:w="3120"/>
+            <w:shd w:val="clear" w:color="auto" w:fill="0B2545"/>
           </w:tcPr>
           <w:p>
             <w:r>
               <w:rPr>
                 <w:b/>
+                <w:color w:val="FFFFFF"/>
                 <w:sz w:val="20"/>
               </w:rPr>
               <w:t>When to Use</w:t>
@@ -782,7 +816,7 @@
       <w:tr>
         <w:tc>
           <w:tcPr>
-            <w:tcW w:type="dxa" w:w="2880"/>
+            <w:tcW w:type="dxa" w:w="3120"/>
           </w:tcPr>
           <w:p>
             <w:r>
@@ -795,7 +829,7 @@
         </w:tc>
         <w:tc>
           <w:tcPr>
-            <w:tcW w:type="dxa" w:w="2880"/>
+            <w:tcW w:type="dxa" w:w="3120"/>
           </w:tcPr>
           <w:p>
             <w:r>
@@ -808,7 +842,7 @@
         </w:tc>
         <w:tc>
           <w:tcPr>
-            <w:tcW w:type="dxa" w:w="2880"/>
+            <w:tcW w:type="dxa" w:w="3120"/>
           </w:tcPr>
           <w:p>
             <w:r>
@@ -823,7 +857,8 @@
       <w:tr>
         <w:tc>
           <w:tcPr>
-            <w:tcW w:type="dxa" w:w="2880"/>
+            <w:tcW w:type="dxa" w:w="3120"/>
+            <w:shd w:val="clear" w:color="auto" w:fill="F2EDE5"/>
           </w:tcPr>
           <w:p>
             <w:r>
@@ -836,7 +871,8 @@
         </w:tc>
         <w:tc>
           <w:tcPr>
-            <w:tcW w:type="dxa" w:w="2880"/>
+            <w:tcW w:type="dxa" w:w="3120"/>
+            <w:shd w:val="clear" w:color="auto" w:fill="F2EDE5"/>
           </w:tcPr>
           <w:p>
             <w:r>
@@ -849,7 +885,8 @@
         </w:tc>
         <w:tc>
           <w:tcPr>
-            <w:tcW w:type="dxa" w:w="2880"/>
+            <w:tcW w:type="dxa" w:w="3120"/>
+            <w:shd w:val="clear" w:color="auto" w:fill="F2EDE5"/>
           </w:tcPr>
           <w:p>
             <w:r>
@@ -864,7 +901,7 @@
       <w:tr>
         <w:tc>
           <w:tcPr>
-            <w:tcW w:type="dxa" w:w="2880"/>
+            <w:tcW w:type="dxa" w:w="3120"/>
           </w:tcPr>
           <w:p>
             <w:r>
@@ -877,7 +914,7 @@
         </w:tc>
         <w:tc>
           <w:tcPr>
-            <w:tcW w:type="dxa" w:w="2880"/>
+            <w:tcW w:type="dxa" w:w="3120"/>
           </w:tcPr>
           <w:p>
             <w:r>
@@ -890,7 +927,7 @@
         </w:tc>
         <w:tc>
           <w:tcPr>
-            <w:tcW w:type="dxa" w:w="2880"/>
+            <w:tcW w:type="dxa" w:w="3120"/>
           </w:tcPr>
           <w:p>
             <w:r>
@@ -905,7 +942,8 @@
       <w:tr>
         <w:tc>
           <w:tcPr>
-            <w:tcW w:type="dxa" w:w="2880"/>
+            <w:tcW w:type="dxa" w:w="3120"/>
+            <w:shd w:val="clear" w:color="auto" w:fill="F2EDE5"/>
           </w:tcPr>
           <w:p>
             <w:r>
@@ -918,7 +956,8 @@
         </w:tc>
         <w:tc>
           <w:tcPr>
-            <w:tcW w:type="dxa" w:w="2880"/>
+            <w:tcW w:type="dxa" w:w="3120"/>
+            <w:shd w:val="clear" w:color="auto" w:fill="F2EDE5"/>
           </w:tcPr>
           <w:p>
             <w:r>
@@ -931,7 +970,8 @@
         </w:tc>
         <w:tc>
           <w:tcPr>
-            <w:tcW w:type="dxa" w:w="2880"/>
+            <w:tcW w:type="dxa" w:w="3120"/>
+            <w:shd w:val="clear" w:color="auto" w:fill="F2EDE5"/>
           </w:tcPr>
           <w:p>
             <w:r>
@@ -946,7 +986,7 @@
       <w:tr>
         <w:tc>
           <w:tcPr>
-            <w:tcW w:type="dxa" w:w="2880"/>
+            <w:tcW w:type="dxa" w:w="3120"/>
           </w:tcPr>
           <w:p>
             <w:r>
@@ -959,7 +999,7 @@
         </w:tc>
         <w:tc>
           <w:tcPr>
-            <w:tcW w:type="dxa" w:w="2880"/>
+            <w:tcW w:type="dxa" w:w="3120"/>
           </w:tcPr>
           <w:p>
             <w:r>
@@ -972,7 +1012,7 @@
         </w:tc>
         <w:tc>
           <w:tcPr>
-            <w:tcW w:type="dxa" w:w="2880"/>
+            <w:tcW w:type="dxa" w:w="3120"/>
           </w:tcPr>
           <w:p>
             <w:r>
@@ -1742,26 +1782,28 @@
     </w:p>
     <w:tbl>
       <w:tblPr>
-        <w:tblStyle w:val="LightGrid-Accent1"/>
+        <w:tblStyle w:val="TableGrid"/>
         <w:tblW w:type="auto" w:w="0"/>
         <w:tblLook w:firstColumn="1" w:firstRow="1" w:lastColumn="0" w:lastRow="0" w:noHBand="0" w:noVBand="1" w:val="04A0"/>
       </w:tblPr>
       <w:tblGrid>
-        <w:gridCol w:w="1728"/>
-        <w:gridCol w:w="1728"/>
-        <w:gridCol w:w="1728"/>
-        <w:gridCol w:w="1728"/>
-        <w:gridCol w:w="1728"/>
+        <w:gridCol w:w="1872"/>
+        <w:gridCol w:w="1872"/>
+        <w:gridCol w:w="1872"/>
+        <w:gridCol w:w="1872"/>
+        <w:gridCol w:w="1872"/>
       </w:tblGrid>
       <w:tr>
         <w:tc>
           <w:tcPr>
-            <w:tcW w:type="dxa" w:w="1728"/>
+            <w:tcW w:type="dxa" w:w="1872"/>
+            <w:shd w:val="clear" w:color="auto" w:fill="0B2545"/>
           </w:tcPr>
           <w:p>
             <w:r>
               <w:rPr>
                 <w:b/>
+                <w:color w:val="FFFFFF"/>
                 <w:sz w:val="20"/>
               </w:rPr>
               <w:t>Grant</w:t>
@@ -1770,12 +1812,14 @@
         </w:tc>
         <w:tc>
           <w:tcPr>
-            <w:tcW w:type="dxa" w:w="1728"/>
+            <w:tcW w:type="dxa" w:w="1872"/>
+            <w:shd w:val="clear" w:color="auto" w:fill="0B2545"/>
           </w:tcPr>
           <w:p>
             <w:r>
               <w:rPr>
                 <w:b/>
+                <w:color w:val="FFFFFF"/>
                 <w:sz w:val="20"/>
               </w:rPr>
               <w:t>Agency</w:t>
@@ -1784,12 +1828,14 @@
         </w:tc>
         <w:tc>
           <w:tcPr>
-            <w:tcW w:type="dxa" w:w="1728"/>
+            <w:tcW w:type="dxa" w:w="1872"/>
+            <w:shd w:val="clear" w:color="auto" w:fill="0B2545"/>
           </w:tcPr>
           <w:p>
             <w:r>
               <w:rPr>
                 <w:b/>
+                <w:color w:val="FFFFFF"/>
                 <w:sz w:val="20"/>
               </w:rPr>
               <w:t>Level</w:t>
@@ -1798,12 +1844,14 @@
         </w:tc>
         <w:tc>
           <w:tcPr>
-            <w:tcW w:type="dxa" w:w="1728"/>
+            <w:tcW w:type="dxa" w:w="1872"/>
+            <w:shd w:val="clear" w:color="auto" w:fill="0B2545"/>
           </w:tcPr>
           <w:p>
             <w:r>
               <w:rPr>
                 <w:b/>
+                <w:color w:val="FFFFFF"/>
                 <w:sz w:val="20"/>
               </w:rPr>
               <w:t>Determination</w:t>
@@ -1812,12 +1860,14 @@
         </w:tc>
         <w:tc>
           <w:tcPr>
-            <w:tcW w:type="dxa" w:w="1728"/>
+            <w:tcW w:type="dxa" w:w="1872"/>
+            <w:shd w:val="clear" w:color="auto" w:fill="0B2545"/>
           </w:tcPr>
           <w:p>
             <w:r>
               <w:rPr>
                 <w:b/>
+                <w:color w:val="FFFFFF"/>
                 <w:sz w:val="20"/>
               </w:rPr>
               <w:t>Evidence</w:t>
@@ -1828,7 +1878,7 @@
       <w:tr>
         <w:tc>
           <w:tcPr>
-            <w:tcW w:type="dxa" w:w="1728"/>
+            <w:tcW w:type="dxa" w:w="1872"/>
           </w:tcPr>
           <w:p>
             <w:r>
@@ -1841,7 +1891,7 @@
         </w:tc>
         <w:tc>
           <w:tcPr>
-            <w:tcW w:type="dxa" w:w="1728"/>
+            <w:tcW w:type="dxa" w:w="1872"/>
           </w:tcPr>
           <w:p>
             <w:r>
@@ -1854,7 +1904,7 @@
         </w:tc>
         <w:tc>
           <w:tcPr>
-            <w:tcW w:type="dxa" w:w="1728"/>
+            <w:tcW w:type="dxa" w:w="1872"/>
           </w:tcPr>
           <w:p>
             <w:r>
@@ -1867,7 +1917,7 @@
         </w:tc>
         <w:tc>
           <w:tcPr>
-            <w:tcW w:type="dxa" w:w="1728"/>
+            <w:tcW w:type="dxa" w:w="1872"/>
           </w:tcPr>
           <w:p>
             <w:r>
@@ -1880,7 +1930,7 @@
         </w:tc>
         <w:tc>
           <w:tcPr>
-            <w:tcW w:type="dxa" w:w="1728"/>
+            <w:tcW w:type="dxa" w:w="1872"/>
           </w:tcPr>
           <w:p>
             <w:r>
@@ -1895,7 +1945,8 @@
       <w:tr>
         <w:tc>
           <w:tcPr>
-            <w:tcW w:type="dxa" w:w="1728"/>
+            <w:tcW w:type="dxa" w:w="1872"/>
+            <w:shd w:val="clear" w:color="auto" w:fill="F2EDE5"/>
           </w:tcPr>
           <w:p>
             <w:r>
@@ -1908,7 +1959,8 @@
         </w:tc>
         <w:tc>
           <w:tcPr>
-            <w:tcW w:type="dxa" w:w="1728"/>
+            <w:tcW w:type="dxa" w:w="1872"/>
+            <w:shd w:val="clear" w:color="auto" w:fill="F2EDE5"/>
           </w:tcPr>
           <w:p>
             <w:r>
@@ -1921,7 +1973,8 @@
         </w:tc>
         <w:tc>
           <w:tcPr>
-            <w:tcW w:type="dxa" w:w="1728"/>
+            <w:tcW w:type="dxa" w:w="1872"/>
+            <w:shd w:val="clear" w:color="auto" w:fill="F2EDE5"/>
           </w:tcPr>
           <w:p>
             <w:r>
@@ -1934,7 +1987,8 @@
         </w:tc>
         <w:tc>
           <w:tcPr>
-            <w:tcW w:type="dxa" w:w="1728"/>
+            <w:tcW w:type="dxa" w:w="1872"/>
+            <w:shd w:val="clear" w:color="auto" w:fill="F2EDE5"/>
           </w:tcPr>
           <w:p>
             <w:r>
@@ -1947,7 +2001,8 @@
         </w:tc>
         <w:tc>
           <w:tcPr>
-            <w:tcW w:type="dxa" w:w="1728"/>
+            <w:tcW w:type="dxa" w:w="1872"/>
+            <w:shd w:val="clear" w:color="auto" w:fill="F2EDE5"/>
           </w:tcPr>
           <w:p>
             <w:r>
@@ -1962,7 +2017,7 @@
       <w:tr>
         <w:tc>
           <w:tcPr>
-            <w:tcW w:type="dxa" w:w="1728"/>
+            <w:tcW w:type="dxa" w:w="1872"/>
           </w:tcPr>
           <w:p>
             <w:r>
@@ -1975,7 +2030,7 @@
         </w:tc>
         <w:tc>
           <w:tcPr>
-            <w:tcW w:type="dxa" w:w="1728"/>
+            <w:tcW w:type="dxa" w:w="1872"/>
           </w:tcPr>
           <w:p>
             <w:r>
@@ -1988,7 +2043,7 @@
         </w:tc>
         <w:tc>
           <w:tcPr>
-            <w:tcW w:type="dxa" w:w="1728"/>
+            <w:tcW w:type="dxa" w:w="1872"/>
           </w:tcPr>
           <w:p>
             <w:r>
@@ -2001,7 +2056,7 @@
         </w:tc>
         <w:tc>
           <w:tcPr>
-            <w:tcW w:type="dxa" w:w="1728"/>
+            <w:tcW w:type="dxa" w:w="1872"/>
           </w:tcPr>
           <w:p>
             <w:r>
@@ -2014,7 +2069,7 @@
         </w:tc>
         <w:tc>
           <w:tcPr>
-            <w:tcW w:type="dxa" w:w="1728"/>
+            <w:tcW w:type="dxa" w:w="1872"/>
           </w:tcPr>
           <w:p>
             <w:r>
@@ -2042,26 +2097,28 @@
     </w:p>
     <w:tbl>
       <w:tblPr>
-        <w:tblStyle w:val="LightGrid-Accent1"/>
+        <w:tblStyle w:val="TableGrid"/>
         <w:tblW w:type="auto" w:w="0"/>
         <w:tblLook w:firstColumn="1" w:firstRow="1" w:lastColumn="0" w:lastRow="0" w:noHBand="0" w:noVBand="1" w:val="04A0"/>
       </w:tblPr>
       <w:tblGrid>
-        <w:gridCol w:w="1728"/>
-        <w:gridCol w:w="1728"/>
-        <w:gridCol w:w="1728"/>
-        <w:gridCol w:w="1728"/>
-        <w:gridCol w:w="1728"/>
+        <w:gridCol w:w="1872"/>
+        <w:gridCol w:w="1872"/>
+        <w:gridCol w:w="1872"/>
+        <w:gridCol w:w="1872"/>
+        <w:gridCol w:w="1872"/>
       </w:tblGrid>
       <w:tr>
         <w:tc>
           <w:tcPr>
-            <w:tcW w:type="dxa" w:w="1728"/>
+            <w:tcW w:type="dxa" w:w="1872"/>
+            <w:shd w:val="clear" w:color="auto" w:fill="0B2545"/>
           </w:tcPr>
           <w:p>
             <w:r>
               <w:rPr>
                 <w:b/>
+                <w:color w:val="FFFFFF"/>
                 <w:sz w:val="20"/>
               </w:rPr>
               <w:t>Grant</w:t>
@@ -2070,12 +2127,14 @@
         </w:tc>
         <w:tc>
           <w:tcPr>
-            <w:tcW w:type="dxa" w:w="1728"/>
+            <w:tcW w:type="dxa" w:w="1872"/>
+            <w:shd w:val="clear" w:color="auto" w:fill="0B2545"/>
           </w:tcPr>
           <w:p>
             <w:r>
               <w:rPr>
                 <w:b/>
+                <w:color w:val="FFFFFF"/>
                 <w:sz w:val="20"/>
               </w:rPr>
               <w:t>Agency</w:t>
@@ -2084,12 +2143,14 @@
         </w:tc>
         <w:tc>
           <w:tcPr>
-            <w:tcW w:type="dxa" w:w="1728"/>
+            <w:tcW w:type="dxa" w:w="1872"/>
+            <w:shd w:val="clear" w:color="auto" w:fill="0B2545"/>
           </w:tcPr>
           <w:p>
             <w:r>
               <w:rPr>
                 <w:b/>
+                <w:color w:val="FFFFFF"/>
                 <w:sz w:val="20"/>
               </w:rPr>
               <w:t>Level</w:t>
@@ -2098,12 +2159,14 @@
         </w:tc>
         <w:tc>
           <w:tcPr>
-            <w:tcW w:type="dxa" w:w="1728"/>
+            <w:tcW w:type="dxa" w:w="1872"/>
+            <w:shd w:val="clear" w:color="auto" w:fill="0B2545"/>
           </w:tcPr>
           <w:p>
             <w:r>
               <w:rPr>
                 <w:b/>
+                <w:color w:val="FFFFFF"/>
                 <w:sz w:val="20"/>
               </w:rPr>
               <w:t>Determination</w:t>
@@ -2112,12 +2175,14 @@
         </w:tc>
         <w:tc>
           <w:tcPr>
-            <w:tcW w:type="dxa" w:w="1728"/>
+            <w:tcW w:type="dxa" w:w="1872"/>
+            <w:shd w:val="clear" w:color="auto" w:fill="0B2545"/>
           </w:tcPr>
           <w:p>
             <w:r>
               <w:rPr>
                 <w:b/>
+                <w:color w:val="FFFFFF"/>
                 <w:sz w:val="20"/>
               </w:rPr>
               <w:t>Evidence</w:t>
@@ -2128,7 +2193,7 @@
       <w:tr>
         <w:tc>
           <w:tcPr>
-            <w:tcW w:type="dxa" w:w="1728"/>
+            <w:tcW w:type="dxa" w:w="1872"/>
           </w:tcPr>
           <w:p>
             <w:r>
@@ -2141,7 +2206,7 @@
         </w:tc>
         <w:tc>
           <w:tcPr>
-            <w:tcW w:type="dxa" w:w="1728"/>
+            <w:tcW w:type="dxa" w:w="1872"/>
           </w:tcPr>
           <w:p>
             <w:r>
@@ -2154,7 +2219,7 @@
         </w:tc>
         <w:tc>
           <w:tcPr>
-            <w:tcW w:type="dxa" w:w="1728"/>
+            <w:tcW w:type="dxa" w:w="1872"/>
           </w:tcPr>
           <w:p>
             <w:r>
@@ -2167,7 +2232,7 @@
         </w:tc>
         <w:tc>
           <w:tcPr>
-            <w:tcW w:type="dxa" w:w="1728"/>
+            <w:tcW w:type="dxa" w:w="1872"/>
           </w:tcPr>
           <w:p>
             <w:r>
@@ -2180,7 +2245,7 @@
         </w:tc>
         <w:tc>
           <w:tcPr>
-            <w:tcW w:type="dxa" w:w="1728"/>
+            <w:tcW w:type="dxa" w:w="1872"/>
           </w:tcPr>
           <w:p>
             <w:r>
@@ -2195,7 +2260,8 @@
       <w:tr>
         <w:tc>
           <w:tcPr>
-            <w:tcW w:type="dxa" w:w="1728"/>
+            <w:tcW w:type="dxa" w:w="1872"/>
+            <w:shd w:val="clear" w:color="auto" w:fill="F2EDE5"/>
           </w:tcPr>
           <w:p>
             <w:r>
@@ -2208,7 +2274,8 @@
         </w:tc>
         <w:tc>
           <w:tcPr>
-            <w:tcW w:type="dxa" w:w="1728"/>
+            <w:tcW w:type="dxa" w:w="1872"/>
+            <w:shd w:val="clear" w:color="auto" w:fill="F2EDE5"/>
           </w:tcPr>
           <w:p>
             <w:r>
@@ -2221,7 +2288,8 @@
         </w:tc>
         <w:tc>
           <w:tcPr>
-            <w:tcW w:type="dxa" w:w="1728"/>
+            <w:tcW w:type="dxa" w:w="1872"/>
+            <w:shd w:val="clear" w:color="auto" w:fill="F2EDE5"/>
           </w:tcPr>
           <w:p>
             <w:r>
@@ -2234,7 +2302,8 @@
         </w:tc>
         <w:tc>
           <w:tcPr>
-            <w:tcW w:type="dxa" w:w="1728"/>
+            <w:tcW w:type="dxa" w:w="1872"/>
+            <w:shd w:val="clear" w:color="auto" w:fill="F2EDE5"/>
           </w:tcPr>
           <w:p>
             <w:r>
@@ -2247,7 +2316,8 @@
         </w:tc>
         <w:tc>
           <w:tcPr>
-            <w:tcW w:type="dxa" w:w="1728"/>
+            <w:tcW w:type="dxa" w:w="1872"/>
+            <w:shd w:val="clear" w:color="auto" w:fill="F2EDE5"/>
           </w:tcPr>
           <w:p>
             <w:r>
@@ -2262,7 +2332,7 @@
       <w:tr>
         <w:tc>
           <w:tcPr>
-            <w:tcW w:type="dxa" w:w="1728"/>
+            <w:tcW w:type="dxa" w:w="1872"/>
           </w:tcPr>
           <w:p>
             <w:r>
@@ -2275,7 +2345,7 @@
         </w:tc>
         <w:tc>
           <w:tcPr>
-            <w:tcW w:type="dxa" w:w="1728"/>
+            <w:tcW w:type="dxa" w:w="1872"/>
           </w:tcPr>
           <w:p>
             <w:r>
@@ -2288,7 +2358,7 @@
         </w:tc>
         <w:tc>
           <w:tcPr>
-            <w:tcW w:type="dxa" w:w="1728"/>
+            <w:tcW w:type="dxa" w:w="1872"/>
           </w:tcPr>
           <w:p>
             <w:r>
@@ -2301,7 +2371,7 @@
         </w:tc>
         <w:tc>
           <w:tcPr>
-            <w:tcW w:type="dxa" w:w="1728"/>
+            <w:tcW w:type="dxa" w:w="1872"/>
           </w:tcPr>
           <w:p>
             <w:r>
@@ -2314,7 +2384,7 @@
         </w:tc>
         <w:tc>
           <w:tcPr>
-            <w:tcW w:type="dxa" w:w="1728"/>
+            <w:tcW w:type="dxa" w:w="1872"/>
           </w:tcPr>
           <w:p>
             <w:r>
@@ -2329,7 +2399,8 @@
       <w:tr>
         <w:tc>
           <w:tcPr>
-            <w:tcW w:type="dxa" w:w="1728"/>
+            <w:tcW w:type="dxa" w:w="1872"/>
+            <w:shd w:val="clear" w:color="auto" w:fill="F2EDE5"/>
           </w:tcPr>
           <w:p>
             <w:r>
@@ -2342,7 +2413,8 @@
         </w:tc>
         <w:tc>
           <w:tcPr>
-            <w:tcW w:type="dxa" w:w="1728"/>
+            <w:tcW w:type="dxa" w:w="1872"/>
+            <w:shd w:val="clear" w:color="auto" w:fill="F2EDE5"/>
           </w:tcPr>
           <w:p>
             <w:r>
@@ -2355,7 +2427,8 @@
         </w:tc>
         <w:tc>
           <w:tcPr>
-            <w:tcW w:type="dxa" w:w="1728"/>
+            <w:tcW w:type="dxa" w:w="1872"/>
+            <w:shd w:val="clear" w:color="auto" w:fill="F2EDE5"/>
           </w:tcPr>
           <w:p>
             <w:r>
@@ -2368,7 +2441,8 @@
         </w:tc>
         <w:tc>
           <w:tcPr>
-            <w:tcW w:type="dxa" w:w="1728"/>
+            <w:tcW w:type="dxa" w:w="1872"/>
+            <w:shd w:val="clear" w:color="auto" w:fill="F2EDE5"/>
           </w:tcPr>
           <w:p>
             <w:r>
@@ -2381,7 +2455,8 @@
         </w:tc>
         <w:tc>
           <w:tcPr>
-            <w:tcW w:type="dxa" w:w="1728"/>
+            <w:tcW w:type="dxa" w:w="1872"/>
+            <w:shd w:val="clear" w:color="auto" w:fill="F2EDE5"/>
           </w:tcPr>
           <w:p>
             <w:r>
@@ -2657,24 +2732,26 @@
     </w:p>
     <w:tbl>
       <w:tblPr>
-        <w:tblStyle w:val="LightGrid-Accent1"/>
+        <w:tblStyle w:val="TableGrid"/>
         <w:tblW w:type="auto" w:w="0"/>
         <w:tblLook w:firstColumn="1" w:firstRow="1" w:lastColumn="0" w:lastRow="0" w:noHBand="0" w:noVBand="1" w:val="04A0"/>
       </w:tblPr>
       <w:tblGrid>
-        <w:gridCol w:w="2880"/>
-        <w:gridCol w:w="2880"/>
-        <w:gridCol w:w="2880"/>
+        <w:gridCol w:w="3120"/>
+        <w:gridCol w:w="3120"/>
+        <w:gridCol w:w="3120"/>
       </w:tblGrid>
       <w:tr>
         <w:tc>
           <w:tcPr>
-            <w:tcW w:type="dxa" w:w="2880"/>
+            <w:tcW w:type="dxa" w:w="3120"/>
+            <w:shd w:val="clear" w:color="auto" w:fill="0B2545"/>
           </w:tcPr>
           <w:p>
             <w:r>
               <w:rPr>
                 <w:b/>
+                <w:color w:val="FFFFFF"/>
                 <w:sz w:val="20"/>
               </w:rPr>
               <w:t>☐</w:t>
@@ -2683,12 +2760,14 @@
         </w:tc>
         <w:tc>
           <w:tcPr>
-            <w:tcW w:type="dxa" w:w="2880"/>
+            <w:tcW w:type="dxa" w:w="3120"/>
+            <w:shd w:val="clear" w:color="auto" w:fill="0B2545"/>
           </w:tcPr>
           <w:p>
             <w:r>
               <w:rPr>
                 <w:b/>
+                <w:color w:val="FFFFFF"/>
                 <w:sz w:val="20"/>
               </w:rPr>
               <w:t>Classification Step</w:t>
@@ -2697,12 +2776,14 @@
         </w:tc>
         <w:tc>
           <w:tcPr>
-            <w:tcW w:type="dxa" w:w="2880"/>
+            <w:tcW w:type="dxa" w:w="3120"/>
+            <w:shd w:val="clear" w:color="auto" w:fill="0B2545"/>
           </w:tcPr>
           <w:p>
             <w:r>
               <w:rPr>
                 <w:b/>
+                <w:color w:val="FFFFFF"/>
                 <w:sz w:val="20"/>
               </w:rPr>
               <w:t>Notes / Evidence Filed</w:t>
@@ -2713,7 +2794,7 @@
       <w:tr>
         <w:tc>
           <w:tcPr>
-            <w:tcW w:type="dxa" w:w="2880"/>
+            <w:tcW w:type="dxa" w:w="3120"/>
           </w:tcPr>
           <w:p>
             <w:r>
@@ -2726,7 +2807,7 @@
         </w:tc>
         <w:tc>
           <w:tcPr>
-            <w:tcW w:type="dxa" w:w="2880"/>
+            <w:tcW w:type="dxa" w:w="3120"/>
           </w:tcPr>
           <w:p>
             <w:r>
@@ -2739,7 +2820,7 @@
         </w:tc>
         <w:tc>
           <w:tcPr>
-            <w:tcW w:type="dxa" w:w="2880"/>
+            <w:tcW w:type="dxa" w:w="3120"/>
           </w:tcPr>
           <w:p>
             <w:r>
@@ -2753,7 +2834,8 @@
       <w:tr>
         <w:tc>
           <w:tcPr>
-            <w:tcW w:type="dxa" w:w="2880"/>
+            <w:tcW w:type="dxa" w:w="3120"/>
+            <w:shd w:val="clear" w:color="auto" w:fill="F2EDE5"/>
           </w:tcPr>
           <w:p>
             <w:r>
@@ -2766,7 +2848,8 @@
         </w:tc>
         <w:tc>
           <w:tcPr>
-            <w:tcW w:type="dxa" w:w="2880"/>
+            <w:tcW w:type="dxa" w:w="3120"/>
+            <w:shd w:val="clear" w:color="auto" w:fill="F2EDE5"/>
           </w:tcPr>
           <w:p>
             <w:r>
@@ -2779,7 +2862,8 @@
         </w:tc>
         <w:tc>
           <w:tcPr>
-            <w:tcW w:type="dxa" w:w="2880"/>
+            <w:tcW w:type="dxa" w:w="3120"/>
+            <w:shd w:val="clear" w:color="auto" w:fill="F2EDE5"/>
           </w:tcPr>
           <w:p>
             <w:r>
@@ -2793,7 +2877,7 @@
       <w:tr>
         <w:tc>
           <w:tcPr>
-            <w:tcW w:type="dxa" w:w="2880"/>
+            <w:tcW w:type="dxa" w:w="3120"/>
           </w:tcPr>
           <w:p>
             <w:r>
@@ -2806,7 +2890,7 @@
         </w:tc>
         <w:tc>
           <w:tcPr>
-            <w:tcW w:type="dxa" w:w="2880"/>
+            <w:tcW w:type="dxa" w:w="3120"/>
           </w:tcPr>
           <w:p>
             <w:r>
@@ -2819,7 +2903,7 @@
         </w:tc>
         <w:tc>
           <w:tcPr>
-            <w:tcW w:type="dxa" w:w="2880"/>
+            <w:tcW w:type="dxa" w:w="3120"/>
           </w:tcPr>
           <w:p>
             <w:r>
@@ -2833,7 +2917,8 @@
       <w:tr>
         <w:tc>
           <w:tcPr>
-            <w:tcW w:type="dxa" w:w="2880"/>
+            <w:tcW w:type="dxa" w:w="3120"/>
+            <w:shd w:val="clear" w:color="auto" w:fill="F2EDE5"/>
           </w:tcPr>
           <w:p>
             <w:r>
@@ -2846,7 +2931,8 @@
         </w:tc>
         <w:tc>
           <w:tcPr>
-            <w:tcW w:type="dxa" w:w="2880"/>
+            <w:tcW w:type="dxa" w:w="3120"/>
+            <w:shd w:val="clear" w:color="auto" w:fill="F2EDE5"/>
           </w:tcPr>
           <w:p>
             <w:r>
@@ -2859,7 +2945,8 @@
         </w:tc>
         <w:tc>
           <w:tcPr>
-            <w:tcW w:type="dxa" w:w="2880"/>
+            <w:tcW w:type="dxa" w:w="3120"/>
+            <w:shd w:val="clear" w:color="auto" w:fill="F2EDE5"/>
           </w:tcPr>
           <w:p>
             <w:r>
@@ -2873,7 +2960,7 @@
       <w:tr>
         <w:tc>
           <w:tcPr>
-            <w:tcW w:type="dxa" w:w="2880"/>
+            <w:tcW w:type="dxa" w:w="3120"/>
           </w:tcPr>
           <w:p>
             <w:r>
@@ -2886,7 +2973,7 @@
         </w:tc>
         <w:tc>
           <w:tcPr>
-            <w:tcW w:type="dxa" w:w="2880"/>
+            <w:tcW w:type="dxa" w:w="3120"/>
           </w:tcPr>
           <w:p>
             <w:r>
@@ -2899,7 +2986,7 @@
         </w:tc>
         <w:tc>
           <w:tcPr>
-            <w:tcW w:type="dxa" w:w="2880"/>
+            <w:tcW w:type="dxa" w:w="3120"/>
           </w:tcPr>
           <w:p>
             <w:r>
@@ -2913,7 +3000,8 @@
       <w:tr>
         <w:tc>
           <w:tcPr>
-            <w:tcW w:type="dxa" w:w="2880"/>
+            <w:tcW w:type="dxa" w:w="3120"/>
+            <w:shd w:val="clear" w:color="auto" w:fill="F2EDE5"/>
           </w:tcPr>
           <w:p>
             <w:r>
@@ -2926,7 +3014,8 @@
         </w:tc>
         <w:tc>
           <w:tcPr>
-            <w:tcW w:type="dxa" w:w="2880"/>
+            <w:tcW w:type="dxa" w:w="3120"/>
+            <w:shd w:val="clear" w:color="auto" w:fill="F2EDE5"/>
           </w:tcPr>
           <w:p>
             <w:r>
@@ -2939,7 +3028,8 @@
         </w:tc>
         <w:tc>
           <w:tcPr>
-            <w:tcW w:type="dxa" w:w="2880"/>
+            <w:tcW w:type="dxa" w:w="3120"/>
+            <w:shd w:val="clear" w:color="auto" w:fill="F2EDE5"/>
           </w:tcPr>
           <w:p>
             <w:r>
@@ -2953,13 +3043,73 @@
     </w:tbl>
     <w:p/>
     <w:sectPr>
+      <w:headerReference w:type="default" r:id="rId9"/>
+      <w:footerReference w:type="default" r:id="rId10"/>
       <w:pgSz w:w="12240" w:h="15840"/>
-      <w:pgMar w:top="1440" w:right="1800" w:bottom="1440" w:left="1800" w:header="720" w:footer="720" w:gutter="0"/>
+      <w:pgMar w:top="1440" w:right="1440" w:bottom="1440" w:left="1440" w:header="720" w:footer="720" w:gutter="0"/>
       <w:cols w:space="720"/>
       <w:docGrid w:linePitch="360"/>
     </w:sectPr>
   </w:body>
 </w:document>
+</file>
+
+<file path=word/footer1.xml><?xml version="1.0" encoding="utf-8"?>
+<w:ftr xmlns:m="http://schemas.openxmlformats.org/officeDocument/2006/math" xmlns:mc="http://schemas.openxmlformats.org/markup-compatibility/2006" xmlns:mo="http://schemas.microsoft.com/office/mac/office/2008/main" xmlns:mv="urn:schemas-microsoft-com:mac:vml" xmlns:o="urn:schemas-microsoft-com:office:office" xmlns:r="http://schemas.openxmlformats.org/officeDocument/2006/relationships" xmlns:v="urn:schemas-microsoft-com:vml" xmlns:w10="urn:schemas-microsoft-com:office:word" xmlns:w14="http://schemas.microsoft.com/office/word/2010/wordml" xmlns:w="http://schemas.openxmlformats.org/wordprocessingml/2006/main" xmlns:wne="http://schemas.microsoft.com/office/word/2006/wordml" xmlns:wp14="http://schemas.microsoft.com/office/word/2010/wordprocessingDrawing" xmlns:wp="http://schemas.openxmlformats.org/drawingml/2006/wordprocessingDrawing" xmlns:wpc="http://schemas.microsoft.com/office/word/2010/wordprocessingCanvas" xmlns:wpg="http://schemas.microsoft.com/office/word/2010/wordprocessingGroup" xmlns:wpi="http://schemas.microsoft.com/office/word/2010/wordprocessingInk" xmlns:wps="http://schemas.microsoft.com/office/word/2010/wordprocessingShape" mc:Ignorable="w14 wp14">
+  <w:p>
+    <w:pPr>
+      <w:pStyle w:val="Footer"/>
+      <w:jc w:val="center"/>
+    </w:pPr>
+    <w:r>
+      <w:rPr>
+        <w:color w:val="5A6169"/>
+        <w:sz w:val="16"/>
+      </w:rPr>
+      <w:t xml:space="preserve">R&amp;D Classification Framework   ·   Page </w:t>
+    </w:r>
+    <w:r>
+      <w:fldChar w:fldCharType="begin"/>
+      <w:instrText xml:space="preserve">PAGE</w:instrText>
+      <w:fldChar w:fldCharType="separate"/>
+      <w:t>1</w:t>
+      <w:fldChar w:fldCharType="end"/>
+    </w:r>
+    <w:r>
+      <w:rPr>
+        <w:color w:val="5A6169"/>
+        <w:sz w:val="16"/>
+      </w:rPr>
+      <w:t xml:space="preserve"> of </w:t>
+    </w:r>
+    <w:r>
+      <w:fldChar w:fldCharType="begin"/>
+      <w:instrText xml:space="preserve">NUMPAGES</w:instrText>
+      <w:fldChar w:fldCharType="separate"/>
+      <w:t>1</w:t>
+      <w:fldChar w:fldCharType="end"/>
+    </w:r>
+  </w:p>
+</w:ftr>
+</file>
+
+<file path=word/header1.xml><?xml version="1.0" encoding="utf-8"?>
+<w:hdr xmlns:m="http://schemas.openxmlformats.org/officeDocument/2006/math" xmlns:mc="http://schemas.openxmlformats.org/markup-compatibility/2006" xmlns:mo="http://schemas.microsoft.com/office/mac/office/2008/main" xmlns:mv="urn:schemas-microsoft-com:mac:vml" xmlns:o="urn:schemas-microsoft-com:office:office" xmlns:r="http://schemas.openxmlformats.org/officeDocument/2006/relationships" xmlns:v="urn:schemas-microsoft-com:vml" xmlns:w10="urn:schemas-microsoft-com:office:word" xmlns:w14="http://schemas.microsoft.com/office/word/2010/wordml" xmlns:w="http://schemas.openxmlformats.org/wordprocessingml/2006/main" xmlns:wne="http://schemas.microsoft.com/office/word/2006/wordml" xmlns:wp14="http://schemas.microsoft.com/office/word/2010/wordprocessingDrawing" xmlns:wp="http://schemas.openxmlformats.org/drawingml/2006/wordprocessingDrawing" xmlns:wpc="http://schemas.microsoft.com/office/word/2010/wordprocessingCanvas" xmlns:wpg="http://schemas.microsoft.com/office/word/2010/wordprocessingGroup" xmlns:wpi="http://schemas.microsoft.com/office/word/2010/wordprocessingInk" xmlns:wps="http://schemas.microsoft.com/office/word/2010/wordprocessingShape" mc:Ignorable="w14 wp14">
+  <w:p>
+    <w:pPr>
+      <w:pStyle w:val="Header"/>
+      <w:jc w:val="center"/>
+    </w:pPr>
+    <w:r>
+      <w:rPr>
+        <w:b/>
+        <w:color w:val="5A6169"/>
+        <w:sz w:val="16"/>
+      </w:rPr>
+      <w:t>MORGAN STATE UNIVERSITY  ·  OFFICE OF RESEARCH ADMINISTRATION</w:t>
+    </w:r>
+  </w:p>
+</w:hdr>
 </file>
 
 <file path=word/numbering.xml><?xml version="1.0" encoding="utf-8"?>

</xml_diff>

<commit_message>
Restyle docx to actually match the real PI Handbook Part 5: left-aligned policy-blue title, ALL CAPS headings in that same blue, plain black body/tables, orange used only on the cover block, 3-part footer, and a to-top-of-document link, based on the actual PDF fetched from morgan.edu
</commit_message>
<xml_diff>
--- a/assets/RD-Classification-Framework.docx
+++ b/assets/RD-Classification-Framework.docx
@@ -3,105 +3,131 @@
 <w:document xmlns:wpc="http://schemas.microsoft.com/office/word/2010/wordprocessingCanvas" xmlns:mo="http://schemas.microsoft.com/office/mac/office/2008/main" xmlns:mc="http://schemas.openxmlformats.org/markup-compatibility/2006" xmlns:mv="urn:schemas-microsoft-com:mac:vml" xmlns:o="urn:schemas-microsoft-com:office:office" xmlns:r="http://schemas.openxmlformats.org/officeDocument/2006/relationships" xmlns:m="http://schemas.openxmlformats.org/officeDocument/2006/math" xmlns:v="urn:schemas-microsoft-com:vml" xmlns:wp14="http://schemas.microsoft.com/office/word/2010/wordprocessingDrawing" xmlns:wp="http://schemas.openxmlformats.org/drawingml/2006/wordprocessingDrawing" xmlns:w10="urn:schemas-microsoft-com:office:word" xmlns:w="http://schemas.openxmlformats.org/wordprocessingml/2006/main" xmlns:w14="http://schemas.microsoft.com/office/word/2010/wordml" xmlns:wpg="http://schemas.microsoft.com/office/word/2010/wordprocessingGroup" xmlns:wpi="http://schemas.microsoft.com/office/word/2010/wordprocessingInk" xmlns:wne="http://schemas.microsoft.com/office/word/2006/wordml" xmlns:wps="http://schemas.microsoft.com/office/word/2010/wordprocessingShape" mc:Ignorable="w14 wp14">
   <w:body>
     <w:p>
-      <w:pPr>
-        <w:spacing w:after="80"/>
-        <w:jc w:val="center"/>
-      </w:pPr>
+      <w:bookmarkStart w:id="0" w:name="top"/>
+      <w:bookmarkEnd w:id="0"/>
+    </w:p>
+    <w:p>
+      <w:pPr>
+        <w:jc w:val="left"/>
+        <w:pBdr>
+          <w:bottom w:val="single" w:sz="6" w:space="8" w:color="BFBFBF"/>
+        </w:pBdr>
+      </w:pPr>
+      <w:r>
+        <w:rPr>
+          <w:b w:val="0"/>
+          <w:color w:val="2F5496"/>
+          <w:sz w:val="52"/>
+        </w:rPr>
+        <w:t>Morgan State University</w:t>
+        <w:br/>
+      </w:r>
+      <w:r>
+        <w:rPr>
+          <w:b w:val="0"/>
+          <w:color w:val="2F5496"/>
+          <w:sz w:val="52"/>
+        </w:rPr>
+        <w:t>R&amp;D Evidence Classification Framework</w:t>
+        <w:br/>
+      </w:r>
+      <w:r>
+        <w:rPr>
+          <w:b w:val="0"/>
+          <w:color w:val="2F5496"/>
+          <w:sz w:val="52"/>
+        </w:rPr>
+        <w:t>A Practical Framework for HERD Survey Classification</w:t>
+        <w:br/>
+      </w:r>
+    </w:p>
+    <w:p>
       <w:r>
         <w:rPr>
           <w:b/>
-          <w:color w:val="0B2545"/>
-          <w:sz w:val="28"/>
+          <w:color w:val="2F5496"/>
+          <w:sz w:val="22"/>
         </w:rPr>
-        <w:t>MORGAN STATE UNIVERSITY</w:t>
-      </w:r>
-    </w:p>
-    <w:p>
-      <w:pPr>
-        <w:spacing w:after="80"/>
-        <w:jc w:val="center"/>
-      </w:pPr>
-      <w:r>
-        <w:rPr>
-          <w:b w:val="0"/>
-          <w:color w:val="5A6169"/>
-          <w:sz w:val="24"/>
-        </w:rPr>
-        <w:t>Office of Research Administration</w:t>
+        <w:t>PREPARED: AUGUST 2026</w:t>
       </w:r>
     </w:p>
     <w:p/>
-    <w:p>
-      <w:pPr>
-        <w:spacing w:after="80"/>
-        <w:jc w:val="center"/>
-      </w:pPr>
-      <w:r>
-        <w:rPr>
-          <w:b/>
-          <w:color w:val="0B2545"/>
-          <w:sz w:val="40"/>
-        </w:rPr>
-        <w:t>Determining Research &amp; Development (R&amp;D) Activity in Sponsored Awards</w:t>
-      </w:r>
-    </w:p>
-    <w:p>
-      <w:pPr>
-        <w:spacing w:after="80"/>
-        <w:jc w:val="center"/>
-      </w:pPr>
-      <w:r>
-        <w:rPr>
-          <w:b w:val="0"/>
-          <w:color w:val="B5601E"/>
-          <w:sz w:val="28"/>
-        </w:rPr>
-        <w:t>A Practical Framework for HERD Survey Classification</w:t>
-      </w:r>
-    </w:p>
-    <w:p>
-      <w:pPr>
-        <w:spacing w:after="80"/>
-        <w:jc w:val="center"/>
-      </w:pPr>
-      <w:r>
-        <w:rPr>
-          <w:b w:val="0"/>
-          <w:color w:val="5A6169"/>
-          <w:sz w:val="22"/>
-        </w:rPr>
-        <w:t>An Institutional Best Practices Guide</w:t>
-      </w:r>
-    </w:p>
     <w:p/>
-    <w:p>
-      <w:pPr>
-        <w:spacing w:after="80"/>
-        <w:jc w:val="center"/>
-      </w:pPr>
-      <w:r>
-        <w:rPr>
-          <w:b w:val="0"/>
-          <w:color w:val="5A6169"/>
-          <w:sz w:val="21"/>
-        </w:rPr>
-        <w:t>Prepared by: Ayomide Ajibola, MBA — Office of Research Administration</w:t>
-      </w:r>
-    </w:p>
-    <w:p>
-      <w:pPr>
-        <w:spacing w:after="80"/>
-        <w:jc w:val="center"/>
-      </w:pPr>
-      <w:r>
-        <w:rPr>
-          <w:b w:val="0"/>
-          <w:color w:val="5A6169"/>
-          <w:sz w:val="21"/>
-        </w:rPr>
-        <w:t>Reviewed by: Rebecca Steiner, Office of Research Administration</w:t>
-      </w:r>
-    </w:p>
+    <w:p/>
+    <w:p/>
+    <w:p/>
+    <w:p/>
+    <w:tbl>
+      <w:tblPr>
+        <w:tblW w:type="auto" w:w="0"/>
+        <w:tblLook w:firstColumn="1" w:firstRow="1" w:lastColumn="0" w:lastRow="0" w:noHBand="0" w:noVBand="1" w:val="04A0"/>
+      </w:tblPr>
+      <w:tblGrid>
+        <w:gridCol w:w="9360"/>
+      </w:tblGrid>
+      <w:tr>
+        <w:trPr>
+          <w:trHeight w:val="144" w:hRule="exact"/>
+        </w:trPr>
+        <w:tc>
+          <w:tcPr>
+            <w:tcW w:type="dxa" w:w="9360"/>
+            <w:shd w:val="clear" w:color="auto" w:fill="2F5496"/>
+          </w:tcPr>
+          <w:p/>
+        </w:tc>
+      </w:tr>
+    </w:tbl>
+    <w:p/>
+    <w:tbl>
+      <w:tblPr>
+        <w:tblW w:type="auto" w:w="0"/>
+        <w:tblLook w:firstColumn="1" w:firstRow="1" w:lastColumn="0" w:lastRow="0" w:noHBand="0" w:noVBand="1" w:val="04A0"/>
+      </w:tblPr>
+      <w:tblGrid>
+        <w:gridCol w:w="9360"/>
+      </w:tblGrid>
+      <w:tr>
+        <w:trPr>
+          <w:trHeight w:val="1872"/>
+        </w:trPr>
+        <w:tc>
+          <w:tcPr>
+            <w:tcW w:type="dxa" w:w="9360"/>
+            <w:shd w:val="clear" w:color="auto" w:fill="E97A2C"/>
+            <w:vAlign w:val="center"/>
+          </w:tcPr>
+          <w:p>
+            <w:r>
+              <w:rPr>
+                <w:b/>
+                <w:color w:val="FFFFFF"/>
+                <w:sz w:val="26"/>
+              </w:rPr>
+              <w:t>OFFICE OF RESEARCH ADMINISTRATION  |  morgan.edu/ora</w:t>
+            </w:r>
+          </w:p>
+          <w:p>
+            <w:r>
+              <w:rPr>
+                <w:color w:val="FFFFFF"/>
+                <w:sz w:val="20"/>
+              </w:rPr>
+              <w:t>PREPARED BY AYOMIDE AJIBOLA, MBA  |  MORGAN STATE UNIVERSITY</w:t>
+            </w:r>
+          </w:p>
+          <w:p>
+            <w:r>
+              <w:rPr>
+                <w:color w:val="FFFFFF"/>
+                <w:sz w:val="20"/>
+              </w:rPr>
+              <w:t>REVIEWED BY REBECCA STEINER  |  OFFICE OF RESEARCH ADMINISTRATION</w:t>
+            </w:r>
+          </w:p>
+        </w:tc>
+      </w:tr>
+    </w:tbl>
     <w:p>
       <w:r>
         <w:br w:type="page"/>
@@ -110,8 +136,8 @@
     <w:p>
       <w:r>
         <w:rPr>
-          <w:b/>
-          <w:color w:val="0B2545"/>
+          <w:b w:val="0"/>
+          <w:color w:val="2F5496"/>
           <w:sz w:val="32"/>
         </w:rPr>
         <w:t>Table of Contents</w:t>
@@ -141,10 +167,11 @@
       </w:pPr>
       <w:r>
         <w:rPr>
-          <w:color w:val="0B2545"/>
+          <w:b w:val="0"/>
+          <w:color w:val="2F5496"/>
           <w:sz w:val="32"/>
         </w:rPr>
-        <w:t>Executive Summary</w:t>
+        <w:t>EXECUTIVE SUMMARY</w:t>
       </w:r>
     </w:p>
     <w:p>
@@ -218,10 +245,11 @@
       </w:pPr>
       <w:r>
         <w:rPr>
-          <w:color w:val="0B2545"/>
+          <w:b w:val="0"/>
+          <w:color w:val="2F5496"/>
           <w:sz w:val="32"/>
         </w:rPr>
-        <w:t>1. Introduction</w:t>
+        <w:t>1. INTRODUCTION</w:t>
       </w:r>
     </w:p>
     <w:p>
@@ -230,7 +258,8 @@
       </w:pPr>
       <w:r>
         <w:rPr>
-          <w:color w:val="B5601E"/>
+          <w:b w:val="0"/>
+          <w:color w:val="2F5496"/>
           <w:sz w:val="26"/>
         </w:rPr>
         <w:t>1.1 Background and Context</w:t>
@@ -294,7 +323,8 @@
       </w:pPr>
       <w:r>
         <w:rPr>
-          <w:color w:val="B5601E"/>
+          <w:b w:val="0"/>
+          <w:color w:val="2F5496"/>
           <w:sz w:val="26"/>
         </w:rPr>
         <w:t>1.2 Purpose</w:t>
@@ -319,10 +349,11 @@
       </w:pPr>
       <w:r>
         <w:rPr>
-          <w:color w:val="0B2545"/>
+          <w:b w:val="0"/>
+          <w:color w:val="2F5496"/>
           <w:sz w:val="32"/>
         </w:rPr>
-        <w:t>2. Defining R&amp;D: The Regulatory Foundation</w:t>
+        <w:t>2. DEFINING R&amp;D: THE REGULATORY FOUNDATION</w:t>
       </w:r>
     </w:p>
     <w:p>
@@ -331,7 +362,8 @@
       </w:pPr>
       <w:r>
         <w:rPr>
-          <w:color w:val="B5601E"/>
+          <w:b w:val="0"/>
+          <w:color w:val="2F5496"/>
           <w:sz w:val="26"/>
         </w:rPr>
         <w:t>2.1 The NSF HERD Survey Definition</w:t>
@@ -419,7 +451,8 @@
       </w:pPr>
       <w:r>
         <w:rPr>
-          <w:color w:val="B5601E"/>
+          <w:b w:val="0"/>
+          <w:color w:val="2F5496"/>
           <w:sz w:val="26"/>
         </w:rPr>
         <w:t>2.2 What Is NOT R&amp;D</w:t>
@@ -457,7 +490,8 @@
       </w:pPr>
       <w:r>
         <w:rPr>
-          <w:color w:val="B5601E"/>
+          <w:b w:val="0"/>
+          <w:color w:val="2F5496"/>
           <w:sz w:val="26"/>
         </w:rPr>
         <w:t>2.3 The Morgan State University Institutional Definition</w:t>
@@ -508,10 +542,11 @@
       </w:pPr>
       <w:r>
         <w:rPr>
-          <w:color w:val="0B2545"/>
+          <w:b w:val="0"/>
+          <w:color w:val="2F5496"/>
           <w:sz w:val="32"/>
         </w:rPr>
-        <w:t>3. Why R&amp;D Classification Matters</w:t>
+        <w:t>3. WHY R&amp;D CLASSIFICATION MATTERS</w:t>
       </w:r>
     </w:p>
     <w:p>
@@ -520,7 +555,8 @@
       </w:pPr>
       <w:r>
         <w:rPr>
-          <w:color w:val="B5601E"/>
+          <w:b w:val="0"/>
+          <w:color w:val="2F5496"/>
           <w:sz w:val="26"/>
         </w:rPr>
         <w:t>3.1 Institutional Metrics</w:t>
@@ -545,7 +581,9 @@
       </w:pPr>
       <w:r>
         <w:rPr>
-          <w:i/>
+          <w:b/>
+          <w:i w:val="0"/>
+          <w:color w:val="000000"/>
           <w:sz w:val="23"/>
         </w:rPr>
         <w:t>Federal Funding Eligibility and Allocations</w:t>
@@ -570,7 +608,9 @@
       </w:pPr>
       <w:r>
         <w:rPr>
-          <w:i/>
+          <w:b/>
+          <w:i w:val="0"/>
+          <w:color w:val="000000"/>
           <w:sz w:val="23"/>
         </w:rPr>
         <w:t>Institutional Rankings and Visibility</w:t>
@@ -595,7 +635,9 @@
       </w:pPr>
       <w:r>
         <w:rPr>
-          <w:i/>
+          <w:b/>
+          <w:i w:val="0"/>
+          <w:color w:val="000000"/>
           <w:sz w:val="23"/>
         </w:rPr>
         <w:t>Facilities and Administrative (F&amp;A) Cost Recovery</w:t>
@@ -620,7 +662,9 @@
       </w:pPr>
       <w:r>
         <w:rPr>
-          <w:i/>
+          <w:b/>
+          <w:i w:val="0"/>
+          <w:color w:val="000000"/>
           <w:sz w:val="23"/>
         </w:rPr>
         <w:t>Peer Benchmarking and Competitive Positioning</w:t>
@@ -645,7 +689,9 @@
       </w:pPr>
       <w:r>
         <w:rPr>
-          <w:i/>
+          <w:b/>
+          <w:i w:val="0"/>
+          <w:color w:val="000000"/>
           <w:sz w:val="23"/>
         </w:rPr>
         <w:t>Audit and Compliance Risk</w:t>
@@ -670,7 +716,8 @@
       </w:pPr>
       <w:r>
         <w:rPr>
-          <w:color w:val="B5601E"/>
+          <w:b w:val="0"/>
+          <w:color w:val="2F5496"/>
           <w:sz w:val="26"/>
         </w:rPr>
         <w:t>3.2 The HBCU and MSI Context</w:t>
@@ -695,10 +742,11 @@
       </w:pPr>
       <w:r>
         <w:rPr>
-          <w:color w:val="0B2545"/>
+          <w:b w:val="0"/>
+          <w:color w:val="2F5496"/>
           <w:sz w:val="32"/>
         </w:rPr>
-        <w:t>4. The Five-Level Classification Framework</w:t>
+        <w:t>4. THE FIVE-LEVEL CLASSIFICATION FRAMEWORK</w:t>
       </w:r>
     </w:p>
     <w:p>
@@ -707,7 +755,8 @@
       </w:pPr>
       <w:r>
         <w:rPr>
-          <w:color w:val="B5601E"/>
+          <w:b w:val="0"/>
+          <w:color w:val="2F5496"/>
           <w:sz w:val="26"/>
         </w:rPr>
         <w:t>4.1 Framework Overview</w:t>
@@ -767,13 +816,13 @@
         <w:tc>
           <w:tcPr>
             <w:tcW w:type="dxa" w:w="3120"/>
-            <w:shd w:val="clear" w:color="auto" w:fill="0B2545"/>
+            <w:shd w:val="clear" w:color="auto" w:fill="E7E6E6"/>
           </w:tcPr>
           <w:p>
             <w:r>
               <w:rPr>
                 <w:b/>
-                <w:color w:val="FFFFFF"/>
+                <w:color w:val="000000"/>
                 <w:sz w:val="20"/>
               </w:rPr>
               <w:t>Level</w:t>
@@ -783,13 +832,13 @@
         <w:tc>
           <w:tcPr>
             <w:tcW w:type="dxa" w:w="3120"/>
-            <w:shd w:val="clear" w:color="auto" w:fill="0B2545"/>
+            <w:shd w:val="clear" w:color="auto" w:fill="E7E6E6"/>
           </w:tcPr>
           <w:p>
             <w:r>
               <w:rPr>
                 <w:b/>
-                <w:color w:val="FFFFFF"/>
+                <w:color w:val="000000"/>
                 <w:sz w:val="20"/>
               </w:rPr>
               <w:t>Source</w:t>
@@ -799,13 +848,13 @@
         <w:tc>
           <w:tcPr>
             <w:tcW w:type="dxa" w:w="3120"/>
-            <w:shd w:val="clear" w:color="auto" w:fill="0B2545"/>
+            <w:shd w:val="clear" w:color="auto" w:fill="E7E6E6"/>
           </w:tcPr>
           <w:p>
             <w:r>
               <w:rPr>
                 <w:b/>
-                <w:color w:val="FFFFFF"/>
+                <w:color w:val="000000"/>
                 <w:sz w:val="20"/>
               </w:rPr>
               <w:t>When to Use</w:t>
@@ -821,6 +870,7 @@
           <w:p>
             <w:r>
               <w:rPr>
+                <w:color w:val="000000"/>
                 <w:sz w:val="20"/>
               </w:rPr>
               <w:t>L1 — Notice of Award (NOA)</w:t>
@@ -834,6 +884,7 @@
           <w:p>
             <w:r>
               <w:rPr>
+                <w:color w:val="000000"/>
                 <w:sz w:val="20"/>
               </w:rPr>
               <w:t>Award letter or electronic notice issued by the sponsor</w:t>
@@ -847,6 +898,7 @@
           <w:p>
             <w:r>
               <w:rPr>
+                <w:color w:val="000000"/>
                 <w:sz w:val="20"/>
               </w:rPr>
               <w:t>First step for every grant. If the NOA states a research purpose, stop here.</w:t>
@@ -858,11 +910,11 @@
         <w:tc>
           <w:tcPr>
             <w:tcW w:type="dxa" w:w="3120"/>
-            <w:shd w:val="clear" w:color="auto" w:fill="F2EDE5"/>
           </w:tcPr>
           <w:p>
             <w:r>
               <w:rPr>
+                <w:color w:val="000000"/>
                 <w:sz w:val="20"/>
               </w:rPr>
               <w:t>L2 — Funding Opportunity Announcement (FOA/RFA*)</w:t>
@@ -872,11 +924,11 @@
         <w:tc>
           <w:tcPr>
             <w:tcW w:type="dxa" w:w="3120"/>
-            <w:shd w:val="clear" w:color="auto" w:fill="F2EDE5"/>
           </w:tcPr>
           <w:p>
             <w:r>
               <w:rPr>
+                <w:color w:val="000000"/>
                 <w:sz w:val="20"/>
               </w:rPr>
               <w:t>NSF solicitation, NIH RFA*, DOE FOA, or equivalent</w:t>
@@ -886,11 +938,11 @@
         <w:tc>
           <w:tcPr>
             <w:tcW w:type="dxa" w:w="3120"/>
-            <w:shd w:val="clear" w:color="auto" w:fill="F2EDE5"/>
           </w:tcPr>
           <w:p>
             <w:r>
               <w:rPr>
+                <w:color w:val="000000"/>
                 <w:sz w:val="20"/>
               </w:rPr>
               <w:t>When the NOA does not explicitly describe research activity, check the funding announcement.</w:t>
@@ -906,6 +958,7 @@
           <w:p>
             <w:r>
               <w:rPr>
+                <w:color w:val="000000"/>
                 <w:sz w:val="20"/>
               </w:rPr>
               <w:t>L3 — ALN/CFDA Number</w:t>
@@ -919,6 +972,7 @@
           <w:p>
             <w:r>
               <w:rPr>
+                <w:color w:val="000000"/>
                 <w:sz w:val="20"/>
               </w:rPr>
               <w:t>Assistance Listings Number via SAM.gov</w:t>
@@ -932,6 +986,7 @@
           <w:p>
             <w:r>
               <w:rPr>
+                <w:color w:val="000000"/>
                 <w:sz w:val="20"/>
               </w:rPr>
               <w:t>When the FOA is unavailable or inconclusive, look up the federal program classification.</w:t>
@@ -943,11 +998,11 @@
         <w:tc>
           <w:tcPr>
             <w:tcW w:type="dxa" w:w="3120"/>
-            <w:shd w:val="clear" w:color="auto" w:fill="F2EDE5"/>
           </w:tcPr>
           <w:p>
             <w:r>
               <w:rPr>
+                <w:color w:val="000000"/>
                 <w:sz w:val="20"/>
               </w:rPr>
               <w:t>L4 — Supporting Documentation</w:t>
@@ -957,11 +1012,11 @@
         <w:tc>
           <w:tcPr>
             <w:tcW w:type="dxa" w:w="3120"/>
-            <w:shd w:val="clear" w:color="auto" w:fill="F2EDE5"/>
           </w:tcPr>
           <w:p>
             <w:r>
               <w:rPr>
+                <w:color w:val="000000"/>
                 <w:sz w:val="20"/>
               </w:rPr>
               <w:t>Internal Routing Form (IRF), Letter of Intent, Statement of Work, Principal Investigator (PI) statement, proposal summary</w:t>
@@ -971,11 +1026,11 @@
         <w:tc>
           <w:tcPr>
             <w:tcW w:type="dxa" w:w="3120"/>
-            <w:shd w:val="clear" w:color="auto" w:fill="F2EDE5"/>
           </w:tcPr>
           <w:p>
             <w:r>
               <w:rPr>
+                <w:color w:val="000000"/>
                 <w:sz w:val="20"/>
               </w:rPr>
               <w:t>When federal-level sources are insufficient, review internal project documentation.</w:t>
@@ -991,6 +1046,7 @@
           <w:p>
             <w:r>
               <w:rPr>
+                <w:color w:val="000000"/>
                 <w:sz w:val="20"/>
               </w:rPr>
               <w:t>L5 — Institutional Record</w:t>
@@ -1004,6 +1060,7 @@
           <w:p>
             <w:r>
               <w:rPr>
+                <w:color w:val="000000"/>
                 <w:sz w:val="20"/>
               </w:rPr>
               <w:t>Office of Research Funds Accounting (RFA†) records, HERD listing, Restricted Fund Account designation</w:t>
@@ -1017,6 +1074,7 @@
           <w:p>
             <w:r>
               <w:rPr>
+                <w:color w:val="000000"/>
                 <w:sz w:val="20"/>
               </w:rPr>
               <w:t>When no other documentation is accessible, use the existing institutional designation.</w:t>
@@ -1059,7 +1117,8 @@
       </w:pPr>
       <w:r>
         <w:rPr>
-          <w:color w:val="B5601E"/>
+          <w:b w:val="0"/>
+          <w:color w:val="2F5496"/>
           <w:sz w:val="26"/>
         </w:rPr>
         <w:t>4.2 Level 1 — Notice of Award (NOA)</w:t>
@@ -1071,7 +1130,9 @@
       </w:pPr>
       <w:r>
         <w:rPr>
-          <w:i/>
+          <w:b/>
+          <w:i w:val="0"/>
+          <w:color w:val="000000"/>
           <w:sz w:val="23"/>
         </w:rPr>
         <w:t>What it is</w:t>
@@ -1096,7 +1157,9 @@
       </w:pPr>
       <w:r>
         <w:rPr>
-          <w:i/>
+          <w:b/>
+          <w:i w:val="0"/>
+          <w:color w:val="000000"/>
           <w:sz w:val="23"/>
         </w:rPr>
         <w:t>Why it is the strongest evidence</w:t>
@@ -1121,7 +1184,9 @@
       </w:pPr>
       <w:r>
         <w:rPr>
-          <w:i/>
+          <w:b/>
+          <w:i w:val="0"/>
+          <w:color w:val="000000"/>
           <w:sz w:val="23"/>
         </w:rPr>
         <w:t>How to apply it</w:t>
@@ -1172,7 +1237,8 @@
       </w:pPr>
       <w:r>
         <w:rPr>
-          <w:color w:val="B5601E"/>
+          <w:b w:val="0"/>
+          <w:color w:val="2F5496"/>
           <w:sz w:val="26"/>
         </w:rPr>
         <w:t>4.3 Level 2 — Funding Opportunity Announcement (FOA / RFA)</w:t>
@@ -1184,7 +1250,9 @@
       </w:pPr>
       <w:r>
         <w:rPr>
-          <w:i/>
+          <w:b/>
+          <w:i w:val="0"/>
+          <w:color w:val="000000"/>
           <w:sz w:val="23"/>
         </w:rPr>
         <w:t>What it is</w:t>
@@ -1209,7 +1277,9 @@
       </w:pPr>
       <w:r>
         <w:rPr>
-          <w:i/>
+          <w:b/>
+          <w:i w:val="0"/>
+          <w:color w:val="000000"/>
           <w:sz w:val="23"/>
         </w:rPr>
         <w:t>Why it matters</w:t>
@@ -1234,7 +1304,9 @@
       </w:pPr>
       <w:r>
         <w:rPr>
-          <w:i/>
+          <w:b/>
+          <w:i w:val="0"/>
+          <w:color w:val="000000"/>
           <w:sz w:val="23"/>
         </w:rPr>
         <w:t>How to find and use it</w:t>
@@ -1272,7 +1344,8 @@
       </w:pPr>
       <w:r>
         <w:rPr>
-          <w:color w:val="B5601E"/>
+          <w:b w:val="0"/>
+          <w:color w:val="2F5496"/>
           <w:sz w:val="26"/>
         </w:rPr>
         <w:t>4.4 Level 3 — ALN / CFDA Number</w:t>
@@ -1284,7 +1357,9 @@
       </w:pPr>
       <w:r>
         <w:rPr>
-          <w:i/>
+          <w:b/>
+          <w:i w:val="0"/>
+          <w:color w:val="000000"/>
           <w:sz w:val="23"/>
         </w:rPr>
         <w:t>What it is</w:t>
@@ -1309,7 +1384,9 @@
       </w:pPr>
       <w:r>
         <w:rPr>
-          <w:i/>
+          <w:b/>
+          <w:i w:val="0"/>
+          <w:color w:val="000000"/>
           <w:sz w:val="23"/>
         </w:rPr>
         <w:t>How to use it</w:t>
@@ -1360,7 +1437,9 @@
       </w:pPr>
       <w:r>
         <w:rPr>
-          <w:i/>
+          <w:b/>
+          <w:i w:val="0"/>
+          <w:color w:val="000000"/>
           <w:sz w:val="23"/>
         </w:rPr>
         <w:t>Limitations</w:t>
@@ -1385,7 +1464,8 @@
       </w:pPr>
       <w:r>
         <w:rPr>
-          <w:color w:val="B5601E"/>
+          <w:b w:val="0"/>
+          <w:color w:val="2F5496"/>
           <w:sz w:val="26"/>
         </w:rPr>
         <w:t>4.5 Level 4 — Supporting Documentation</w:t>
@@ -1397,7 +1477,9 @@
       </w:pPr>
       <w:r>
         <w:rPr>
-          <w:i/>
+          <w:b/>
+          <w:i w:val="0"/>
+          <w:color w:val="000000"/>
           <w:sz w:val="23"/>
         </w:rPr>
         <w:t>What it is</w:t>
@@ -1422,7 +1504,9 @@
       </w:pPr>
       <w:r>
         <w:rPr>
-          <w:i/>
+          <w:b/>
+          <w:i w:val="0"/>
+          <w:color w:val="000000"/>
           <w:sz w:val="23"/>
         </w:rPr>
         <w:t>When and how to use it</w:t>
@@ -1486,7 +1570,8 @@
       </w:pPr>
       <w:r>
         <w:rPr>
-          <w:color w:val="B5601E"/>
+          <w:b w:val="0"/>
+          <w:color w:val="2F5496"/>
           <w:sz w:val="26"/>
         </w:rPr>
         <w:t>4.6 Level 5 — Institutional Record</w:t>
@@ -1498,7 +1583,9 @@
       </w:pPr>
       <w:r>
         <w:rPr>
-          <w:i/>
+          <w:b/>
+          <w:i w:val="0"/>
+          <w:color w:val="000000"/>
           <w:sz w:val="23"/>
         </w:rPr>
         <w:t>What it is</w:t>
@@ -1536,10 +1623,11 @@
       </w:pPr>
       <w:r>
         <w:rPr>
-          <w:color w:val="0B2545"/>
+          <w:b w:val="0"/>
+          <w:color w:val="2F5496"/>
           <w:sz w:val="32"/>
         </w:rPr>
-        <w:t>5. The Determination Process — Step by Step</w:t>
+        <w:t>5. THE DETERMINATION PROCESS — STEP BY STEP</w:t>
       </w:r>
     </w:p>
     <w:p>
@@ -1548,7 +1636,8 @@
       </w:pPr>
       <w:r>
         <w:rPr>
-          <w:color w:val="B5601E"/>
+          <w:b w:val="0"/>
+          <w:color w:val="2F5496"/>
           <w:sz w:val="26"/>
         </w:rPr>
         <w:t>5.1 Process Overview</w:t>
@@ -1573,7 +1662,8 @@
       </w:pPr>
       <w:r>
         <w:rPr>
-          <w:color w:val="B5601E"/>
+          <w:b w:val="0"/>
+          <w:color w:val="2F5496"/>
           <w:sz w:val="26"/>
         </w:rPr>
         <w:t>5.2 Handling Disagreements Between Classifications</w:t>
@@ -1598,10 +1688,11 @@
       </w:pPr>
       <w:r>
         <w:rPr>
-          <w:color w:val="0B2545"/>
+          <w:b w:val="0"/>
+          <w:color w:val="2F5496"/>
           <w:sz w:val="32"/>
         </w:rPr>
-        <w:t>6. NSF HERD Survey Guidelines — Key Requirements</w:t>
+        <w:t>6. NSF HERD SURVEY GUIDELINES — KEY REQUIREMENTS</w:t>
       </w:r>
     </w:p>
     <w:p>
@@ -1610,7 +1701,8 @@
       </w:pPr>
       <w:r>
         <w:rPr>
-          <w:color w:val="B5601E"/>
+          <w:b w:val="0"/>
+          <w:color w:val="2F5496"/>
           <w:sz w:val="26"/>
         </w:rPr>
         <w:t>6.1 Survey Structure and Requirements</w:t>
@@ -1648,7 +1740,8 @@
       </w:pPr>
       <w:r>
         <w:rPr>
-          <w:color w:val="B5601E"/>
+          <w:b w:val="0"/>
+          <w:color w:val="2F5496"/>
           <w:sz w:val="26"/>
         </w:rPr>
         <w:t>6.2 The “Separately Budgeted” Standard</w:t>
@@ -1673,10 +1766,11 @@
       </w:pPr>
       <w:r>
         <w:rPr>
-          <w:color w:val="0B2545"/>
+          <w:b w:val="0"/>
+          <w:color w:val="2F5496"/>
           <w:sz w:val="32"/>
         </w:rPr>
-        <w:t>7. What Other Institutions Are Doing</w:t>
+        <w:t>7. WHAT OTHER INSTITUTIONS ARE DOING</w:t>
       </w:r>
     </w:p>
     <w:p>
@@ -1735,10 +1829,11 @@
       </w:pPr>
       <w:r>
         <w:rPr>
-          <w:color w:val="0B2545"/>
+          <w:b w:val="0"/>
+          <w:color w:val="2F5496"/>
           <w:sz w:val="32"/>
         </w:rPr>
-        <w:t>8. Examples</w:t>
+        <w:t>8. EXAMPLES</w:t>
       </w:r>
     </w:p>
     <w:p>
@@ -1761,7 +1856,8 @@
       </w:pPr>
       <w:r>
         <w:rPr>
-          <w:color w:val="B5601E"/>
+          <w:b w:val="0"/>
+          <w:color w:val="2F5496"/>
           <w:sz w:val="26"/>
         </w:rPr>
         <w:t>8.1 Confirmed R&amp;D — Strong Evidence</w:t>
@@ -1797,13 +1893,13 @@
         <w:tc>
           <w:tcPr>
             <w:tcW w:type="dxa" w:w="1872"/>
-            <w:shd w:val="clear" w:color="auto" w:fill="0B2545"/>
+            <w:shd w:val="clear" w:color="auto" w:fill="E7E6E6"/>
           </w:tcPr>
           <w:p>
             <w:r>
               <w:rPr>
                 <w:b/>
-                <w:color w:val="FFFFFF"/>
+                <w:color w:val="000000"/>
                 <w:sz w:val="20"/>
               </w:rPr>
               <w:t>Grant</w:t>
@@ -1813,13 +1909,13 @@
         <w:tc>
           <w:tcPr>
             <w:tcW w:type="dxa" w:w="1872"/>
-            <w:shd w:val="clear" w:color="auto" w:fill="0B2545"/>
+            <w:shd w:val="clear" w:color="auto" w:fill="E7E6E6"/>
           </w:tcPr>
           <w:p>
             <w:r>
               <w:rPr>
                 <w:b/>
-                <w:color w:val="FFFFFF"/>
+                <w:color w:val="000000"/>
                 <w:sz w:val="20"/>
               </w:rPr>
               <w:t>Agency</w:t>
@@ -1829,13 +1925,13 @@
         <w:tc>
           <w:tcPr>
             <w:tcW w:type="dxa" w:w="1872"/>
-            <w:shd w:val="clear" w:color="auto" w:fill="0B2545"/>
+            <w:shd w:val="clear" w:color="auto" w:fill="E7E6E6"/>
           </w:tcPr>
           <w:p>
             <w:r>
               <w:rPr>
                 <w:b/>
-                <w:color w:val="FFFFFF"/>
+                <w:color w:val="000000"/>
                 <w:sz w:val="20"/>
               </w:rPr>
               <w:t>Level</w:t>
@@ -1845,13 +1941,13 @@
         <w:tc>
           <w:tcPr>
             <w:tcW w:type="dxa" w:w="1872"/>
-            <w:shd w:val="clear" w:color="auto" w:fill="0B2545"/>
+            <w:shd w:val="clear" w:color="auto" w:fill="E7E6E6"/>
           </w:tcPr>
           <w:p>
             <w:r>
               <w:rPr>
                 <w:b/>
-                <w:color w:val="FFFFFF"/>
+                <w:color w:val="000000"/>
                 <w:sz w:val="20"/>
               </w:rPr>
               <w:t>Determination</w:t>
@@ -1861,13 +1957,13 @@
         <w:tc>
           <w:tcPr>
             <w:tcW w:type="dxa" w:w="1872"/>
-            <w:shd w:val="clear" w:color="auto" w:fill="0B2545"/>
+            <w:shd w:val="clear" w:color="auto" w:fill="E7E6E6"/>
           </w:tcPr>
           <w:p>
             <w:r>
               <w:rPr>
                 <w:b/>
-                <w:color w:val="FFFFFF"/>
+                <w:color w:val="000000"/>
                 <w:sz w:val="20"/>
               </w:rPr>
               <w:t>Evidence</w:t>
@@ -1883,6 +1979,7 @@
           <w:p>
             <w:r>
               <w:rPr>
+                <w:color w:val="000000"/>
                 <w:sz w:val="20"/>
               </w:rPr>
               <w:t>NIH Research Center — Urban Health (Example)</w:t>
@@ -1896,6 +1993,7 @@
           <w:p>
             <w:r>
               <w:rPr>
+                <w:color w:val="000000"/>
                 <w:sz w:val="20"/>
               </w:rPr>
               <w:t>NIH</w:t>
@@ -1909,6 +2007,7 @@
           <w:p>
             <w:r>
               <w:rPr>
+                <w:color w:val="000000"/>
                 <w:sz w:val="20"/>
               </w:rPr>
               <w:t>L1–L3</w:t>
@@ -1922,6 +2021,7 @@
           <w:p>
             <w:r>
               <w:rPr>
+                <w:color w:val="000000"/>
                 <w:sz w:val="20"/>
               </w:rPr>
               <w:t>R&amp;D — Applied Research</w:t>
@@ -1935,6 +2035,7 @@
           <w:p>
             <w:r>
               <w:rPr>
+                <w:color w:val="000000"/>
                 <w:sz w:val="20"/>
               </w:rPr>
               <w:t>NOA, FOA, and ALN/CFDA all confirm research center infrastructure; RCMI designation is by definition research.</w:t>
@@ -1946,11 +2047,11 @@
         <w:tc>
           <w:tcPr>
             <w:tcW w:type="dxa" w:w="1872"/>
-            <w:shd w:val="clear" w:color="auto" w:fill="F2EDE5"/>
           </w:tcPr>
           <w:p>
             <w:r>
               <w:rPr>
+                <w:color w:val="000000"/>
                 <w:sz w:val="20"/>
               </w:rPr>
               <w:t>NASA Cooperative Research Agreement (Example)</w:t>
@@ -1960,11 +2061,11 @@
         <w:tc>
           <w:tcPr>
             <w:tcW w:type="dxa" w:w="1872"/>
-            <w:shd w:val="clear" w:color="auto" w:fill="F2EDE5"/>
           </w:tcPr>
           <w:p>
             <w:r>
               <w:rPr>
+                <w:color w:val="000000"/>
                 <w:sz w:val="20"/>
               </w:rPr>
               <w:t>NASA (prime award)</w:t>
@@ -1974,11 +2075,11 @@
         <w:tc>
           <w:tcPr>
             <w:tcW w:type="dxa" w:w="1872"/>
-            <w:shd w:val="clear" w:color="auto" w:fill="F2EDE5"/>
           </w:tcPr>
           <w:p>
             <w:r>
               <w:rPr>
+                <w:color w:val="000000"/>
                 <w:sz w:val="20"/>
               </w:rPr>
               <w:t>L1</w:t>
@@ -1988,11 +2089,11 @@
         <w:tc>
           <w:tcPr>
             <w:tcW w:type="dxa" w:w="1872"/>
-            <w:shd w:val="clear" w:color="auto" w:fill="F2EDE5"/>
           </w:tcPr>
           <w:p>
             <w:r>
               <w:rPr>
+                <w:color w:val="000000"/>
                 <w:sz w:val="20"/>
               </w:rPr>
               <w:t>R&amp;D — Applied Research</w:t>
@@ -2002,11 +2103,11 @@
         <w:tc>
           <w:tcPr>
             <w:tcW w:type="dxa" w:w="1872"/>
-            <w:shd w:val="clear" w:color="auto" w:fill="F2EDE5"/>
           </w:tcPr>
           <w:p>
             <w:r>
               <w:rPr>
+                <w:color w:val="000000"/>
                 <w:sz w:val="20"/>
               </w:rPr>
               <w:t>NOA confirms a prime cooperative agreement for NASA earth science research, with clear research objectives stated directly on the award.</w:t>
@@ -2022,6 +2123,7 @@
           <w:p>
             <w:r>
               <w:rPr>
+                <w:color w:val="000000"/>
                 <w:sz w:val="20"/>
               </w:rPr>
               <w:t>NSF Advanced Science Research (Example)</w:t>
@@ -2035,6 +2137,7 @@
           <w:p>
             <w:r>
               <w:rPr>
+                <w:color w:val="000000"/>
                 <w:sz w:val="20"/>
               </w:rPr>
               <w:t>NSF</w:t>
@@ -2048,6 +2151,7 @@
           <w:p>
             <w:r>
               <w:rPr>
+                <w:color w:val="000000"/>
                 <w:sz w:val="20"/>
               </w:rPr>
               <w:t>L1</w:t>
@@ -2061,6 +2165,7 @@
           <w:p>
             <w:r>
               <w:rPr>
+                <w:color w:val="000000"/>
                 <w:sz w:val="20"/>
               </w:rPr>
               <w:t>R&amp;D — Basic Research</w:t>
@@ -2074,6 +2179,7 @@
           <w:p>
             <w:r>
               <w:rPr>
+                <w:color w:val="000000"/>
                 <w:sz w:val="20"/>
               </w:rPr>
               <w:t>The NOA's activity-type field is checked “Research” — the direct indicator alone is sufficient. (If a prior-year listing had this recorded as Not R&amp;D, the direct NOA indicator should take precedence and trigger reclassification.)</w:t>
@@ -2089,7 +2195,8 @@
       </w:pPr>
       <w:r>
         <w:rPr>
-          <w:color w:val="B5601E"/>
+          <w:b w:val="0"/>
+          <w:color w:val="2F5496"/>
           <w:sz w:val="26"/>
         </w:rPr>
         <w:t>8.2 Not R&amp;D — Well-Documented</w:t>
@@ -2112,13 +2219,13 @@
         <w:tc>
           <w:tcPr>
             <w:tcW w:type="dxa" w:w="1872"/>
-            <w:shd w:val="clear" w:color="auto" w:fill="0B2545"/>
+            <w:shd w:val="clear" w:color="auto" w:fill="E7E6E6"/>
           </w:tcPr>
           <w:p>
             <w:r>
               <w:rPr>
                 <w:b/>
-                <w:color w:val="FFFFFF"/>
+                <w:color w:val="000000"/>
                 <w:sz w:val="20"/>
               </w:rPr>
               <w:t>Grant</w:t>
@@ -2128,13 +2235,13 @@
         <w:tc>
           <w:tcPr>
             <w:tcW w:type="dxa" w:w="1872"/>
-            <w:shd w:val="clear" w:color="auto" w:fill="0B2545"/>
+            <w:shd w:val="clear" w:color="auto" w:fill="E7E6E6"/>
           </w:tcPr>
           <w:p>
             <w:r>
               <w:rPr>
                 <w:b/>
-                <w:color w:val="FFFFFF"/>
+                <w:color w:val="000000"/>
                 <w:sz w:val="20"/>
               </w:rPr>
               <w:t>Agency</w:t>
@@ -2144,13 +2251,13 @@
         <w:tc>
           <w:tcPr>
             <w:tcW w:type="dxa" w:w="1872"/>
-            <w:shd w:val="clear" w:color="auto" w:fill="0B2545"/>
+            <w:shd w:val="clear" w:color="auto" w:fill="E7E6E6"/>
           </w:tcPr>
           <w:p>
             <w:r>
               <w:rPr>
                 <w:b/>
-                <w:color w:val="FFFFFF"/>
+                <w:color w:val="000000"/>
                 <w:sz w:val="20"/>
               </w:rPr>
               <w:t>Level</w:t>
@@ -2160,13 +2267,13 @@
         <w:tc>
           <w:tcPr>
             <w:tcW w:type="dxa" w:w="1872"/>
-            <w:shd w:val="clear" w:color="auto" w:fill="0B2545"/>
+            <w:shd w:val="clear" w:color="auto" w:fill="E7E6E6"/>
           </w:tcPr>
           <w:p>
             <w:r>
               <w:rPr>
                 <w:b/>
-                <w:color w:val="FFFFFF"/>
+                <w:color w:val="000000"/>
                 <w:sz w:val="20"/>
               </w:rPr>
               <w:t>Determination</w:t>
@@ -2176,13 +2283,13 @@
         <w:tc>
           <w:tcPr>
             <w:tcW w:type="dxa" w:w="1872"/>
-            <w:shd w:val="clear" w:color="auto" w:fill="0B2545"/>
+            <w:shd w:val="clear" w:color="auto" w:fill="E7E6E6"/>
           </w:tcPr>
           <w:p>
             <w:r>
               <w:rPr>
                 <w:b/>
-                <w:color w:val="FFFFFF"/>
+                <w:color w:val="000000"/>
                 <w:sz w:val="20"/>
               </w:rPr>
               <w:t>Evidence</w:t>
@@ -2198,6 +2305,7 @@
           <w:p>
             <w:r>
               <w:rPr>
+                <w:color w:val="000000"/>
                 <w:sz w:val="20"/>
               </w:rPr>
               <w:t>State Equipment Grant (Example)</w:t>
@@ -2211,6 +2319,7 @@
           <w:p>
             <w:r>
               <w:rPr>
+                <w:color w:val="000000"/>
                 <w:sz w:val="20"/>
               </w:rPr>
               <w:t>State agency</w:t>
@@ -2224,6 +2333,7 @@
           <w:p>
             <w:r>
               <w:rPr>
+                <w:color w:val="000000"/>
                 <w:sz w:val="20"/>
               </w:rPr>
               <w:t>L1</w:t>
@@ -2237,6 +2347,7 @@
           <w:p>
             <w:r>
               <w:rPr>
+                <w:color w:val="000000"/>
                 <w:sz w:val="20"/>
               </w:rPr>
               <w:t>Not R&amp;D</w:t>
@@ -2250,6 +2361,7 @@
           <w:p>
             <w:r>
               <w:rPr>
+                <w:color w:val="000000"/>
                 <w:sz w:val="20"/>
               </w:rPr>
               <w:t>NOA reviewed — award funds a security-infrastructure equipment purchase; no research objective.</w:t>
@@ -2261,11 +2373,11 @@
         <w:tc>
           <w:tcPr>
             <w:tcW w:type="dxa" w:w="1872"/>
-            <w:shd w:val="clear" w:color="auto" w:fill="F2EDE5"/>
           </w:tcPr>
           <w:p>
             <w:r>
               <w:rPr>
+                <w:color w:val="000000"/>
                 <w:sz w:val="20"/>
               </w:rPr>
               <w:t>NSF STEM Education Program (Example)</w:t>
@@ -2275,11 +2387,11 @@
         <w:tc>
           <w:tcPr>
             <w:tcW w:type="dxa" w:w="1872"/>
-            <w:shd w:val="clear" w:color="auto" w:fill="F2EDE5"/>
           </w:tcPr>
           <w:p>
             <w:r>
               <w:rPr>
+                <w:color w:val="000000"/>
                 <w:sz w:val="20"/>
               </w:rPr>
               <w:t>NSF</w:t>
@@ -2289,11 +2401,11 @@
         <w:tc>
           <w:tcPr>
             <w:tcW w:type="dxa" w:w="1872"/>
-            <w:shd w:val="clear" w:color="auto" w:fill="F2EDE5"/>
           </w:tcPr>
           <w:p>
             <w:r>
               <w:rPr>
+                <w:color w:val="000000"/>
                 <w:sz w:val="20"/>
               </w:rPr>
               <w:t>L2</w:t>
@@ -2303,11 +2415,11 @@
         <w:tc>
           <w:tcPr>
             <w:tcW w:type="dxa" w:w="1872"/>
-            <w:shd w:val="clear" w:color="auto" w:fill="F2EDE5"/>
           </w:tcPr>
           <w:p>
             <w:r>
               <w:rPr>
+                <w:color w:val="000000"/>
                 <w:sz w:val="20"/>
               </w:rPr>
               <w:t>Not R&amp;D</w:t>
@@ -2317,11 +2429,11 @@
         <w:tc>
           <w:tcPr>
             <w:tcW w:type="dxa" w:w="1872"/>
-            <w:shd w:val="clear" w:color="auto" w:fill="F2EDE5"/>
           </w:tcPr>
           <w:p>
             <w:r>
               <w:rPr>
+                <w:color w:val="000000"/>
                 <w:sz w:val="20"/>
               </w:rPr>
               <w:t>FOA reviewed — an NSF STEM education program; the primary activity is pedagogical improvement, not research generation.</w:t>
@@ -2337,6 +2449,7 @@
           <w:p>
             <w:r>
               <w:rPr>
+                <w:color w:val="000000"/>
                 <w:sz w:val="20"/>
               </w:rPr>
               <w:t>Federal Mentoring Program (Example)</w:t>
@@ -2350,6 +2463,7 @@
           <w:p>
             <w:r>
               <w:rPr>
+                <w:color w:val="000000"/>
                 <w:sz w:val="20"/>
               </w:rPr>
               <w:t>Federal agency</w:t>
@@ -2363,6 +2477,7 @@
           <w:p>
             <w:r>
               <w:rPr>
+                <w:color w:val="000000"/>
                 <w:sz w:val="20"/>
               </w:rPr>
               <w:t>L2</w:t>
@@ -2376,6 +2491,7 @@
           <w:p>
             <w:r>
               <w:rPr>
+                <w:color w:val="000000"/>
                 <w:sz w:val="20"/>
               </w:rPr>
               <w:t>Not R&amp;D</w:t>
@@ -2389,6 +2505,7 @@
           <w:p>
             <w:r>
               <w:rPr>
+                <w:color w:val="000000"/>
                 <w:sz w:val="20"/>
               </w:rPr>
               <w:t>FOA reviewed — a mentoring and training program; the award scope is training delivery, not research.</w:t>
@@ -2400,11 +2517,11 @@
         <w:tc>
           <w:tcPr>
             <w:tcW w:type="dxa" w:w="1872"/>
-            <w:shd w:val="clear" w:color="auto" w:fill="F2EDE5"/>
           </w:tcPr>
           <w:p>
             <w:r>
               <w:rPr>
+                <w:color w:val="000000"/>
                 <w:sz w:val="20"/>
               </w:rPr>
               <w:t>State/Federal Services Program (Example)</w:t>
@@ -2414,11 +2531,11 @@
         <w:tc>
           <w:tcPr>
             <w:tcW w:type="dxa" w:w="1872"/>
-            <w:shd w:val="clear" w:color="auto" w:fill="F2EDE5"/>
           </w:tcPr>
           <w:p>
             <w:r>
               <w:rPr>
+                <w:color w:val="000000"/>
                 <w:sz w:val="20"/>
               </w:rPr>
               <w:t>State/Federal</w:t>
@@ -2428,11 +2545,11 @@
         <w:tc>
           <w:tcPr>
             <w:tcW w:type="dxa" w:w="1872"/>
-            <w:shd w:val="clear" w:color="auto" w:fill="F2EDE5"/>
           </w:tcPr>
           <w:p>
             <w:r>
               <w:rPr>
+                <w:color w:val="000000"/>
                 <w:sz w:val="20"/>
               </w:rPr>
               <w:t>L4</w:t>
@@ -2442,11 +2559,11 @@
         <w:tc>
           <w:tcPr>
             <w:tcW w:type="dxa" w:w="1872"/>
-            <w:shd w:val="clear" w:color="auto" w:fill="F2EDE5"/>
           </w:tcPr>
           <w:p>
             <w:r>
               <w:rPr>
+                <w:color w:val="000000"/>
                 <w:sz w:val="20"/>
               </w:rPr>
               <w:t>Not R&amp;D</w:t>
@@ -2456,11 +2573,11 @@
         <w:tc>
           <w:tcPr>
             <w:tcW w:type="dxa" w:w="1872"/>
-            <w:shd w:val="clear" w:color="auto" w:fill="F2EDE5"/>
           </w:tcPr>
           <w:p>
             <w:r>
               <w:rPr>
+                <w:color w:val="000000"/>
                 <w:sz w:val="20"/>
               </w:rPr>
               <w:t>IRF reviewed — a service delivery program; no research design or data collection methodology identified.</w:t>
@@ -2476,7 +2593,8 @@
       </w:pPr>
       <w:r>
         <w:rPr>
-          <w:color w:val="B5601E"/>
+          <w:b w:val="0"/>
+          <w:color w:val="2F5496"/>
           <w:sz w:val="26"/>
         </w:rPr>
         <w:t>8.3 Borderline Cases — Classification Rationale</w:t>
@@ -2527,10 +2645,11 @@
       </w:pPr>
       <w:r>
         <w:rPr>
-          <w:color w:val="0B2545"/>
+          <w:b w:val="0"/>
+          <w:color w:val="2F5496"/>
           <w:sz w:val="32"/>
         </w:rPr>
-        <w:t>9. Best Practices and Recommendations</w:t>
+        <w:t>9. BEST PRACTICES AND RECOMMENDATIONS</w:t>
       </w:r>
     </w:p>
     <w:p>
@@ -2600,10 +2719,11 @@
       </w:pPr>
       <w:r>
         <w:rPr>
-          <w:color w:val="0B2545"/>
+          <w:b w:val="0"/>
+          <w:color w:val="2F5496"/>
           <w:sz w:val="32"/>
         </w:rPr>
-        <w:t>10. Conclusion</w:t>
+        <w:t>10. CONCLUSION</w:t>
       </w:r>
     </w:p>
     <w:p>
@@ -2664,10 +2784,11 @@
       </w:pPr>
       <w:r>
         <w:rPr>
-          <w:color w:val="0B2545"/>
+          <w:b w:val="0"/>
+          <w:color w:val="2F5496"/>
           <w:sz w:val="32"/>
         </w:rPr>
-        <w:t>Appendix A. Quick HERD Classification Decision Tree</w:t>
+        <w:t>APPENDIX A. QUICK HERD CLASSIFICATION DECISION TREE</w:t>
       </w:r>
     </w:p>
     <w:p>
@@ -2724,10 +2845,11 @@
       </w:pPr>
       <w:r>
         <w:rPr>
-          <w:color w:val="0B2545"/>
+          <w:b w:val="0"/>
+          <w:color w:val="2F5496"/>
           <w:sz w:val="32"/>
         </w:rPr>
-        <w:t>Appendix B. HERD Classification Checklist</w:t>
+        <w:t>APPENDIX B. HERD CLASSIFICATION CHECKLIST</w:t>
       </w:r>
     </w:p>
     <w:tbl>
@@ -2745,13 +2867,13 @@
         <w:tc>
           <w:tcPr>
             <w:tcW w:type="dxa" w:w="3120"/>
-            <w:shd w:val="clear" w:color="auto" w:fill="0B2545"/>
+            <w:shd w:val="clear" w:color="auto" w:fill="E7E6E6"/>
           </w:tcPr>
           <w:p>
             <w:r>
               <w:rPr>
                 <w:b/>
-                <w:color w:val="FFFFFF"/>
+                <w:color w:val="000000"/>
                 <w:sz w:val="20"/>
               </w:rPr>
               <w:t>☐</w:t>
@@ -2761,13 +2883,13 @@
         <w:tc>
           <w:tcPr>
             <w:tcW w:type="dxa" w:w="3120"/>
-            <w:shd w:val="clear" w:color="auto" w:fill="0B2545"/>
+            <w:shd w:val="clear" w:color="auto" w:fill="E7E6E6"/>
           </w:tcPr>
           <w:p>
             <w:r>
               <w:rPr>
                 <w:b/>
-                <w:color w:val="FFFFFF"/>
+                <w:color w:val="000000"/>
                 <w:sz w:val="20"/>
               </w:rPr>
               <w:t>Classification Step</w:t>
@@ -2777,13 +2899,13 @@
         <w:tc>
           <w:tcPr>
             <w:tcW w:type="dxa" w:w="3120"/>
-            <w:shd w:val="clear" w:color="auto" w:fill="0B2545"/>
+            <w:shd w:val="clear" w:color="auto" w:fill="E7E6E6"/>
           </w:tcPr>
           <w:p>
             <w:r>
               <w:rPr>
                 <w:b/>
-                <w:color w:val="FFFFFF"/>
+                <w:color w:val="000000"/>
                 <w:sz w:val="20"/>
               </w:rPr>
               <w:t>Notes / Evidence Filed</w:t>
@@ -2799,6 +2921,7 @@
           <w:p>
             <w:r>
               <w:rPr>
+                <w:color w:val="000000"/>
                 <w:sz w:val="20"/>
               </w:rPr>
               <w:t>☐</w:t>
@@ -2812,6 +2935,7 @@
           <w:p>
             <w:r>
               <w:rPr>
+                <w:color w:val="000000"/>
                 <w:sz w:val="20"/>
               </w:rPr>
               <w:t>NOA reviewed</w:t>
@@ -2825,49 +2949,7 @@
           <w:p>
             <w:r>
               <w:rPr>
-                <w:sz w:val="20"/>
-              </w:rPr>
-            </w:r>
-          </w:p>
-        </w:tc>
-      </w:tr>
-      <w:tr>
-        <w:tc>
-          <w:tcPr>
-            <w:tcW w:type="dxa" w:w="3120"/>
-            <w:shd w:val="clear" w:color="auto" w:fill="F2EDE5"/>
-          </w:tcPr>
-          <w:p>
-            <w:r>
-              <w:rPr>
-                <w:sz w:val="20"/>
-              </w:rPr>
-              <w:t>☐</w:t>
-            </w:r>
-          </w:p>
-        </w:tc>
-        <w:tc>
-          <w:tcPr>
-            <w:tcW w:type="dxa" w:w="3120"/>
-            <w:shd w:val="clear" w:color="auto" w:fill="F2EDE5"/>
-          </w:tcPr>
-          <w:p>
-            <w:r>
-              <w:rPr>
-                <w:sz w:val="20"/>
-              </w:rPr>
-              <w:t>FOA/RFA reviewed (if applicable)</w:t>
-            </w:r>
-          </w:p>
-        </w:tc>
-        <w:tc>
-          <w:tcPr>
-            <w:tcW w:type="dxa" w:w="3120"/>
-            <w:shd w:val="clear" w:color="auto" w:fill="F2EDE5"/>
-          </w:tcPr>
-          <w:p>
-            <w:r>
-              <w:rPr>
+                <w:color w:val="000000"/>
                 <w:sz w:val="20"/>
               </w:rPr>
             </w:r>
@@ -2882,6 +2964,7 @@
           <w:p>
             <w:r>
               <w:rPr>
+                <w:color w:val="000000"/>
                 <w:sz w:val="20"/>
               </w:rPr>
               <w:t>☐</w:t>
@@ -2895,9 +2978,10 @@
           <w:p>
             <w:r>
               <w:rPr>
+                <w:color w:val="000000"/>
                 <w:sz w:val="20"/>
               </w:rPr>
-              <w:t>ALN/CFDA verified</w:t>
+              <w:t>FOA/RFA reviewed (if applicable)</w:t>
             </w:r>
           </w:p>
         </w:tc>
@@ -2908,49 +2992,7 @@
           <w:p>
             <w:r>
               <w:rPr>
-                <w:sz w:val="20"/>
-              </w:rPr>
-            </w:r>
-          </w:p>
-        </w:tc>
-      </w:tr>
-      <w:tr>
-        <w:tc>
-          <w:tcPr>
-            <w:tcW w:type="dxa" w:w="3120"/>
-            <w:shd w:val="clear" w:color="auto" w:fill="F2EDE5"/>
-          </w:tcPr>
-          <w:p>
-            <w:r>
-              <w:rPr>
-                <w:sz w:val="20"/>
-              </w:rPr>
-              <w:t>☐</w:t>
-            </w:r>
-          </w:p>
-        </w:tc>
-        <w:tc>
-          <w:tcPr>
-            <w:tcW w:type="dxa" w:w="3120"/>
-            <w:shd w:val="clear" w:color="auto" w:fill="F2EDE5"/>
-          </w:tcPr>
-          <w:p>
-            <w:r>
-              <w:rPr>
-                <w:sz w:val="20"/>
-              </w:rPr>
-              <w:t>Supporting documentation reviewed</w:t>
-            </w:r>
-          </w:p>
-        </w:tc>
-        <w:tc>
-          <w:tcPr>
-            <w:tcW w:type="dxa" w:w="3120"/>
-            <w:shd w:val="clear" w:color="auto" w:fill="F2EDE5"/>
-          </w:tcPr>
-          <w:p>
-            <w:r>
-              <w:rPr>
+                <w:color w:val="000000"/>
                 <w:sz w:val="20"/>
               </w:rPr>
             </w:r>
@@ -2965,6 +3007,7 @@
           <w:p>
             <w:r>
               <w:rPr>
+                <w:color w:val="000000"/>
                 <w:sz w:val="20"/>
               </w:rPr>
               <w:t>☐</w:t>
@@ -2978,6 +3021,93 @@
           <w:p>
             <w:r>
               <w:rPr>
+                <w:color w:val="000000"/>
+                <w:sz w:val="20"/>
+              </w:rPr>
+              <w:t>ALN/CFDA verified</w:t>
+            </w:r>
+          </w:p>
+        </w:tc>
+        <w:tc>
+          <w:tcPr>
+            <w:tcW w:type="dxa" w:w="3120"/>
+          </w:tcPr>
+          <w:p>
+            <w:r>
+              <w:rPr>
+                <w:color w:val="000000"/>
+                <w:sz w:val="20"/>
+              </w:rPr>
+            </w:r>
+          </w:p>
+        </w:tc>
+      </w:tr>
+      <w:tr>
+        <w:tc>
+          <w:tcPr>
+            <w:tcW w:type="dxa" w:w="3120"/>
+          </w:tcPr>
+          <w:p>
+            <w:r>
+              <w:rPr>
+                <w:color w:val="000000"/>
+                <w:sz w:val="20"/>
+              </w:rPr>
+              <w:t>☐</w:t>
+            </w:r>
+          </w:p>
+        </w:tc>
+        <w:tc>
+          <w:tcPr>
+            <w:tcW w:type="dxa" w:w="3120"/>
+          </w:tcPr>
+          <w:p>
+            <w:r>
+              <w:rPr>
+                <w:color w:val="000000"/>
+                <w:sz w:val="20"/>
+              </w:rPr>
+              <w:t>Supporting documentation reviewed</w:t>
+            </w:r>
+          </w:p>
+        </w:tc>
+        <w:tc>
+          <w:tcPr>
+            <w:tcW w:type="dxa" w:w="3120"/>
+          </w:tcPr>
+          <w:p>
+            <w:r>
+              <w:rPr>
+                <w:color w:val="000000"/>
+                <w:sz w:val="20"/>
+              </w:rPr>
+            </w:r>
+          </w:p>
+        </w:tc>
+      </w:tr>
+      <w:tr>
+        <w:tc>
+          <w:tcPr>
+            <w:tcW w:type="dxa" w:w="3120"/>
+          </w:tcPr>
+          <w:p>
+            <w:r>
+              <w:rPr>
+                <w:color w:val="000000"/>
+                <w:sz w:val="20"/>
+              </w:rPr>
+              <w:t>☐</w:t>
+            </w:r>
+          </w:p>
+        </w:tc>
+        <w:tc>
+          <w:tcPr>
+            <w:tcW w:type="dxa" w:w="3120"/>
+          </w:tcPr>
+          <w:p>
+            <w:r>
+              <w:rPr>
+                <w:color w:val="000000"/>
                 <w:sz w:val="20"/>
               </w:rPr>
               <w:t>Evidence level recorded</w:t>
@@ -2991,6 +3121,7 @@
           <w:p>
             <w:r>
               <w:rPr>
+                <w:color w:val="000000"/>
                 <w:sz w:val="20"/>
               </w:rPr>
             </w:r>
@@ -3001,11 +3132,11 @@
         <w:tc>
           <w:tcPr>
             <w:tcW w:type="dxa" w:w="3120"/>
-            <w:shd w:val="clear" w:color="auto" w:fill="F2EDE5"/>
           </w:tcPr>
           <w:p>
             <w:r>
               <w:rPr>
+                <w:color w:val="000000"/>
                 <w:sz w:val="20"/>
               </w:rPr>
               <w:t>☐</w:t>
@@ -3015,11 +3146,11 @@
         <w:tc>
           <w:tcPr>
             <w:tcW w:type="dxa" w:w="3120"/>
-            <w:shd w:val="clear" w:color="auto" w:fill="F2EDE5"/>
           </w:tcPr>
           <w:p>
             <w:r>
               <w:rPr>
+                <w:color w:val="000000"/>
                 <w:sz w:val="20"/>
               </w:rPr>
               <w:t>Reviewer initials/date</w:t>
@@ -3029,11 +3160,11 @@
         <w:tc>
           <w:tcPr>
             <w:tcW w:type="dxa" w:w="3120"/>
-            <w:shd w:val="clear" w:color="auto" w:fill="F2EDE5"/>
           </w:tcPr>
           <w:p>
             <w:r>
               <w:rPr>
+                <w:color w:val="000000"/>
                 <w:sz w:val="20"/>
               </w:rPr>
             </w:r>
@@ -3059,14 +3190,37 @@
   <w:p>
     <w:pPr>
       <w:pStyle w:val="Footer"/>
-      <w:jc w:val="center"/>
+      <w:tabs>
+        <w:tab w:pos="4680" w:val="center"/>
+        <w:tab w:pos="9360" w:val="right"/>
+      </w:tabs>
     </w:pPr>
     <w:r>
       <w:rPr>
-        <w:color w:val="5A6169"/>
-        <w:sz w:val="16"/>
-      </w:rPr>
-      <w:t xml:space="preserve">R&amp;D Classification Framework   ·   Page </w:t>
+        <w:color w:val="000000"/>
+        <w:sz w:val="20"/>
+      </w:rPr>
+      <w:t>Morgan State University</w:t>
+    </w:r>
+    <w:r>
+      <w:tab/>
+    </w:r>
+    <w:r>
+      <w:rPr>
+        <w:color w:val="000000"/>
+        <w:sz w:val="20"/>
+      </w:rPr>
+      <w:t>R&amp;D Classification Framework: Policy and Guidelines</w:t>
+    </w:r>
+    <w:r>
+      <w:tab/>
+    </w:r>
+    <w:r>
+      <w:rPr>
+        <w:color w:val="000000"/>
+        <w:sz w:val="20"/>
+      </w:rPr>
+      <w:t xml:space="preserve">Page </w:t>
     </w:r>
     <w:r>
       <w:fldChar w:fldCharType="begin"/>
@@ -3077,8 +3231,8 @@
     </w:r>
     <w:r>
       <w:rPr>
-        <w:color w:val="5A6169"/>
-        <w:sz w:val="16"/>
+        <w:color w:val="000000"/>
+        <w:sz w:val="20"/>
       </w:rPr>
       <w:t xml:space="preserve"> of </w:t>
     </w:r>
@@ -3098,16 +3252,18 @@
   <w:p>
     <w:pPr>
       <w:pStyle w:val="Header"/>
-      <w:jc w:val="center"/>
+      <w:jc w:val="right"/>
     </w:pPr>
-    <w:r>
-      <w:rPr>
-        <w:b/>
-        <w:color w:val="5A6169"/>
-        <w:sz w:val="16"/>
-      </w:rPr>
-      <w:t>MORGAN STATE UNIVERSITY  ·  OFFICE OF RESEARCH ADMINISTRATION</w:t>
-    </w:r>
+    <w:hyperlink w:anchor="top">
+      <w:r>
+        <w:rPr>
+          <w:color w:val="963634"/>
+          <w:u w:val="single"/>
+          <w:sz w:val="16"/>
+        </w:rPr>
+        <w:t>to top of document</w:t>
+      </w:r>
+    </w:hyperlink>
   </w:p>
 </w:hdr>
 </file>

</xml_diff>